<commit_message>
feat: Add each tier of service points' randomness Make the A events and some groudwork
</commit_message>
<xml_diff>
--- a/ProjectWorkDocumentTemplate.docx
+++ b/ProjectWorkDocumentTemplate.docx
@@ -252,19 +252,28 @@
             </a:graphic>
           </wp:anchor>
         </w:drawing>
+      </w:r>
+    </w:p>
+    <w:p>
+      <w:pPr>
+        <w:pStyle w:val="Normal"/>
+        <w:rPr/>
+      </w:pPr>
+      <w:r>
+        <w:rPr/>
         <mc:AlternateContent>
           <mc:Choice Requires="wps">
             <w:drawing>
-              <wp:anchor distT="0" distB="0" distL="0" distR="0" simplePos="0" relativeHeight="6" behindDoc="0" locked="0" layoutInCell="1" allowOverlap="1" wp14:anchorId="71C9E8E7">
+              <wp:anchor distT="0" distB="0" distL="0" distR="0" simplePos="0" relativeHeight="6" behindDoc="0" locked="0" layoutInCell="1" allowOverlap="1">
                 <wp:simplePos x="0" y="0"/>
                 <wp:positionH relativeFrom="column">
                   <wp:posOffset>-72390</wp:posOffset>
                 </wp:positionH>
                 <wp:positionV relativeFrom="paragraph">
-                  <wp:posOffset>1043940</wp:posOffset>
+                  <wp:posOffset>758190</wp:posOffset>
                 </wp:positionV>
-                <wp:extent cx="6080760" cy="1525270"/>
-                <wp:effectExtent l="0" t="0" r="0" b="0"/>
+                <wp:extent cx="6080760" cy="1722755"/>
+                <wp:effectExtent l="0" t="635" r="0" b="0"/>
                 <wp:wrapNone/>
                 <wp:docPr id="4" name="Text Box 4"/>
                 <a:graphic xmlns:a="http://schemas.openxmlformats.org/drawingml/2006/main">
@@ -274,7 +283,7 @@
                       <wps:spPr>
                         <a:xfrm>
                           <a:off x="0" y="0"/>
-                          <a:ext cx="6080760" cy="1525320"/>
+                          <a:ext cx="6080760" cy="1722600"/>
                         </a:xfrm>
                         <a:prstGeom prst="rect">
                           <a:avLst/>
@@ -413,7 +422,7 @@
                           </w:p>
                         </w:txbxContent>
                       </wps:txbx>
-                      <wps:bodyPr tIns="91440" bIns="91440" anchor="t" upright="1">
+                      <wps:bodyPr tIns="91440" bIns="91440" anchor="t">
                         <a:noAutofit/>
                       </wps:bodyPr>
                     </wps:wsp>
@@ -424,7 +433,7 @@
           </mc:Choice>
           <mc:Fallback>
             <w:pict>
-              <v:rect id="shape_0" stroked="f" o:allowincell="f" style="position:absolute;margin-left:-5.7pt;margin-top:82.2pt;width:478.75pt;height:120.05pt;mso-wrap-style:square;v-text-anchor:top" wp14:anchorId="71C9E8E7">
+              <v:rect id="shape_0" stroked="f" o:allowincell="f" style="position:absolute;margin-left:-5.7pt;margin-top:59.7pt;width:478.75pt;height:135.6pt;mso-wrap-style:square;v-text-anchor:top">
                 <v:fill o:detectmouseclick="t" on="false"/>
                 <v:stroke color="#3465a4" joinstyle="round" endcap="flat"/>
                 <v:textbox>
@@ -636,19 +645,10 @@
       </w:pPr>
       <w:r>
         <w:rPr/>
-      </w:r>
-    </w:p>
-    <w:p>
-      <w:pPr>
-        <w:pStyle w:val="Normal"/>
-        <w:rPr/>
-      </w:pPr>
-      <w:r>
-        <w:rPr/>
         <mc:AlternateContent>
           <mc:Choice Requires="wps">
             <w:drawing>
-              <wp:anchor distT="0" distB="0" distL="0" distR="0" simplePos="0" relativeHeight="8" behindDoc="0" locked="0" layoutInCell="1" allowOverlap="1" wp14:anchorId="71C9E8E5">
+              <wp:anchor distT="0" distB="0" distL="0" distR="0" simplePos="0" relativeHeight="8" behindDoc="0" locked="0" layoutInCell="1" allowOverlap="1">
                 <wp:simplePos x="0" y="0"/>
                 <wp:positionH relativeFrom="column">
                   <wp:posOffset>2579370</wp:posOffset>
@@ -808,7 +808,7 @@
                           </w:p>
                           <w:p>
                             <w:pPr>
-                              <w:pStyle w:val="FrameContentsuser"/>
+                              <w:pStyle w:val="FrameContents"/>
                               <w:tabs>
                                 <w:tab w:val="clear" w:pos="1304"/>
                                 <w:tab w:val="left" w:pos="0" w:leader="none"/>
@@ -818,14 +818,12 @@
                               </w:rPr>
                             </w:pPr>
                             <w:r>
-                              <w:rPr>
-                                <w:color w:val="000000"/>
-                              </w:rPr>
+                              <w:rPr/>
                             </w:r>
                           </w:p>
                         </w:txbxContent>
                       </wps:txbx>
-                      <wps:bodyPr tIns="91440" bIns="91440" anchor="t" upright="1">
+                      <wps:bodyPr tIns="91440" bIns="91440" anchor="t">
                         <a:noAutofit/>
                       </wps:bodyPr>
                     </wps:wsp>
@@ -836,7 +834,7 @@
           </mc:Choice>
           <mc:Fallback>
             <w:pict>
-              <v:rect id="shape_0" stroked="f" o:allowincell="f" style="position:absolute;margin-left:203.1pt;margin-top:13.95pt;width:232.95pt;height:83.95pt;mso-wrap-style:square;v-text-anchor:top" wp14:anchorId="71C9E8E5">
+              <v:rect id="shape_0" stroked="f" o:allowincell="f" style="position:absolute;margin-left:203.1pt;margin-top:13.95pt;width:232.95pt;height:83.95pt;mso-wrap-style:square;v-text-anchor:top">
                 <v:fill o:detectmouseclick="t" on="false"/>
                 <v:stroke color="#3465a4" joinstyle="round" endcap="flat"/>
                 <v:textbox>
@@ -964,7 +962,7 @@
                     </w:p>
                     <w:p>
                       <w:pPr>
-                        <w:pStyle w:val="FrameContentsuser"/>
+                        <w:pStyle w:val="FrameContents"/>
                         <w:tabs>
                           <w:tab w:val="clear" w:pos="1304"/>
                           <w:tab w:val="left" w:pos="0" w:leader="none"/>
@@ -974,9 +972,7 @@
                         </w:rPr>
                       </w:pPr>
                       <w:r>
-                        <w:rPr>
-                          <w:color w:val="000000"/>
-                        </w:rPr>
+                        <w:rPr/>
                       </w:r>
                     </w:p>
                   </w:txbxContent>
@@ -1000,24 +996,11 @@
     <w:p>
       <w:pPr>
         <w:pStyle w:val="Normal"/>
-        <w:rPr/>
-      </w:pPr>
-      <w:r>
-        <w:rPr/>
-      </w:r>
-    </w:p>
-    <w:p>
-      <w:pPr>
-        <w:pStyle w:val="Normal"/>
         <w:spacing w:before="0" w:after="0"/>
         <w:rPr/>
         <w:sectPr>
-          <w:headerReference w:type="even" r:id="rId5"/>
-          <w:headerReference w:type="default" r:id="rId6"/>
-          <w:headerReference w:type="first" r:id="rId7"/>
-          <w:footerReference w:type="even" r:id="rId8"/>
-          <w:footerReference w:type="default" r:id="rId9"/>
-          <w:footerReference w:type="first" r:id="rId10"/>
+          <w:headerReference w:type="default" r:id="rId5"/>
+          <w:footerReference w:type="default" r:id="rId6"/>
           <w:type w:val="nextPage"/>
           <w:pgSz w:w="11906" w:h="16838"/>
           <w:pgMar w:left="2268" w:right="1134" w:gutter="0" w:header="709" w:top="1134" w:footer="709" w:bottom="1701"/>
@@ -1069,10 +1052,9 @@
               <w:tab w:val="left" w:pos="397" w:leader="none"/>
             </w:tabs>
             <w:rPr>
-              <w:rFonts w:ascii="Calibri" w:hAnsi="Calibri" w:eastAsia="" w:cs="" w:asciiTheme="minorHAnsi" w:cstheme="minorBidi" w:eastAsiaTheme="minorEastAsia" w:hAnsiTheme="minorHAnsi"/>
+              <w:rFonts w:ascii="Calibri" w:hAnsi="Calibri"/>
               <w:kern w:val="2"/>
               <w:lang w:eastAsia="fi-FI"/>
-              <w14:ligatures w14:val="standardContextual"/>
             </w:rPr>
           </w:pPr>
           <w:r>
@@ -1082,15 +1064,13 @@
             <w:rPr>
               <w:rStyle w:val="IndexLink"/>
               <w:vanish w:val="false"/>
-              <w:webHidden/>
             </w:rPr>
-            <w:instrText xml:space="preserve"> TOC \z \o "1-3" \u \h</w:instrText>
+            <w:instrText xml:space="preserve"> TOC \o "1-3" \h</w:instrText>
           </w:r>
           <w:r>
             <w:rPr>
               <w:rStyle w:val="IndexLink"/>
               <w:vanish w:val="false"/>
-              <w:webHidden/>
             </w:rPr>
             <w:fldChar w:fldCharType="separate"/>
           </w:r>
@@ -1099,17 +1079,15 @@
               <w:rPr>
                 <w:rStyle w:val="IndexLink"/>
                 <w:vanish w:val="false"/>
-                <w:webHidden/>
               </w:rPr>
               <w:t>1</w:t>
             </w:r>
             <w:r>
               <w:rPr>
                 <w:rStyle w:val="IndexLink"/>
-                <w:rFonts w:eastAsia="" w:cs="" w:ascii="Calibri" w:hAnsi="Calibri" w:asciiTheme="minorHAnsi" w:cstheme="minorBidi" w:eastAsiaTheme="minorEastAsia" w:hAnsiTheme="minorHAnsi"/>
+                <w:rFonts w:ascii="Calibri" w:hAnsi="Calibri"/>
                 <w:kern w:val="2"/>
                 <w:lang w:eastAsia="fi-FI"/>
-                <w14:ligatures w14:val="standardContextual"/>
               </w:rPr>
               <w:tab/>
             </w:r>
@@ -1160,10 +1138,9 @@
               <w:tab w:val="left" w:pos="397" w:leader="none"/>
             </w:tabs>
             <w:rPr>
-              <w:rFonts w:ascii="Calibri" w:hAnsi="Calibri" w:eastAsia="" w:cs="" w:asciiTheme="minorHAnsi" w:cstheme="minorBidi" w:eastAsiaTheme="minorEastAsia" w:hAnsiTheme="minorHAnsi"/>
+              <w:rFonts w:ascii="Calibri" w:hAnsi="Calibri"/>
               <w:kern w:val="2"/>
               <w:lang w:eastAsia="fi-FI"/>
-              <w14:ligatures w14:val="standardContextual"/>
             </w:rPr>
           </w:pPr>
           <w:hyperlink w:anchor="_Toc150275668">
@@ -1171,17 +1148,15 @@
               <w:rPr>
                 <w:rStyle w:val="IndexLink"/>
                 <w:vanish w:val="false"/>
-                <w:webHidden/>
               </w:rPr>
               <w:t>2</w:t>
             </w:r>
             <w:r>
               <w:rPr>
                 <w:rStyle w:val="IndexLink"/>
-                <w:rFonts w:eastAsia="" w:cs="" w:ascii="Calibri" w:hAnsi="Calibri" w:asciiTheme="minorHAnsi" w:cstheme="minorBidi" w:eastAsiaTheme="minorEastAsia" w:hAnsiTheme="minorHAnsi"/>
+                <w:rFonts w:ascii="Calibri" w:hAnsi="Calibri"/>
                 <w:kern w:val="2"/>
                 <w:lang w:eastAsia="fi-FI"/>
-                <w14:ligatures w14:val="standardContextual"/>
               </w:rPr>
               <w:tab/>
             </w:r>
@@ -1232,10 +1207,9 @@
               <w:tab w:val="left" w:pos="397" w:leader="none"/>
             </w:tabs>
             <w:rPr>
-              <w:rFonts w:ascii="Calibri" w:hAnsi="Calibri" w:eastAsia="" w:cs="" w:asciiTheme="minorHAnsi" w:cstheme="minorBidi" w:eastAsiaTheme="minorEastAsia" w:hAnsiTheme="minorHAnsi"/>
+              <w:rFonts w:ascii="Calibri" w:hAnsi="Calibri"/>
               <w:kern w:val="2"/>
               <w:lang w:eastAsia="fi-FI"/>
-              <w14:ligatures w14:val="standardContextual"/>
             </w:rPr>
           </w:pPr>
           <w:hyperlink w:anchor="_Toc150275669">
@@ -1243,17 +1217,15 @@
               <w:rPr>
                 <w:rStyle w:val="IndexLink"/>
                 <w:vanish w:val="false"/>
-                <w:webHidden/>
               </w:rPr>
               <w:t>3</w:t>
             </w:r>
             <w:r>
               <w:rPr>
                 <w:rStyle w:val="IndexLink"/>
-                <w:rFonts w:eastAsia="" w:cs="" w:ascii="Calibri" w:hAnsi="Calibri" w:asciiTheme="minorHAnsi" w:cstheme="minorBidi" w:eastAsiaTheme="minorEastAsia" w:hAnsiTheme="minorHAnsi"/>
+                <w:rFonts w:ascii="Calibri" w:hAnsi="Calibri"/>
                 <w:kern w:val="2"/>
                 <w:lang w:eastAsia="fi-FI"/>
-                <w14:ligatures w14:val="standardContextual"/>
               </w:rPr>
               <w:tab/>
             </w:r>
@@ -1304,10 +1276,9 @@
               <w:tab w:val="left" w:pos="397" w:leader="none"/>
             </w:tabs>
             <w:rPr>
-              <w:rFonts w:ascii="Calibri" w:hAnsi="Calibri" w:eastAsia="" w:cs="" w:asciiTheme="minorHAnsi" w:cstheme="minorBidi" w:eastAsiaTheme="minorEastAsia" w:hAnsiTheme="minorHAnsi"/>
+              <w:rFonts w:ascii="Calibri" w:hAnsi="Calibri"/>
               <w:kern w:val="2"/>
               <w:lang w:eastAsia="fi-FI"/>
-              <w14:ligatures w14:val="standardContextual"/>
             </w:rPr>
           </w:pPr>
           <w:hyperlink w:anchor="_Toc150275670">
@@ -1315,17 +1286,15 @@
               <w:rPr>
                 <w:rStyle w:val="IndexLink"/>
                 <w:vanish w:val="false"/>
-                <w:webHidden/>
               </w:rPr>
               <w:t>4</w:t>
             </w:r>
             <w:r>
               <w:rPr>
                 <w:rStyle w:val="IndexLink"/>
-                <w:rFonts w:eastAsia="" w:cs="" w:ascii="Calibri" w:hAnsi="Calibri" w:asciiTheme="minorHAnsi" w:cstheme="minorBidi" w:eastAsiaTheme="minorEastAsia" w:hAnsiTheme="minorHAnsi"/>
+                <w:rFonts w:ascii="Calibri" w:hAnsi="Calibri"/>
                 <w:kern w:val="2"/>
                 <w:lang w:eastAsia="fi-FI"/>
-                <w14:ligatures w14:val="standardContextual"/>
               </w:rPr>
               <w:tab/>
             </w:r>
@@ -1373,10 +1342,9 @@
           <w:pPr>
             <w:pStyle w:val="TOC2"/>
             <w:rPr>
-              <w:rFonts w:ascii="Calibri" w:hAnsi="Calibri" w:eastAsia="" w:cs="" w:asciiTheme="minorHAnsi" w:cstheme="minorBidi" w:eastAsiaTheme="minorEastAsia" w:hAnsiTheme="minorHAnsi"/>
+              <w:rFonts w:ascii="Calibri" w:hAnsi="Calibri"/>
               <w:kern w:val="2"/>
               <w:lang w:eastAsia="fi-FI"/>
-              <w14:ligatures w14:val="standardContextual"/>
             </w:rPr>
           </w:pPr>
           <w:hyperlink w:anchor="_Toc150275671">
@@ -1384,17 +1352,15 @@
               <w:rPr>
                 <w:rStyle w:val="IndexLink"/>
                 <w:vanish w:val="false"/>
-                <w:webHidden/>
               </w:rPr>
               <w:t>4.1</w:t>
             </w:r>
             <w:r>
               <w:rPr>
                 <w:rStyle w:val="IndexLink"/>
-                <w:rFonts w:eastAsia="" w:cs="" w:ascii="Calibri" w:hAnsi="Calibri" w:asciiTheme="minorHAnsi" w:cstheme="minorBidi" w:eastAsiaTheme="minorEastAsia" w:hAnsiTheme="minorHAnsi"/>
+                <w:rFonts w:ascii="Calibri" w:hAnsi="Calibri"/>
                 <w:kern w:val="2"/>
                 <w:lang w:eastAsia="fi-FI"/>
-                <w14:ligatures w14:val="standardContextual"/>
               </w:rPr>
               <w:tab/>
             </w:r>
@@ -1442,10 +1408,9 @@
           <w:pPr>
             <w:pStyle w:val="TOC2"/>
             <w:rPr>
-              <w:rFonts w:ascii="Calibri" w:hAnsi="Calibri" w:eastAsia="" w:cs="" w:asciiTheme="minorHAnsi" w:cstheme="minorBidi" w:eastAsiaTheme="minorEastAsia" w:hAnsiTheme="minorHAnsi"/>
+              <w:rFonts w:ascii="Calibri" w:hAnsi="Calibri"/>
               <w:kern w:val="2"/>
               <w:lang w:eastAsia="fi-FI"/>
-              <w14:ligatures w14:val="standardContextual"/>
             </w:rPr>
           </w:pPr>
           <w:hyperlink w:anchor="_Toc150275672">
@@ -1453,17 +1418,15 @@
               <w:rPr>
                 <w:rStyle w:val="IndexLink"/>
                 <w:vanish w:val="false"/>
-                <w:webHidden/>
               </w:rPr>
               <w:t>4.2</w:t>
             </w:r>
             <w:r>
               <w:rPr>
                 <w:rStyle w:val="IndexLink"/>
-                <w:rFonts w:eastAsia="" w:cs="" w:ascii="Calibri" w:hAnsi="Calibri" w:asciiTheme="minorHAnsi" w:cstheme="minorBidi" w:eastAsiaTheme="minorEastAsia" w:hAnsiTheme="minorHAnsi"/>
+                <w:rFonts w:ascii="Calibri" w:hAnsi="Calibri"/>
                 <w:kern w:val="2"/>
                 <w:lang w:eastAsia="fi-FI"/>
-                <w14:ligatures w14:val="standardContextual"/>
               </w:rPr>
               <w:tab/>
             </w:r>
@@ -1511,10 +1474,9 @@
           <w:pPr>
             <w:pStyle w:val="TOC2"/>
             <w:rPr>
-              <w:rFonts w:ascii="Calibri" w:hAnsi="Calibri" w:eastAsia="" w:cs="" w:asciiTheme="minorHAnsi" w:cstheme="minorBidi" w:eastAsiaTheme="minorEastAsia" w:hAnsiTheme="minorHAnsi"/>
+              <w:rFonts w:ascii="Calibri" w:hAnsi="Calibri"/>
               <w:kern w:val="2"/>
               <w:lang w:eastAsia="fi-FI"/>
-              <w14:ligatures w14:val="standardContextual"/>
             </w:rPr>
           </w:pPr>
           <w:hyperlink w:anchor="_Toc150275673">
@@ -1522,17 +1484,15 @@
               <w:rPr>
                 <w:rStyle w:val="IndexLink"/>
                 <w:vanish w:val="false"/>
-                <w:webHidden/>
               </w:rPr>
               <w:t>4.3</w:t>
             </w:r>
             <w:r>
               <w:rPr>
                 <w:rStyle w:val="IndexLink"/>
-                <w:rFonts w:eastAsia="" w:cs="" w:ascii="Calibri" w:hAnsi="Calibri" w:asciiTheme="minorHAnsi" w:cstheme="minorBidi" w:eastAsiaTheme="minorEastAsia" w:hAnsiTheme="minorHAnsi"/>
+                <w:rFonts w:ascii="Calibri" w:hAnsi="Calibri"/>
                 <w:kern w:val="2"/>
                 <w:lang w:eastAsia="fi-FI"/>
-                <w14:ligatures w14:val="standardContextual"/>
               </w:rPr>
               <w:tab/>
             </w:r>
@@ -1580,10 +1540,9 @@
           <w:pPr>
             <w:pStyle w:val="TOC2"/>
             <w:rPr>
-              <w:rFonts w:ascii="Calibri" w:hAnsi="Calibri" w:eastAsia="" w:cs="" w:asciiTheme="minorHAnsi" w:cstheme="minorBidi" w:eastAsiaTheme="minorEastAsia" w:hAnsiTheme="minorHAnsi"/>
+              <w:rFonts w:ascii="Calibri" w:hAnsi="Calibri"/>
               <w:kern w:val="2"/>
               <w:lang w:eastAsia="fi-FI"/>
-              <w14:ligatures w14:val="standardContextual"/>
             </w:rPr>
           </w:pPr>
           <w:hyperlink w:anchor="_Toc150275674">
@@ -1591,17 +1550,15 @@
               <w:rPr>
                 <w:rStyle w:val="IndexLink"/>
                 <w:vanish w:val="false"/>
-                <w:webHidden/>
               </w:rPr>
               <w:t>4.4</w:t>
             </w:r>
             <w:r>
               <w:rPr>
                 <w:rStyle w:val="IndexLink"/>
-                <w:rFonts w:eastAsia="" w:cs="" w:ascii="Calibri" w:hAnsi="Calibri" w:asciiTheme="minorHAnsi" w:cstheme="minorBidi" w:eastAsiaTheme="minorEastAsia" w:hAnsiTheme="minorHAnsi"/>
+                <w:rFonts w:ascii="Calibri" w:hAnsi="Calibri"/>
                 <w:kern w:val="2"/>
                 <w:lang w:eastAsia="fi-FI"/>
-                <w14:ligatures w14:val="standardContextual"/>
               </w:rPr>
               <w:tab/>
             </w:r>
@@ -1649,10 +1606,9 @@
           <w:pPr>
             <w:pStyle w:val="TOC2"/>
             <w:rPr>
-              <w:rFonts w:ascii="Calibri" w:hAnsi="Calibri" w:eastAsia="" w:cs="" w:asciiTheme="minorHAnsi" w:cstheme="minorBidi" w:eastAsiaTheme="minorEastAsia" w:hAnsiTheme="minorHAnsi"/>
+              <w:rFonts w:ascii="Calibri" w:hAnsi="Calibri"/>
               <w:kern w:val="2"/>
               <w:lang w:eastAsia="fi-FI"/>
-              <w14:ligatures w14:val="standardContextual"/>
             </w:rPr>
           </w:pPr>
           <w:hyperlink w:anchor="_Toc150275675">
@@ -1660,17 +1616,15 @@
               <w:rPr>
                 <w:rStyle w:val="IndexLink"/>
                 <w:vanish w:val="false"/>
-                <w:webHidden/>
               </w:rPr>
               <w:t>4.5</w:t>
             </w:r>
             <w:r>
               <w:rPr>
                 <w:rStyle w:val="IndexLink"/>
-                <w:rFonts w:eastAsia="" w:cs="" w:ascii="Calibri" w:hAnsi="Calibri" w:asciiTheme="minorHAnsi" w:cstheme="minorBidi" w:eastAsiaTheme="minorEastAsia" w:hAnsiTheme="minorHAnsi"/>
+                <w:rFonts w:ascii="Calibri" w:hAnsi="Calibri"/>
                 <w:kern w:val="2"/>
                 <w:lang w:eastAsia="fi-FI"/>
-                <w14:ligatures w14:val="standardContextual"/>
               </w:rPr>
               <w:tab/>
             </w:r>
@@ -1718,10 +1672,9 @@
           <w:pPr>
             <w:pStyle w:val="TOC2"/>
             <w:rPr>
-              <w:rFonts w:ascii="Calibri" w:hAnsi="Calibri" w:eastAsia="" w:cs="" w:asciiTheme="minorHAnsi" w:cstheme="minorBidi" w:eastAsiaTheme="minorEastAsia" w:hAnsiTheme="minorHAnsi"/>
+              <w:rFonts w:ascii="Calibri" w:hAnsi="Calibri"/>
               <w:kern w:val="2"/>
               <w:lang w:eastAsia="fi-FI"/>
-              <w14:ligatures w14:val="standardContextual"/>
             </w:rPr>
           </w:pPr>
           <w:hyperlink w:anchor="_Toc150275676">
@@ -1729,17 +1682,15 @@
               <w:rPr>
                 <w:rStyle w:val="IndexLink"/>
                 <w:vanish w:val="false"/>
-                <w:webHidden/>
               </w:rPr>
               <w:t>4.6</w:t>
             </w:r>
             <w:r>
               <w:rPr>
                 <w:rStyle w:val="IndexLink"/>
-                <w:rFonts w:eastAsia="" w:cs="" w:ascii="Calibri" w:hAnsi="Calibri" w:asciiTheme="minorHAnsi" w:cstheme="minorBidi" w:eastAsiaTheme="minorEastAsia" w:hAnsiTheme="minorHAnsi"/>
+                <w:rFonts w:ascii="Calibri" w:hAnsi="Calibri"/>
                 <w:kern w:val="2"/>
                 <w:lang w:eastAsia="fi-FI"/>
-                <w14:ligatures w14:val="standardContextual"/>
               </w:rPr>
               <w:tab/>
             </w:r>
@@ -1787,10 +1738,9 @@
           <w:pPr>
             <w:pStyle w:val="TOC3"/>
             <w:rPr>
-              <w:rFonts w:ascii="Calibri" w:hAnsi="Calibri" w:eastAsia="" w:cs="" w:asciiTheme="minorHAnsi" w:cstheme="minorBidi" w:eastAsiaTheme="minorEastAsia" w:hAnsiTheme="minorHAnsi"/>
+              <w:rFonts w:ascii="Calibri" w:hAnsi="Calibri"/>
               <w:kern w:val="2"/>
               <w:lang w:eastAsia="fi-FI"/>
-              <w14:ligatures w14:val="standardContextual"/>
             </w:rPr>
           </w:pPr>
           <w:hyperlink w:anchor="_Toc150275677">
@@ -1798,17 +1748,15 @@
               <w:rPr>
                 <w:rStyle w:val="IndexLink"/>
                 <w:vanish w:val="false"/>
-                <w:webHidden/>
               </w:rPr>
               <w:t>4.6.1</w:t>
             </w:r>
             <w:r>
               <w:rPr>
                 <w:rStyle w:val="IndexLink"/>
-                <w:rFonts w:eastAsia="" w:cs="" w:ascii="Calibri" w:hAnsi="Calibri" w:asciiTheme="minorHAnsi" w:cstheme="minorBidi" w:eastAsiaTheme="minorEastAsia" w:hAnsiTheme="minorHAnsi"/>
+                <w:rFonts w:ascii="Calibri" w:hAnsi="Calibri"/>
                 <w:kern w:val="2"/>
                 <w:lang w:eastAsia="fi-FI"/>
-                <w14:ligatures w14:val="standardContextual"/>
               </w:rPr>
               <w:tab/>
             </w:r>
@@ -1856,10 +1804,9 @@
           <w:pPr>
             <w:pStyle w:val="TOC3"/>
             <w:rPr>
-              <w:rFonts w:ascii="Calibri" w:hAnsi="Calibri" w:eastAsia="" w:cs="" w:asciiTheme="minorHAnsi" w:cstheme="minorBidi" w:eastAsiaTheme="minorEastAsia" w:hAnsiTheme="minorHAnsi"/>
+              <w:rFonts w:ascii="Calibri" w:hAnsi="Calibri"/>
               <w:kern w:val="2"/>
               <w:lang w:eastAsia="fi-FI"/>
-              <w14:ligatures w14:val="standardContextual"/>
             </w:rPr>
           </w:pPr>
           <w:hyperlink w:anchor="_Toc150275678">
@@ -1867,17 +1814,15 @@
               <w:rPr>
                 <w:rStyle w:val="IndexLink"/>
                 <w:vanish w:val="false"/>
-                <w:webHidden/>
               </w:rPr>
               <w:t>4.6.2</w:t>
             </w:r>
             <w:r>
               <w:rPr>
                 <w:rStyle w:val="IndexLink"/>
-                <w:rFonts w:eastAsia="" w:cs="" w:ascii="Calibri" w:hAnsi="Calibri" w:asciiTheme="minorHAnsi" w:cstheme="minorBidi" w:eastAsiaTheme="minorEastAsia" w:hAnsiTheme="minorHAnsi"/>
+                <w:rFonts w:ascii="Calibri" w:hAnsi="Calibri"/>
                 <w:kern w:val="2"/>
                 <w:lang w:eastAsia="fi-FI"/>
-                <w14:ligatures w14:val="standardContextual"/>
               </w:rPr>
               <w:tab/>
             </w:r>
@@ -1928,10 +1873,9 @@
               <w:tab w:val="left" w:pos="397" w:leader="none"/>
             </w:tabs>
             <w:rPr>
-              <w:rFonts w:ascii="Calibri" w:hAnsi="Calibri" w:eastAsia="" w:cs="" w:asciiTheme="minorHAnsi" w:cstheme="minorBidi" w:eastAsiaTheme="minorEastAsia" w:hAnsiTheme="minorHAnsi"/>
+              <w:rFonts w:ascii="Calibri" w:hAnsi="Calibri"/>
               <w:kern w:val="2"/>
               <w:lang w:eastAsia="fi-FI"/>
-              <w14:ligatures w14:val="standardContextual"/>
             </w:rPr>
           </w:pPr>
           <w:hyperlink w:anchor="_Toc150275679">
@@ -1939,7 +1883,6 @@
               <w:rPr>
                 <w:rStyle w:val="IndexLink"/>
                 <w:vanish w:val="false"/>
-                <w:webHidden/>
                 <w:lang w:val="en-GB"/>
               </w:rPr>
               <w:t>5</w:t>
@@ -1947,10 +1890,9 @@
             <w:r>
               <w:rPr>
                 <w:rStyle w:val="IndexLink"/>
-                <w:rFonts w:eastAsia="" w:cs="" w:ascii="Calibri" w:hAnsi="Calibri" w:asciiTheme="minorHAnsi" w:cstheme="minorBidi" w:eastAsiaTheme="minorEastAsia" w:hAnsiTheme="minorHAnsi"/>
+                <w:rFonts w:ascii="Calibri" w:hAnsi="Calibri"/>
                 <w:kern w:val="2"/>
                 <w:lang w:eastAsia="fi-FI"/>
-                <w14:ligatures w14:val="standardContextual"/>
               </w:rPr>
               <w:tab/>
             </w:r>
@@ -1999,10 +1941,9 @@
           <w:pPr>
             <w:pStyle w:val="TOC2"/>
             <w:rPr>
-              <w:rFonts w:ascii="Calibri" w:hAnsi="Calibri" w:eastAsia="" w:cs="" w:asciiTheme="minorHAnsi" w:cstheme="minorBidi" w:eastAsiaTheme="minorEastAsia" w:hAnsiTheme="minorHAnsi"/>
+              <w:rFonts w:ascii="Calibri" w:hAnsi="Calibri"/>
               <w:kern w:val="2"/>
               <w:lang w:eastAsia="fi-FI"/>
-              <w14:ligatures w14:val="standardContextual"/>
             </w:rPr>
           </w:pPr>
           <w:hyperlink w:anchor="_Toc150275680">
@@ -2010,7 +1951,6 @@
               <w:rPr>
                 <w:rStyle w:val="IndexLink"/>
                 <w:vanish w:val="false"/>
-                <w:webHidden/>
                 <w:lang w:val="en-GB"/>
               </w:rPr>
               <w:t>5.1</w:t>
@@ -2018,10 +1958,9 @@
             <w:r>
               <w:rPr>
                 <w:rStyle w:val="IndexLink"/>
-                <w:rFonts w:eastAsia="" w:cs="" w:ascii="Calibri" w:hAnsi="Calibri" w:asciiTheme="minorHAnsi" w:cstheme="minorBidi" w:eastAsiaTheme="minorEastAsia" w:hAnsiTheme="minorHAnsi"/>
+                <w:rFonts w:ascii="Calibri" w:hAnsi="Calibri"/>
                 <w:kern w:val="2"/>
                 <w:lang w:eastAsia="fi-FI"/>
-                <w14:ligatures w14:val="standardContextual"/>
               </w:rPr>
               <w:tab/>
             </w:r>
@@ -2070,10 +2009,9 @@
           <w:pPr>
             <w:pStyle w:val="TOC2"/>
             <w:rPr>
-              <w:rFonts w:ascii="Calibri" w:hAnsi="Calibri" w:eastAsia="" w:cs="" w:asciiTheme="minorHAnsi" w:cstheme="minorBidi" w:eastAsiaTheme="minorEastAsia" w:hAnsiTheme="minorHAnsi"/>
+              <w:rFonts w:ascii="Calibri" w:hAnsi="Calibri"/>
               <w:kern w:val="2"/>
               <w:lang w:eastAsia="fi-FI"/>
-              <w14:ligatures w14:val="standardContextual"/>
             </w:rPr>
           </w:pPr>
           <w:hyperlink w:anchor="_Toc150275681">
@@ -2081,17 +2019,15 @@
               <w:rPr>
                 <w:rStyle w:val="IndexLink"/>
                 <w:vanish w:val="false"/>
-                <w:webHidden/>
               </w:rPr>
               <w:t>5.2</w:t>
             </w:r>
             <w:r>
               <w:rPr>
                 <w:rStyle w:val="IndexLink"/>
-                <w:rFonts w:eastAsia="" w:cs="" w:ascii="Calibri" w:hAnsi="Calibri" w:asciiTheme="minorHAnsi" w:cstheme="minorBidi" w:eastAsiaTheme="minorEastAsia" w:hAnsiTheme="minorHAnsi"/>
+                <w:rFonts w:ascii="Calibri" w:hAnsi="Calibri"/>
                 <w:kern w:val="2"/>
                 <w:lang w:eastAsia="fi-FI"/>
-                <w14:ligatures w14:val="standardContextual"/>
               </w:rPr>
               <w:tab/>
             </w:r>
@@ -2139,10 +2075,9 @@
           <w:pPr>
             <w:pStyle w:val="TOC2"/>
             <w:rPr>
-              <w:rFonts w:ascii="Calibri" w:hAnsi="Calibri" w:eastAsia="" w:cs="" w:asciiTheme="minorHAnsi" w:cstheme="minorBidi" w:eastAsiaTheme="minorEastAsia" w:hAnsiTheme="minorHAnsi"/>
+              <w:rFonts w:ascii="Calibri" w:hAnsi="Calibri"/>
               <w:kern w:val="2"/>
               <w:lang w:eastAsia="fi-FI"/>
-              <w14:ligatures w14:val="standardContextual"/>
             </w:rPr>
           </w:pPr>
           <w:hyperlink w:anchor="_Toc150275682">
@@ -2150,7 +2085,6 @@
               <w:rPr>
                 <w:rStyle w:val="IndexLink"/>
                 <w:vanish w:val="false"/>
-                <w:webHidden/>
                 <w:lang w:val="en-GB"/>
               </w:rPr>
               <w:t>5.3</w:t>
@@ -2158,10 +2092,9 @@
             <w:r>
               <w:rPr>
                 <w:rStyle w:val="IndexLink"/>
-                <w:rFonts w:eastAsia="" w:cs="" w:ascii="Calibri" w:hAnsi="Calibri" w:asciiTheme="minorHAnsi" w:cstheme="minorBidi" w:eastAsiaTheme="minorEastAsia" w:hAnsiTheme="minorHAnsi"/>
+                <w:rFonts w:ascii="Calibri" w:hAnsi="Calibri"/>
                 <w:kern w:val="2"/>
                 <w:lang w:eastAsia="fi-FI"/>
-                <w14:ligatures w14:val="standardContextual"/>
               </w:rPr>
               <w:tab/>
             </w:r>
@@ -2210,10 +2143,9 @@
           <w:pPr>
             <w:pStyle w:val="TOC2"/>
             <w:rPr>
-              <w:rFonts w:ascii="Calibri" w:hAnsi="Calibri" w:eastAsia="" w:cs="" w:asciiTheme="minorHAnsi" w:cstheme="minorBidi" w:eastAsiaTheme="minorEastAsia" w:hAnsiTheme="minorHAnsi"/>
+              <w:rFonts w:ascii="Calibri" w:hAnsi="Calibri"/>
               <w:kern w:val="2"/>
               <w:lang w:eastAsia="fi-FI"/>
-              <w14:ligatures w14:val="standardContextual"/>
             </w:rPr>
           </w:pPr>
           <w:hyperlink w:anchor="_Toc150275683">
@@ -2221,7 +2153,6 @@
               <w:rPr>
                 <w:rStyle w:val="IndexLink"/>
                 <w:vanish w:val="false"/>
-                <w:webHidden/>
                 <w:lang w:val="en-GB"/>
               </w:rPr>
               <w:t>5.4</w:t>
@@ -2229,10 +2160,9 @@
             <w:r>
               <w:rPr>
                 <w:rStyle w:val="IndexLink"/>
-                <w:rFonts w:eastAsia="" w:cs="" w:ascii="Calibri" w:hAnsi="Calibri" w:asciiTheme="minorHAnsi" w:cstheme="minorBidi" w:eastAsiaTheme="minorEastAsia" w:hAnsiTheme="minorHAnsi"/>
+                <w:rFonts w:ascii="Calibri" w:hAnsi="Calibri"/>
                 <w:kern w:val="2"/>
                 <w:lang w:eastAsia="fi-FI"/>
-                <w14:ligatures w14:val="standardContextual"/>
               </w:rPr>
               <w:tab/>
             </w:r>
@@ -2281,10 +2211,9 @@
           <w:pPr>
             <w:pStyle w:val="TOC2"/>
             <w:rPr>
-              <w:rFonts w:ascii="Calibri" w:hAnsi="Calibri" w:eastAsia="" w:cs="" w:asciiTheme="minorHAnsi" w:cstheme="minorBidi" w:eastAsiaTheme="minorEastAsia" w:hAnsiTheme="minorHAnsi"/>
+              <w:rFonts w:ascii="Calibri" w:hAnsi="Calibri"/>
               <w:kern w:val="2"/>
               <w:lang w:eastAsia="fi-FI"/>
-              <w14:ligatures w14:val="standardContextual"/>
             </w:rPr>
           </w:pPr>
           <w:hyperlink w:anchor="_Toc150275684">
@@ -2292,7 +2221,6 @@
               <w:rPr>
                 <w:rStyle w:val="IndexLink"/>
                 <w:vanish w:val="false"/>
-                <w:webHidden/>
                 <w:lang w:val="en-GB"/>
               </w:rPr>
               <w:t>5.5</w:t>
@@ -2300,10 +2228,9 @@
             <w:r>
               <w:rPr>
                 <w:rStyle w:val="IndexLink"/>
-                <w:rFonts w:eastAsia="" w:cs="" w:ascii="Calibri" w:hAnsi="Calibri" w:asciiTheme="minorHAnsi" w:cstheme="minorBidi" w:eastAsiaTheme="minorEastAsia" w:hAnsiTheme="minorHAnsi"/>
+                <w:rFonts w:ascii="Calibri" w:hAnsi="Calibri"/>
                 <w:kern w:val="2"/>
                 <w:lang w:eastAsia="fi-FI"/>
-                <w14:ligatures w14:val="standardContextual"/>
               </w:rPr>
               <w:tab/>
             </w:r>
@@ -2352,10 +2279,9 @@
           <w:pPr>
             <w:pStyle w:val="TOC2"/>
             <w:rPr>
-              <w:rFonts w:ascii="Calibri" w:hAnsi="Calibri" w:eastAsia="" w:cs="" w:asciiTheme="minorHAnsi" w:cstheme="minorBidi" w:eastAsiaTheme="minorEastAsia" w:hAnsiTheme="minorHAnsi"/>
+              <w:rFonts w:ascii="Calibri" w:hAnsi="Calibri"/>
               <w:kern w:val="2"/>
               <w:lang w:eastAsia="fi-FI"/>
-              <w14:ligatures w14:val="standardContextual"/>
             </w:rPr>
           </w:pPr>
           <w:hyperlink w:anchor="_Toc150275685">
@@ -2363,17 +2289,15 @@
               <w:rPr>
                 <w:rStyle w:val="IndexLink"/>
                 <w:vanish w:val="false"/>
-                <w:webHidden/>
               </w:rPr>
               <w:t>5.6</w:t>
             </w:r>
             <w:r>
               <w:rPr>
                 <w:rStyle w:val="IndexLink"/>
-                <w:rFonts w:eastAsia="" w:cs="" w:ascii="Calibri" w:hAnsi="Calibri" w:asciiTheme="minorHAnsi" w:cstheme="minorBidi" w:eastAsiaTheme="minorEastAsia" w:hAnsiTheme="minorHAnsi"/>
+                <w:rFonts w:ascii="Calibri" w:hAnsi="Calibri"/>
                 <w:kern w:val="2"/>
                 <w:lang w:eastAsia="fi-FI"/>
-                <w14:ligatures w14:val="standardContextual"/>
               </w:rPr>
               <w:tab/>
             </w:r>
@@ -2424,10 +2348,9 @@
               <w:tab w:val="left" w:pos="397" w:leader="none"/>
             </w:tabs>
             <w:rPr>
-              <w:rFonts w:ascii="Calibri" w:hAnsi="Calibri" w:eastAsia="" w:cs="" w:asciiTheme="minorHAnsi" w:cstheme="minorBidi" w:eastAsiaTheme="minorEastAsia" w:hAnsiTheme="minorHAnsi"/>
+              <w:rFonts w:ascii="Calibri" w:hAnsi="Calibri"/>
               <w:kern w:val="2"/>
               <w:lang w:eastAsia="fi-FI"/>
-              <w14:ligatures w14:val="standardContextual"/>
             </w:rPr>
           </w:pPr>
           <w:hyperlink w:anchor="_Toc150275686">
@@ -2435,17 +2358,15 @@
               <w:rPr>
                 <w:rStyle w:val="IndexLink"/>
                 <w:vanish w:val="false"/>
-                <w:webHidden/>
               </w:rPr>
               <w:t>6</w:t>
             </w:r>
             <w:r>
               <w:rPr>
                 <w:rStyle w:val="IndexLink"/>
-                <w:rFonts w:eastAsia="" w:cs="" w:ascii="Calibri" w:hAnsi="Calibri" w:asciiTheme="minorHAnsi" w:cstheme="minorBidi" w:eastAsiaTheme="minorEastAsia" w:hAnsiTheme="minorHAnsi"/>
+                <w:rFonts w:ascii="Calibri" w:hAnsi="Calibri"/>
                 <w:kern w:val="2"/>
                 <w:lang w:eastAsia="fi-FI"/>
-                <w14:ligatures w14:val="standardContextual"/>
               </w:rPr>
               <w:tab/>
             </w:r>
@@ -2496,10 +2417,9 @@
               <w:tab w:val="left" w:pos="397" w:leader="none"/>
             </w:tabs>
             <w:rPr>
-              <w:rFonts w:ascii="Calibri" w:hAnsi="Calibri" w:eastAsia="" w:cs="" w:asciiTheme="minorHAnsi" w:cstheme="minorBidi" w:eastAsiaTheme="minorEastAsia" w:hAnsiTheme="minorHAnsi"/>
+              <w:rFonts w:ascii="Calibri" w:hAnsi="Calibri"/>
               <w:kern w:val="2"/>
               <w:lang w:eastAsia="fi-FI"/>
-              <w14:ligatures w14:val="standardContextual"/>
             </w:rPr>
           </w:pPr>
           <w:hyperlink w:anchor="_Toc150275687">
@@ -2507,17 +2427,15 @@
               <w:rPr>
                 <w:rStyle w:val="IndexLink"/>
                 <w:vanish w:val="false"/>
-                <w:webHidden/>
               </w:rPr>
               <w:t>7</w:t>
             </w:r>
             <w:r>
               <w:rPr>
                 <w:rStyle w:val="IndexLink"/>
-                <w:rFonts w:eastAsia="" w:cs="" w:ascii="Calibri" w:hAnsi="Calibri" w:asciiTheme="minorHAnsi" w:cstheme="minorBidi" w:eastAsiaTheme="minorEastAsia" w:hAnsiTheme="minorHAnsi"/>
+                <w:rFonts w:ascii="Calibri" w:hAnsi="Calibri"/>
                 <w:kern w:val="2"/>
                 <w:lang w:eastAsia="fi-FI"/>
-                <w14:ligatures w14:val="standardContextual"/>
               </w:rPr>
               <w:tab/>
             </w:r>
@@ -2568,10 +2486,9 @@
               <w:tab w:val="left" w:pos="397" w:leader="none"/>
             </w:tabs>
             <w:rPr>
-              <w:rFonts w:ascii="Calibri" w:hAnsi="Calibri" w:eastAsia="" w:cs="" w:asciiTheme="minorHAnsi" w:cstheme="minorBidi" w:eastAsiaTheme="minorEastAsia" w:hAnsiTheme="minorHAnsi"/>
+              <w:rFonts w:ascii="Calibri" w:hAnsi="Calibri"/>
               <w:kern w:val="2"/>
               <w:lang w:eastAsia="fi-FI"/>
-              <w14:ligatures w14:val="standardContextual"/>
             </w:rPr>
           </w:pPr>
           <w:hyperlink w:anchor="_Toc150275688">
@@ -2579,17 +2496,15 @@
               <w:rPr>
                 <w:rStyle w:val="IndexLink"/>
                 <w:vanish w:val="false"/>
-                <w:webHidden/>
               </w:rPr>
               <w:t>8</w:t>
             </w:r>
             <w:r>
               <w:rPr>
                 <w:rStyle w:val="IndexLink"/>
-                <w:rFonts w:eastAsia="" w:cs="" w:ascii="Calibri" w:hAnsi="Calibri" w:asciiTheme="minorHAnsi" w:cstheme="minorBidi" w:eastAsiaTheme="minorEastAsia" w:hAnsiTheme="minorHAnsi"/>
+                <w:rFonts w:ascii="Calibri" w:hAnsi="Calibri"/>
                 <w:kern w:val="2"/>
                 <w:lang w:eastAsia="fi-FI"/>
-                <w14:ligatures w14:val="standardContextual"/>
               </w:rPr>
               <w:tab/>
             </w:r>
@@ -2649,7 +2564,9 @@
           <w:tab w:val="clear" w:pos="1304"/>
           <w:tab w:val="left" w:pos="826" w:leader="none"/>
         </w:tabs>
-        <w:rPr/>
+        <w:rPr>
+          <w:b/>
+        </w:rPr>
       </w:pPr>
       <w:r>
         <w:rPr>
@@ -2682,12 +2599,10 @@
         <w:spacing w:before="0" w:after="240"/>
         <w:rPr/>
         <w:sectPr>
-          <w:headerReference w:type="even" r:id="rId11"/>
-          <w:headerReference w:type="default" r:id="rId12"/>
-          <w:headerReference w:type="first" r:id="rId13"/>
-          <w:footerReference w:type="even" r:id="rId14"/>
-          <w:footerReference w:type="default" r:id="rId15"/>
-          <w:footerReference w:type="first" r:id="rId16"/>
+          <w:headerReference w:type="default" r:id="rId7"/>
+          <w:headerReference w:type="first" r:id="rId8"/>
+          <w:footerReference w:type="default" r:id="rId9"/>
+          <w:footerReference w:type="first" r:id="rId10"/>
           <w:type w:val="nextPage"/>
           <w:pgSz w:w="11906" w:h="16838"/>
           <w:pgMar w:left="2268" w:right="1134" w:gutter="0" w:header="567" w:top="1134" w:footer="567" w:bottom="1701"/>
@@ -2879,55 +2794,33 @@
         <w:rPr>
           <w:lang w:val="en-GB"/>
         </w:rPr>
-        <w:t xml:space="preserve">How the call line branches wold go as such: Router </w:t>
-      </w:r>
-      <w:r>
-        <w:rPr>
-          <w:lang w:val="en-GB"/>
-        </w:rPr>
-        <w:t>service</w:t>
-      </w:r>
-      <w:r>
-        <w:rPr>
-          <w:lang w:val="en-GB"/>
-        </w:rPr>
-        <w:t xml:space="preserve"> → Language </w:t>
-      </w:r>
-      <w:r>
-        <w:rPr>
-          <w:lang w:val="en-GB"/>
-        </w:rPr>
-        <w:t>of communication</w:t>
-      </w:r>
-      <w:r>
-        <w:rPr>
-          <w:lang w:val="en-GB"/>
-        </w:rPr>
-        <w:t xml:space="preserve"> → </w:t>
-      </w:r>
-      <w:r>
-        <w:rPr>
-          <w:lang w:val="en-GB"/>
-        </w:rPr>
-        <w:t>Category</w:t>
-      </w:r>
-      <w:r>
-        <w:rPr>
-          <w:lang w:val="en-GB"/>
-        </w:rPr>
-        <w:t xml:space="preserve"> → </w:t>
-      </w:r>
-      <w:r>
-        <w:rPr>
-          <w:lang w:val="en-GB"/>
-        </w:rPr>
-        <w:t>Service line</w:t>
+        <w:t xml:space="preserve">How the call line branches wold go as such: Language of communication → Category → Service line → </w:t>
+      </w:r>
+      <w:r>
+        <w:rPr>
+          <w:lang w:val="en-GB"/>
+        </w:rPr>
+        <w:t>Serving</w:t>
       </w:r>
       <w:r>
         <w:rPr>
           <w:lang w:val="en-GB"/>
         </w:rPr>
         <w:t>.</w:t>
+      </w:r>
+    </w:p>
+    <w:p>
+      <w:pPr>
+        <w:pStyle w:val="leipteksti"/>
+        <w:rPr>
+          <w:lang w:val="en-GB"/>
+        </w:rPr>
+      </w:pPr>
+      <w:r>
+        <w:rPr>
+          <w:lang w:val="en-GB"/>
+        </w:rPr>
+        <w:t>Each has ~2-3 parallel of themselves</w:t>
       </w:r>
     </w:p>
     <w:p>
@@ -2969,7 +2862,7 @@
                     </pic:cNvPicPr>
                   </pic:nvPicPr>
                   <pic:blipFill>
-                    <a:blip r:embed="rId17"/>
+                    <a:blip r:embed="rId11"/>
                     <a:stretch>
                       <a:fillRect/>
                     </a:stretch>
@@ -3140,6 +3033,7 @@
     <w:p>
       <w:pPr>
         <w:pStyle w:val="Heading2"/>
+        <w:ind w:hanging="0" w:start="0"/>
         <w:rPr/>
       </w:pPr>
       <w:bookmarkStart w:id="4" w:name="_Toc150275671"/>
@@ -3170,6 +3064,7 @@
     <w:p>
       <w:pPr>
         <w:pStyle w:val="Heading2"/>
+        <w:ind w:hanging="0" w:start="0"/>
         <w:rPr/>
       </w:pPr>
       <w:bookmarkStart w:id="5" w:name="_Toc150275672"/>
@@ -3200,6 +3095,7 @@
     <w:p>
       <w:pPr>
         <w:pStyle w:val="Heading2"/>
+        <w:ind w:hanging="0" w:start="0"/>
         <w:rPr/>
       </w:pPr>
       <w:bookmarkStart w:id="6" w:name="_Toc150275673"/>
@@ -3230,6 +3126,7 @@
     <w:p>
       <w:pPr>
         <w:pStyle w:val="Heading2"/>
+        <w:ind w:hanging="0" w:start="0"/>
         <w:rPr/>
       </w:pPr>
       <w:bookmarkStart w:id="7" w:name="_Toc150275674"/>
@@ -3278,6 +3175,7 @@
     <w:p>
       <w:pPr>
         <w:pStyle w:val="Heading2"/>
+        <w:ind w:hanging="0" w:start="0"/>
         <w:rPr/>
       </w:pPr>
       <w:bookmarkStart w:id="8" w:name="_Toc150275675"/>
@@ -3338,6 +3236,7 @@
     <w:p>
       <w:pPr>
         <w:pStyle w:val="Heading2"/>
+        <w:ind w:hanging="0" w:start="0"/>
         <w:rPr/>
       </w:pPr>
       <w:bookmarkStart w:id="9" w:name="_Toc150275676"/>
@@ -3350,6 +3249,7 @@
     <w:p>
       <w:pPr>
         <w:pStyle w:val="Heading3"/>
+        <w:ind w:hanging="0" w:start="0"/>
         <w:rPr/>
       </w:pPr>
       <w:bookmarkStart w:id="10" w:name="_Toc150275677"/>
@@ -3411,7 +3311,6 @@
     </w:p>
     <w:tbl>
       <w:tblPr>
-        <w:tblStyle w:val="TableGrid"/>
         <w:tblW w:w="7506" w:type="dxa"/>
         <w:jc w:val="start"/>
         <w:tblInd w:w="988" w:type="dxa"/>
@@ -3422,7 +3321,6 @@
           <w:bottom w:w="0" w:type="dxa"/>
           <w:end w:w="108" w:type="dxa"/>
         </w:tblCellMar>
-        <w:tblLook w:val="04a0" w:noHBand="0" w:noVBand="1" w:firstColumn="1" w:lastRow="0" w:lastColumn="0" w:firstRow="1"/>
       </w:tblPr>
       <w:tblGrid>
         <w:gridCol w:w="2268"/>
@@ -3433,7 +3331,12 @@
         <w:tc>
           <w:tcPr>
             <w:tcW w:w="2268" w:type="dxa"/>
-            <w:tcBorders/>
+            <w:tcBorders>
+              <w:top w:val="single" w:sz="4" w:space="0" w:color="000000"/>
+              <w:start w:val="single" w:sz="4" w:space="0" w:color="000000"/>
+              <w:bottom w:val="single" w:sz="4" w:space="0" w:color="000000"/>
+              <w:end w:val="single" w:sz="4" w:space="0" w:color="000000"/>
+            </w:tcBorders>
           </w:tcPr>
           <w:p>
             <w:pPr>
@@ -3459,7 +3362,12 @@
         <w:tc>
           <w:tcPr>
             <w:tcW w:w="5238" w:type="dxa"/>
-            <w:tcBorders/>
+            <w:tcBorders>
+              <w:top w:val="single" w:sz="4" w:space="0" w:color="000000"/>
+              <w:start w:val="single" w:sz="4" w:space="0" w:color="000000"/>
+              <w:bottom w:val="single" w:sz="4" w:space="0" w:color="000000"/>
+              <w:end w:val="single" w:sz="4" w:space="0" w:color="000000"/>
+            </w:tcBorders>
           </w:tcPr>
           <w:p>
             <w:pPr>
@@ -3488,7 +3396,12 @@
         <w:tc>
           <w:tcPr>
             <w:tcW w:w="2268" w:type="dxa"/>
-            <w:tcBorders/>
+            <w:tcBorders>
+              <w:top w:val="single" w:sz="4" w:space="0" w:color="000000"/>
+              <w:start w:val="single" w:sz="4" w:space="0" w:color="000000"/>
+              <w:bottom w:val="single" w:sz="4" w:space="0" w:color="000000"/>
+              <w:end w:val="single" w:sz="4" w:space="0" w:color="000000"/>
+            </w:tcBorders>
           </w:tcPr>
           <w:p>
             <w:pPr>
@@ -3511,7 +3424,12 @@
         <w:tc>
           <w:tcPr>
             <w:tcW w:w="5238" w:type="dxa"/>
-            <w:tcBorders/>
+            <w:tcBorders>
+              <w:top w:val="single" w:sz="4" w:space="0" w:color="000000"/>
+              <w:start w:val="single" w:sz="4" w:space="0" w:color="000000"/>
+              <w:bottom w:val="single" w:sz="4" w:space="0" w:color="000000"/>
+              <w:end w:val="single" w:sz="4" w:space="0" w:color="000000"/>
+            </w:tcBorders>
           </w:tcPr>
           <w:p>
             <w:pPr>
@@ -3537,7 +3455,12 @@
         <w:tc>
           <w:tcPr>
             <w:tcW w:w="2268" w:type="dxa"/>
-            <w:tcBorders/>
+            <w:tcBorders>
+              <w:top w:val="single" w:sz="4" w:space="0" w:color="000000"/>
+              <w:start w:val="single" w:sz="4" w:space="0" w:color="000000"/>
+              <w:bottom w:val="single" w:sz="4" w:space="0" w:color="000000"/>
+              <w:end w:val="single" w:sz="4" w:space="0" w:color="000000"/>
+            </w:tcBorders>
           </w:tcPr>
           <w:p>
             <w:pPr>
@@ -3560,7 +3483,12 @@
         <w:tc>
           <w:tcPr>
             <w:tcW w:w="5238" w:type="dxa"/>
-            <w:tcBorders/>
+            <w:tcBorders>
+              <w:top w:val="single" w:sz="4" w:space="0" w:color="000000"/>
+              <w:start w:val="single" w:sz="4" w:space="0" w:color="000000"/>
+              <w:bottom w:val="single" w:sz="4" w:space="0" w:color="000000"/>
+              <w:end w:val="single" w:sz="4" w:space="0" w:color="000000"/>
+            </w:tcBorders>
           </w:tcPr>
           <w:p>
             <w:pPr>
@@ -3588,7 +3516,12 @@
         <w:tc>
           <w:tcPr>
             <w:tcW w:w="2268" w:type="dxa"/>
-            <w:tcBorders/>
+            <w:tcBorders>
+              <w:top w:val="single" w:sz="4" w:space="0" w:color="000000"/>
+              <w:start w:val="single" w:sz="4" w:space="0" w:color="000000"/>
+              <w:bottom w:val="single" w:sz="4" w:space="0" w:color="000000"/>
+              <w:end w:val="single" w:sz="4" w:space="0" w:color="000000"/>
+            </w:tcBorders>
           </w:tcPr>
           <w:p>
             <w:pPr>
@@ -3611,7 +3544,12 @@
         <w:tc>
           <w:tcPr>
             <w:tcW w:w="5238" w:type="dxa"/>
-            <w:tcBorders/>
+            <w:tcBorders>
+              <w:top w:val="single" w:sz="4" w:space="0" w:color="000000"/>
+              <w:start w:val="single" w:sz="4" w:space="0" w:color="000000"/>
+              <w:bottom w:val="single" w:sz="4" w:space="0" w:color="000000"/>
+              <w:end w:val="single" w:sz="4" w:space="0" w:color="000000"/>
+            </w:tcBorders>
           </w:tcPr>
           <w:p>
             <w:pPr>
@@ -3637,7 +3575,12 @@
         <w:tc>
           <w:tcPr>
             <w:tcW w:w="2268" w:type="dxa"/>
-            <w:tcBorders/>
+            <w:tcBorders>
+              <w:top w:val="single" w:sz="4" w:space="0" w:color="000000"/>
+              <w:start w:val="single" w:sz="4" w:space="0" w:color="000000"/>
+              <w:bottom w:val="single" w:sz="4" w:space="0" w:color="000000"/>
+              <w:end w:val="single" w:sz="4" w:space="0" w:color="000000"/>
+            </w:tcBorders>
           </w:tcPr>
           <w:p>
             <w:pPr>
@@ -3660,7 +3603,12 @@
         <w:tc>
           <w:tcPr>
             <w:tcW w:w="5238" w:type="dxa"/>
-            <w:tcBorders/>
+            <w:tcBorders>
+              <w:top w:val="single" w:sz="4" w:space="0" w:color="000000"/>
+              <w:start w:val="single" w:sz="4" w:space="0" w:color="000000"/>
+              <w:bottom w:val="single" w:sz="4" w:space="0" w:color="000000"/>
+              <w:end w:val="single" w:sz="4" w:space="0" w:color="000000"/>
+            </w:tcBorders>
           </w:tcPr>
           <w:p>
             <w:pPr>
@@ -3686,7 +3634,12 @@
         <w:tc>
           <w:tcPr>
             <w:tcW w:w="2268" w:type="dxa"/>
-            <w:tcBorders/>
+            <w:tcBorders>
+              <w:top w:val="single" w:sz="4" w:space="0" w:color="000000"/>
+              <w:start w:val="single" w:sz="4" w:space="0" w:color="000000"/>
+              <w:bottom w:val="single" w:sz="4" w:space="0" w:color="000000"/>
+              <w:end w:val="single" w:sz="4" w:space="0" w:color="000000"/>
+            </w:tcBorders>
           </w:tcPr>
           <w:p>
             <w:pPr>
@@ -3709,7 +3662,12 @@
         <w:tc>
           <w:tcPr>
             <w:tcW w:w="5238" w:type="dxa"/>
-            <w:tcBorders/>
+            <w:tcBorders>
+              <w:top w:val="single" w:sz="4" w:space="0" w:color="000000"/>
+              <w:start w:val="single" w:sz="4" w:space="0" w:color="000000"/>
+              <w:bottom w:val="single" w:sz="4" w:space="0" w:color="000000"/>
+              <w:end w:val="single" w:sz="4" w:space="0" w:color="000000"/>
+            </w:tcBorders>
           </w:tcPr>
           <w:p>
             <w:pPr>
@@ -3774,6 +3732,7 @@
     <w:p>
       <w:pPr>
         <w:pStyle w:val="Heading3"/>
+        <w:ind w:hanging="0" w:start="0"/>
         <w:rPr/>
       </w:pPr>
       <w:bookmarkStart w:id="11" w:name="_Toc150275678"/>
@@ -3825,7 +3784,7 @@
         <mc:AlternateContent>
           <mc:Choice Requires="wpg">
             <w:drawing>
-              <wp:anchor distT="5715" distB="5080" distL="5080" distR="635" simplePos="0" relativeHeight="10" behindDoc="0" locked="0" layoutInCell="1" allowOverlap="1" wp14:anchorId="5060F161">
+              <wp:anchor distT="5715" distB="5080" distL="5080" distR="635" simplePos="0" relativeHeight="10" behindDoc="0" locked="0" layoutInCell="1" allowOverlap="1">
                 <wp:simplePos x="0" y="0"/>
                 <wp:positionH relativeFrom="column">
                   <wp:posOffset>217170</wp:posOffset>
@@ -3834,7 +3793,7 @@
                   <wp:posOffset>102870</wp:posOffset>
                 </wp:positionV>
                 <wp:extent cx="3003550" cy="685800"/>
-                <wp:effectExtent l="5080" t="5715" r="635" b="5080"/>
+                <wp:effectExtent l="5080" t="5715" r="0" b="5080"/>
                 <wp:wrapNone/>
                 <wp:docPr id="7" name="Ryhmä 6"/>
                 <a:graphic xmlns:a="http://schemas.openxmlformats.org/drawingml/2006/main">
@@ -3854,7 +3813,7 @@
                         <wpg:grpSpPr>
                           <a:xfrm>
                             <a:off x="723960" y="0"/>
-                            <a:ext cx="903600" cy="685800"/>
+                            <a:ext cx="902880" cy="685800"/>
                           </a:xfrm>
                         </wpg:grpSpPr>
                         <wps:wsp>
@@ -3863,7 +3822,7 @@
                           <wps:spPr>
                             <a:xfrm>
                               <a:off x="0" y="0"/>
-                              <a:ext cx="903600" cy="684360"/>
+                              <a:ext cx="902880" cy="684000"/>
                             </a:xfrm>
                             <a:prstGeom prst="rect">
                               <a:avLst/>
@@ -3871,7 +3830,7 @@
                             <a:solidFill>
                               <a:srgbClr val="FFFFFF"/>
                             </a:solidFill>
-                            <a:ln w="9525">
+                            <a:ln w="9360">
                               <a:solidFill>
                                 <a:srgbClr val="000000"/>
                               </a:solidFill>
@@ -3896,7 +3855,7 @@
                             <a:prstGeom prst="line">
                               <a:avLst/>
                             </a:prstGeom>
-                            <a:ln w="9525">
+                            <a:ln w="9360">
                               <a:solidFill>
                                 <a:srgbClr val="000000"/>
                               </a:solidFill>
@@ -3915,13 +3874,13 @@
                           <wps:cNvSpPr/>
                           <wps:spPr>
                             <a:xfrm>
-                              <a:off x="361800" y="720"/>
+                              <a:off x="361080" y="720"/>
                               <a:ext cx="720" cy="685080"/>
                             </a:xfrm>
                             <a:prstGeom prst="line">
                               <a:avLst/>
                             </a:prstGeom>
-                            <a:ln w="9525">
+                            <a:ln w="9360">
                               <a:solidFill>
                                 <a:srgbClr val="000000"/>
                               </a:solidFill>
@@ -3946,7 +3905,7 @@
                             <a:prstGeom prst="line">
                               <a:avLst/>
                             </a:prstGeom>
-                            <a:ln w="9525">
+                            <a:ln w="9360">
                               <a:solidFill>
                                 <a:srgbClr val="000000"/>
                               </a:solidFill>
@@ -3971,7 +3930,7 @@
                             <a:prstGeom prst="line">
                               <a:avLst/>
                             </a:prstGeom>
-                            <a:ln w="9525">
+                            <a:ln w="9360">
                               <a:solidFill>
                                 <a:srgbClr val="000000"/>
                               </a:solidFill>
@@ -3993,7 +3952,7 @@
                         <wps:spPr>
                           <a:xfrm>
                             <a:off x="1665000" y="0"/>
-                            <a:ext cx="722520" cy="684360"/>
+                            <a:ext cx="722160" cy="684000"/>
                           </a:xfrm>
                           <a:prstGeom prst="ellipse">
                             <a:avLst/>
@@ -4001,7 +3960,7 @@
                           <a:solidFill>
                             <a:srgbClr val="FFFFFF"/>
                           </a:solidFill>
-                          <a:ln w="9525">
+                          <a:ln w="9360">
                             <a:solidFill>
                               <a:srgbClr val="000000"/>
                             </a:solidFill>
@@ -4020,13 +3979,13 @@
                         <wps:cNvSpPr/>
                         <wps:spPr>
                           <a:xfrm>
-                            <a:off x="0" y="342360"/>
+                            <a:off x="0" y="343080"/>
                             <a:ext cx="723240" cy="720"/>
                           </a:xfrm>
                           <a:prstGeom prst="line">
                             <a:avLst/>
                           </a:prstGeom>
-                          <a:ln w="9525">
+                          <a:ln w="9360">
                             <a:solidFill>
                               <a:srgbClr val="000000"/>
                             </a:solidFill>
@@ -4046,13 +4005,13 @@
                         <wps:cNvSpPr/>
                         <wps:spPr>
                           <a:xfrm>
-                            <a:off x="2388240" y="342360"/>
+                            <a:off x="2388240" y="343080"/>
                             <a:ext cx="615240" cy="720"/>
                           </a:xfrm>
                           <a:prstGeom prst="line">
                             <a:avLst/>
                           </a:prstGeom>
-                          <a:ln w="9525">
+                          <a:ln w="9360">
                             <a:solidFill>
                               <a:srgbClr val="000000"/>
                             </a:solidFill>
@@ -4077,8 +4036,8 @@
           <mc:Fallback>
             <w:pict>
               <v:group id="shape_0" alt="Ryhmä 6" style="position:absolute;margin-left:17.1pt;margin-top:8.1pt;width:236.45pt;height:53.95pt" coordorigin="342,162" coordsize="4729,1079">
-                <v:group id="shape_0" style="position:absolute;left:1482;top:162;width:1423;height:1079">
-                  <v:rect id="shape_0" fillcolor="white" stroked="t" o:allowincell="f" style="position:absolute;left:1482;top:162;width:1422;height:1077;mso-wrap-style:none;v-text-anchor:middle">
+                <v:group id="shape_0" style="position:absolute;left:1482;top:162;width:1422;height:1079">
+                  <v:rect id="shape_0" fillcolor="white" stroked="t" o:allowincell="f" style="position:absolute;left:1482;top:162;width:1421;height:1076;mso-wrap-style:none;v-text-anchor:middle">
                     <v:fill o:detectmouseclick="t" type="solid" color2="black"/>
                     <v:stroke color="black" weight="9360" joinstyle="miter" endcap="flat"/>
                     <w10:wrap type="none"/>
@@ -4088,7 +4047,7 @@
                     <v:fill o:detectmouseclick="t" on="false"/>
                     <w10:wrap type="none"/>
                   </v:line>
-                  <v:line id="shape_0" from="2052,163" to="2052,1241" stroked="t" o:allowincell="f" style="position:absolute">
+                  <v:line id="shape_0" from="2051,163" to="2051,1241" stroked="t" o:allowincell="f" style="position:absolute">
                     <v:stroke color="black" weight="9360" joinstyle="round" endcap="flat"/>
                     <v:fill o:detectmouseclick="t" on="false"/>
                     <w10:wrap type="none"/>
@@ -4104,17 +4063,17 @@
                     <w10:wrap type="none"/>
                   </v:line>
                 </v:group>
-                <v:oval id="shape_0" fillcolor="white" stroked="t" o:allowincell="f" style="position:absolute;left:2964;top:162;width:1137;height:1077;mso-wrap-style:none;v-text-anchor:middle">
+                <v:oval id="shape_0" fillcolor="white" stroked="t" o:allowincell="f" style="position:absolute;left:2964;top:162;width:1136;height:1076;mso-wrap-style:none;v-text-anchor:middle">
                   <v:fill o:detectmouseclick="t" type="solid" color2="black"/>
                   <v:stroke color="black" weight="9360" joinstyle="round" endcap="flat"/>
                   <w10:wrap type="none"/>
                 </v:oval>
-                <v:line id="shape_0" from="342,701" to="1480,701" stroked="t" o:allowincell="f" style="position:absolute">
+                <v:line id="shape_0" from="342,702" to="1480,702" stroked="t" o:allowincell="f" style="position:absolute">
                   <v:stroke color="black" weight="9360" endarrow="block" endarrowwidth="medium" endarrowlength="medium" joinstyle="round" endcap="flat"/>
                   <v:fill o:detectmouseclick="t" on="false"/>
                   <w10:wrap type="none"/>
                 </v:line>
-                <v:line id="shape_0" from="4103,701" to="5071,701" stroked="t" o:allowincell="f" style="position:absolute">
+                <v:line id="shape_0" from="4103,702" to="5071,702" stroked="t" o:allowincell="f" style="position:absolute">
                   <v:stroke color="black" weight="9360" endarrow="block" endarrowwidth="medium" endarrowlength="medium" joinstyle="round" endcap="flat"/>
                   <v:fill o:detectmouseclick="t" on="false"/>
                   <w10:wrap type="none"/>
@@ -4281,13 +4240,13 @@
         <w:spacing w:lineRule="auto" w:line="240"/>
         <w:jc w:val="start"/>
         <w:rPr>
-          <w:rFonts w:eastAsia="Calibri" w:eastAsiaTheme="minorHAnsi"/>
-          <w:lang w:val="en-GB"/>
-        </w:rPr>
-      </w:pPr>
-      <w:r>
-        <w:rPr>
-          <w:rFonts w:eastAsia="Calibri" w:eastAsiaTheme="minorHAnsi"/>
+          <w:rFonts w:eastAsia="Calibri"/>
+          <w:lang w:val="en-GB"/>
+        </w:rPr>
+      </w:pPr>
+      <w:r>
+        <w:rPr>
+          <w:rFonts w:eastAsia="Calibri"/>
           <w:lang w:val="en-GB"/>
         </w:rPr>
       </w:r>
@@ -4301,14 +4260,14 @@
         <w:spacing w:before="0" w:after="480"/>
         <w:ind w:hanging="431" w:start="431"/>
         <w:rPr>
-          <w:rFonts w:eastAsia="Calibri" w:eastAsiaTheme="minorHAnsi"/>
+          <w:rFonts w:eastAsia="Calibri"/>
           <w:lang w:val="en-GB"/>
         </w:rPr>
       </w:pPr>
       <w:bookmarkStart w:id="12" w:name="_Toc150275679"/>
       <w:r>
         <w:rPr>
-          <w:rFonts w:eastAsia="Calibri" w:eastAsiaTheme="minorHAnsi"/>
+          <w:rFonts w:eastAsia="Calibri"/>
           <w:lang w:val="en-GB"/>
         </w:rPr>
         <w:t>Programming implementation of the model</w:t>
@@ -4318,6 +4277,7 @@
     <w:p>
       <w:pPr>
         <w:pStyle w:val="Heading2"/>
+        <w:ind w:hanging="0" w:start="0"/>
         <w:rPr>
           <w:lang w:val="en-GB"/>
         </w:rPr>
@@ -4362,6 +4322,7 @@
     <w:p>
       <w:pPr>
         <w:pStyle w:val="Heading2"/>
+        <w:ind w:hanging="0" w:start="0"/>
         <w:rPr/>
       </w:pPr>
       <w:bookmarkStart w:id="14" w:name="_Toc150275681"/>
@@ -4389,6 +4350,7 @@
     <w:p>
       <w:pPr>
         <w:pStyle w:val="Heading2"/>
+        <w:ind w:hanging="0" w:start="0"/>
         <w:rPr>
           <w:lang w:val="en-GB"/>
         </w:rPr>
@@ -4420,6 +4382,7 @@
     <w:p>
       <w:pPr>
         <w:pStyle w:val="Heading2"/>
+        <w:ind w:hanging="0" w:start="0"/>
         <w:rPr>
           <w:lang w:val="en-GB"/>
         </w:rPr>
@@ -4451,6 +4414,7 @@
     <w:p>
       <w:pPr>
         <w:pStyle w:val="Heading2"/>
+        <w:ind w:hanging="0" w:start="0"/>
         <w:rPr>
           <w:lang w:val="en-GB"/>
         </w:rPr>
@@ -4467,6 +4431,7 @@
     <w:p>
       <w:pPr>
         <w:pStyle w:val="Heading2"/>
+        <w:ind w:hanging="0" w:start="0"/>
         <w:rPr/>
       </w:pPr>
       <w:bookmarkStart w:id="18" w:name="_Toc150275685"/>
@@ -4616,12 +4581,10 @@
       <w:bookmarkEnd w:id="21"/>
     </w:p>
     <w:sectPr>
-      <w:headerReference w:type="even" r:id="rId18"/>
-      <w:headerReference w:type="default" r:id="rId19"/>
-      <w:headerReference w:type="first" r:id="rId20"/>
-      <w:footerReference w:type="even" r:id="rId21"/>
-      <w:footerReference w:type="default" r:id="rId22"/>
-      <w:footerReference w:type="first" r:id="rId23"/>
+      <w:headerReference w:type="default" r:id="rId12"/>
+      <w:headerReference w:type="first" r:id="rId13"/>
+      <w:footerReference w:type="default" r:id="rId14"/>
+      <w:footerReference w:type="first" r:id="rId15"/>
       <w:type w:val="nextPage"/>
       <w:pgSz w:w="11906" w:h="16838"/>
       <w:pgMar w:left="2268" w:right="1134" w:gutter="0" w:header="567" w:top="1418" w:footer="567" w:bottom="1701"/>
@@ -4664,15 +4627,7 @@
 
 <file path=word/footer3.xml><?xml version="1.0" encoding="utf-8"?>
 <w:ftr xmlns:o="urn:schemas-microsoft-com:office:office" xmlns:r="http://schemas.openxmlformats.org/officeDocument/2006/relationships" xmlns:v="urn:schemas-microsoft-com:vml" xmlns:w="http://schemas.openxmlformats.org/wordprocessingml/2006/main" xmlns:w10="urn:schemas-microsoft-com:office:word" xmlns:wp="http://schemas.openxmlformats.org/drawingml/2006/wordprocessingDrawing" xmlns:pic="http://schemas.openxmlformats.org/drawingml/2006/picture" xmlns:wps="http://schemas.microsoft.com/office/word/2010/wordprocessingShape" xmlns:wpg="http://schemas.microsoft.com/office/word/2010/wordprocessingGroup" xmlns:mc="http://schemas.openxmlformats.org/markup-compatibility/2006" xmlns:wp14="http://schemas.microsoft.com/office/word/2010/wordprocessingDrawing" xmlns:w14="http://schemas.microsoft.com/office/word/2010/wordml" xmlns:w15="http://schemas.microsoft.com/office/word/2012/wordml" mc:Ignorable="w14 wp14 w15">
-  <w:p>
-    <w:pPr>
-      <w:pStyle w:val="Footer"/>
-      <w:rPr/>
-    </w:pPr>
-    <w:r>
-      <w:rPr/>
-    </w:r>
-  </w:p>
+  <w:p/>
 </w:ftr>
 </file>
 
@@ -4692,71 +4647,7 @@
 
 <file path=word/footer5.xml><?xml version="1.0" encoding="utf-8"?>
 <w:ftr xmlns:o="urn:schemas-microsoft-com:office:office" xmlns:r="http://schemas.openxmlformats.org/officeDocument/2006/relationships" xmlns:v="urn:schemas-microsoft-com:vml" xmlns:w="http://schemas.openxmlformats.org/wordprocessingml/2006/main" xmlns:w10="urn:schemas-microsoft-com:office:word" xmlns:wp="http://schemas.openxmlformats.org/drawingml/2006/wordprocessingDrawing" xmlns:pic="http://schemas.openxmlformats.org/drawingml/2006/picture" xmlns:wps="http://schemas.microsoft.com/office/word/2010/wordprocessingShape" xmlns:wpg="http://schemas.microsoft.com/office/word/2010/wordprocessingGroup" xmlns:mc="http://schemas.openxmlformats.org/markup-compatibility/2006" xmlns:wp14="http://schemas.microsoft.com/office/word/2010/wordprocessingDrawing" xmlns:w14="http://schemas.microsoft.com/office/word/2010/wordml" xmlns:w15="http://schemas.microsoft.com/office/word/2012/wordml" mc:Ignorable="w14 wp14 w15">
-  <w:p>
-    <w:pPr>
-      <w:pStyle w:val="Footer"/>
-      <w:rPr/>
-    </w:pPr>
-    <w:r>
-      <w:rPr/>
-    </w:r>
-  </w:p>
-</w:ftr>
-</file>
-
-<file path=word/footer6.xml><?xml version="1.0" encoding="utf-8"?>
-<w:ftr xmlns:o="urn:schemas-microsoft-com:office:office" xmlns:r="http://schemas.openxmlformats.org/officeDocument/2006/relationships" xmlns:v="urn:schemas-microsoft-com:vml" xmlns:w="http://schemas.openxmlformats.org/wordprocessingml/2006/main" xmlns:w10="urn:schemas-microsoft-com:office:word" xmlns:wp="http://schemas.openxmlformats.org/drawingml/2006/wordprocessingDrawing" xmlns:pic="http://schemas.openxmlformats.org/drawingml/2006/picture" xmlns:wps="http://schemas.microsoft.com/office/word/2010/wordprocessingShape" xmlns:wpg="http://schemas.microsoft.com/office/word/2010/wordprocessingGroup" xmlns:mc="http://schemas.openxmlformats.org/markup-compatibility/2006" xmlns:wp14="http://schemas.microsoft.com/office/word/2010/wordprocessingDrawing" xmlns:w14="http://schemas.microsoft.com/office/word/2010/wordml" xmlns:w15="http://schemas.microsoft.com/office/word/2012/wordml" mc:Ignorable="w14 wp14 w15">
-  <w:p>
-    <w:pPr>
-      <w:pStyle w:val="Footer"/>
-      <w:rPr/>
-    </w:pPr>
-    <w:r>
-      <w:rPr/>
-    </w:r>
-  </w:p>
-</w:ftr>
-</file>
-
-<file path=word/footer7.xml><?xml version="1.0" encoding="utf-8"?>
-<w:ftr xmlns:o="urn:schemas-microsoft-com:office:office" xmlns:r="http://schemas.openxmlformats.org/officeDocument/2006/relationships" xmlns:v="urn:schemas-microsoft-com:vml" xmlns:w="http://schemas.openxmlformats.org/wordprocessingml/2006/main" xmlns:w10="urn:schemas-microsoft-com:office:word" xmlns:wp="http://schemas.openxmlformats.org/drawingml/2006/wordprocessingDrawing" xmlns:pic="http://schemas.openxmlformats.org/drawingml/2006/picture" xmlns:wps="http://schemas.microsoft.com/office/word/2010/wordprocessingShape" xmlns:wpg="http://schemas.microsoft.com/office/word/2010/wordprocessingGroup" xmlns:mc="http://schemas.openxmlformats.org/markup-compatibility/2006" xmlns:wp14="http://schemas.microsoft.com/office/word/2010/wordprocessingDrawing" xmlns:w14="http://schemas.microsoft.com/office/word/2010/wordml" xmlns:w15="http://schemas.microsoft.com/office/word/2012/wordml" mc:Ignorable="w14 wp14 w15">
-  <w:p>
-    <w:pPr>
-      <w:pStyle w:val="Footer"/>
-      <w:rPr/>
-    </w:pPr>
-    <w:r>
-      <w:rPr/>
-    </w:r>
-  </w:p>
-</w:ftr>
-</file>
-
-<file path=word/footer8.xml><?xml version="1.0" encoding="utf-8"?>
-<w:ftr xmlns:o="urn:schemas-microsoft-com:office:office" xmlns:r="http://schemas.openxmlformats.org/officeDocument/2006/relationships" xmlns:v="urn:schemas-microsoft-com:vml" xmlns:w="http://schemas.openxmlformats.org/wordprocessingml/2006/main" xmlns:w10="urn:schemas-microsoft-com:office:word" xmlns:wp="http://schemas.openxmlformats.org/drawingml/2006/wordprocessingDrawing" xmlns:pic="http://schemas.openxmlformats.org/drawingml/2006/picture" xmlns:wps="http://schemas.microsoft.com/office/word/2010/wordprocessingShape" xmlns:wpg="http://schemas.microsoft.com/office/word/2010/wordprocessingGroup" xmlns:mc="http://schemas.openxmlformats.org/markup-compatibility/2006" xmlns:wp14="http://schemas.microsoft.com/office/word/2010/wordprocessingDrawing" xmlns:w14="http://schemas.microsoft.com/office/word/2010/wordml" xmlns:w15="http://schemas.microsoft.com/office/word/2012/wordml" mc:Ignorable="w14 wp14 w15">
-  <w:p>
-    <w:pPr>
-      <w:pStyle w:val="Footer"/>
-      <w:rPr/>
-    </w:pPr>
-    <w:r>
-      <w:rPr/>
-    </w:r>
-  </w:p>
-</w:ftr>
-</file>
-
-<file path=word/footer9.xml><?xml version="1.0" encoding="utf-8"?>
-<w:ftr xmlns:o="urn:schemas-microsoft-com:office:office" xmlns:r="http://schemas.openxmlformats.org/officeDocument/2006/relationships" xmlns:v="urn:schemas-microsoft-com:vml" xmlns:w="http://schemas.openxmlformats.org/wordprocessingml/2006/main" xmlns:w10="urn:schemas-microsoft-com:office:word" xmlns:wp="http://schemas.openxmlformats.org/drawingml/2006/wordprocessingDrawing" xmlns:pic="http://schemas.openxmlformats.org/drawingml/2006/picture" xmlns:wps="http://schemas.microsoft.com/office/word/2010/wordprocessingShape" xmlns:wpg="http://schemas.microsoft.com/office/word/2010/wordprocessingGroup" xmlns:mc="http://schemas.openxmlformats.org/markup-compatibility/2006" xmlns:wp14="http://schemas.microsoft.com/office/word/2010/wordprocessingDrawing" xmlns:w14="http://schemas.microsoft.com/office/word/2010/wordml" xmlns:w15="http://schemas.microsoft.com/office/word/2012/wordml" mc:Ignorable="w14 wp14 w15">
-  <w:p>
-    <w:pPr>
-      <w:pStyle w:val="Footer"/>
-      <w:rPr/>
-    </w:pPr>
-    <w:r>
-      <w:rPr/>
-    </w:r>
-  </w:p>
+  <w:p/>
 </w:ftr>
 </file>
 
@@ -4779,6 +4670,7 @@
   <w:p>
     <w:pPr>
       <w:pStyle w:val="Header"/>
+      <w:jc w:val="end"/>
       <w:rPr/>
     </w:pPr>
     <w:r>
@@ -4790,33 +4682,11 @@
 
 <file path=word/header3.xml><?xml version="1.0" encoding="utf-8"?>
 <w:hdr xmlns:o="urn:schemas-microsoft-com:office:office" xmlns:r="http://schemas.openxmlformats.org/officeDocument/2006/relationships" xmlns:v="urn:schemas-microsoft-com:vml" xmlns:w="http://schemas.openxmlformats.org/wordprocessingml/2006/main" xmlns:w10="urn:schemas-microsoft-com:office:word" xmlns:wp="http://schemas.openxmlformats.org/drawingml/2006/wordprocessingDrawing" xmlns:pic="http://schemas.openxmlformats.org/drawingml/2006/picture" xmlns:wps="http://schemas.microsoft.com/office/word/2010/wordprocessingShape" xmlns:wpg="http://schemas.microsoft.com/office/word/2010/wordprocessingGroup" xmlns:mc="http://schemas.openxmlformats.org/markup-compatibility/2006" xmlns:wp14="http://schemas.microsoft.com/office/word/2010/wordprocessingDrawing" xmlns:w14="http://schemas.microsoft.com/office/word/2010/wordml" xmlns:w15="http://schemas.microsoft.com/office/word/2012/wordml" mc:Ignorable="w14 wp14 w15">
-  <w:p>
-    <w:pPr>
-      <w:pStyle w:val="Header"/>
-      <w:rPr/>
-    </w:pPr>
-    <w:r>
-      <w:rPr/>
-    </w:r>
-  </w:p>
+  <w:p/>
 </w:hdr>
 </file>
 
 <file path=word/header4.xml><?xml version="1.0" encoding="utf-8"?>
-<w:hdr xmlns:o="urn:schemas-microsoft-com:office:office" xmlns:r="http://schemas.openxmlformats.org/officeDocument/2006/relationships" xmlns:v="urn:schemas-microsoft-com:vml" xmlns:w="http://schemas.openxmlformats.org/wordprocessingml/2006/main" xmlns:w10="urn:schemas-microsoft-com:office:word" xmlns:wp="http://schemas.openxmlformats.org/drawingml/2006/wordprocessingDrawing" xmlns:pic="http://schemas.openxmlformats.org/drawingml/2006/picture" xmlns:wps="http://schemas.microsoft.com/office/word/2010/wordprocessingShape" xmlns:wpg="http://schemas.microsoft.com/office/word/2010/wordprocessingGroup" xmlns:mc="http://schemas.openxmlformats.org/markup-compatibility/2006" xmlns:wp14="http://schemas.microsoft.com/office/word/2010/wordprocessingDrawing" xmlns:w14="http://schemas.microsoft.com/office/word/2010/wordml" xmlns:w15="http://schemas.microsoft.com/office/word/2012/wordml" mc:Ignorable="w14 wp14 w15">
-  <w:p>
-    <w:pPr>
-      <w:pStyle w:val="Header"/>
-      <w:rPr/>
-    </w:pPr>
-    <w:r>
-      <w:rPr/>
-    </w:r>
-  </w:p>
-</w:hdr>
-</file>
-
-<file path=word/header5.xml><?xml version="1.0" encoding="utf-8"?>
 <w:hdr xmlns:o="urn:schemas-microsoft-com:office:office" xmlns:r="http://schemas.openxmlformats.org/officeDocument/2006/relationships" xmlns:v="urn:schemas-microsoft-com:vml" xmlns:w="http://schemas.openxmlformats.org/wordprocessingml/2006/main" xmlns:w10="urn:schemas-microsoft-com:office:word" xmlns:wp="http://schemas.openxmlformats.org/drawingml/2006/wordprocessingDrawing" xmlns:pic="http://schemas.openxmlformats.org/drawingml/2006/picture" xmlns:wps="http://schemas.microsoft.com/office/word/2010/wordprocessingShape" xmlns:wpg="http://schemas.microsoft.com/office/word/2010/wordprocessingGroup" xmlns:mc="http://schemas.openxmlformats.org/markup-compatibility/2006" xmlns:wp14="http://schemas.microsoft.com/office/word/2010/wordprocessingDrawing" xmlns:w14="http://schemas.microsoft.com/office/word/2010/wordml" xmlns:w15="http://schemas.microsoft.com/office/word/2012/wordml" mc:Ignorable="w14 wp14 w15">
   <w:p>
     <w:pPr>
@@ -4828,130 +4698,75 @@
       <w:rPr/>
     </w:r>
   </w:p>
-</w:hdr>
-</file>
-
-<file path=word/header6.xml><?xml version="1.0" encoding="utf-8"?>
-<w:hdr xmlns:o="urn:schemas-microsoft-com:office:office" xmlns:r="http://schemas.openxmlformats.org/officeDocument/2006/relationships" xmlns:v="urn:schemas-microsoft-com:vml" xmlns:w="http://schemas.openxmlformats.org/wordprocessingml/2006/main" xmlns:w10="urn:schemas-microsoft-com:office:word" xmlns:wp="http://schemas.openxmlformats.org/drawingml/2006/wordprocessingDrawing" xmlns:pic="http://schemas.openxmlformats.org/drawingml/2006/picture" xmlns:wps="http://schemas.microsoft.com/office/word/2010/wordprocessingShape" xmlns:wpg="http://schemas.microsoft.com/office/word/2010/wordprocessingGroup" xmlns:mc="http://schemas.openxmlformats.org/markup-compatibility/2006" xmlns:wp14="http://schemas.microsoft.com/office/word/2010/wordprocessingDrawing" xmlns:w14="http://schemas.microsoft.com/office/word/2010/wordml" xmlns:w15="http://schemas.microsoft.com/office/word/2012/wordml" mc:Ignorable="w14 wp14 w15">
   <w:p>
     <w:pPr>
       <w:pStyle w:val="Header"/>
-      <w:jc w:val="end"/>
+      <w:tabs>
+        <w:tab w:val="left" w:pos="7797" w:leader="none"/>
+        <w:tab w:val="right" w:pos="8505" w:leader="none"/>
+      </w:tabs>
+      <w:jc w:val="center"/>
       <w:rPr/>
     </w:pPr>
     <w:r>
       <w:rPr/>
+      <w:tab/>
+      <w:tab/>
     </w:r>
-  </w:p>
-</w:hdr>
-</file>
-
-<file path=word/header7.xml><?xml version="1.0" encoding="utf-8"?>
-<w:hdr xmlns:o="urn:schemas-microsoft-com:office:office" xmlns:r="http://schemas.openxmlformats.org/officeDocument/2006/relationships" xmlns:v="urn:schemas-microsoft-com:vml" xmlns:w="http://schemas.openxmlformats.org/wordprocessingml/2006/main" xmlns:w10="urn:schemas-microsoft-com:office:word" xmlns:wp="http://schemas.openxmlformats.org/drawingml/2006/wordprocessingDrawing" xmlns:pic="http://schemas.openxmlformats.org/drawingml/2006/picture" xmlns:wps="http://schemas.microsoft.com/office/word/2010/wordprocessingShape" xmlns:wpg="http://schemas.microsoft.com/office/word/2010/wordprocessingGroup" xmlns:mc="http://schemas.openxmlformats.org/markup-compatibility/2006" xmlns:wp14="http://schemas.microsoft.com/office/word/2010/wordprocessingDrawing" xmlns:w14="http://schemas.microsoft.com/office/word/2010/wordml" xmlns:w15="http://schemas.microsoft.com/office/word/2012/wordml" mc:Ignorable="w14 wp14 w15">
-  <w:p>
-    <w:pPr>
-      <w:pStyle w:val="Header"/>
+    <w:r>
       <w:rPr/>
-    </w:pPr>
+      <w:fldChar w:fldCharType="begin"/>
+    </w:r>
+    <w:r>
+      <w:rPr/>
+      <w:instrText xml:space="preserve"> PAGE </w:instrText>
+    </w:r>
+    <w:r>
+      <w:rPr/>
+      <w:fldChar w:fldCharType="separate"/>
+    </w:r>
+    <w:r>
+      <w:rPr/>
+      <w:t>7</w:t>
+    </w:r>
+    <w:r>
+      <w:rPr/>
+      <w:fldChar w:fldCharType="end"/>
+    </w:r>
+    <w:r>
+      <w:rPr/>
+      <w:t xml:space="preserve"> (</w:t>
+    </w:r>
+    <w:r>
+      <w:fldChar w:fldCharType="begin"/>
+    </w:r>
+    <w:r>
+      <w:rPr/>
+      <w:instrText xml:space="preserve">SECTIONPAGES  \* Arabic  \* MERGEFORMAT</w:instrText>
+    </w:r>
     <w:r>
       <w:rPr/>
     </w:r>
+    <w:r>
+      <w:rPr/>
+      <w:fldChar w:fldCharType="separate"/>
+    </w:r>
+    <w:r>
+      <w:rPr/>
+      <w:t>5</w:t>
+    </w:r>
+    <w:r>
+      <w:rPr/>
+    </w:r>
+    <w:r>
+      <w:rPr/>
+      <w:fldChar w:fldCharType="end"/>
+    </w:r>
+    <w:r>
+      <w:rPr/>
+      <w:t>)</w:t>
+    </w:r>
   </w:p>
-</w:hdr>
-</file>
-
-<file path=word/header8.xml><?xml version="1.0" encoding="utf-8"?>
-<w:hdr xmlns:o="urn:schemas-microsoft-com:office:office" xmlns:r="http://schemas.openxmlformats.org/officeDocument/2006/relationships" xmlns:v="urn:schemas-microsoft-com:vml" xmlns:w="http://schemas.openxmlformats.org/wordprocessingml/2006/main" xmlns:w10="urn:schemas-microsoft-com:office:word" xmlns:wp="http://schemas.openxmlformats.org/drawingml/2006/wordprocessingDrawing" xmlns:pic="http://schemas.openxmlformats.org/drawingml/2006/picture" xmlns:wps="http://schemas.microsoft.com/office/word/2010/wordprocessingShape" xmlns:wpg="http://schemas.microsoft.com/office/word/2010/wordprocessingGroup" xmlns:mc="http://schemas.openxmlformats.org/markup-compatibility/2006" xmlns:wp14="http://schemas.microsoft.com/office/word/2010/wordprocessingDrawing" xmlns:w14="http://schemas.microsoft.com/office/word/2010/wordml" xmlns:w15="http://schemas.microsoft.com/office/word/2012/wordml" mc:Ignorable="w14 wp14 w15">
-  <w:sdt>
-    <w:sdtPr>
-      <w:id w:val="1712685909"/>
-      <w:docPartObj>
-        <w:docPartGallery w:val="Page Numbers (Top of Page)"/>
-        <w:docPartUnique w:val="true"/>
-      </w:docPartObj>
-    </w:sdtPr>
-    <w:sdtContent>
-      <w:p>
-        <w:pPr>
-          <w:pStyle w:val="Header"/>
-          <w:jc w:val="end"/>
-          <w:rPr/>
-        </w:pPr>
-        <w:r>
-          <w:rPr/>
-        </w:r>
-      </w:p>
-      <w:p>
-        <w:pPr>
-          <w:pStyle w:val="Header"/>
-          <w:tabs>
-            <w:tab w:val="left" w:pos="7797" w:leader="none"/>
-            <w:tab w:val="right" w:pos="8505" w:leader="none"/>
-          </w:tabs>
-          <w:jc w:val="center"/>
-          <w:rPr/>
-        </w:pPr>
-        <w:r>
-          <w:rPr/>
-          <w:tab/>
-          <w:tab/>
-        </w:r>
-        <w:r>
-          <w:rPr/>
-          <w:fldChar w:fldCharType="begin"/>
-        </w:r>
-        <w:r>
-          <w:rPr/>
-          <w:instrText xml:space="preserve"> PAGE </w:instrText>
-        </w:r>
-        <w:r>
-          <w:rPr/>
-          <w:fldChar w:fldCharType="separate"/>
-        </w:r>
-        <w:r>
-          <w:rPr/>
-          <w:t>6</w:t>
-        </w:r>
-        <w:r>
-          <w:rPr/>
-          <w:fldChar w:fldCharType="end"/>
-        </w:r>
-        <w:r>
-          <w:rPr/>
-          <w:t xml:space="preserve"> (</w:t>
-        </w:r>
-        <w:r>
-          <w:fldChar w:fldCharType="begin"/>
-        </w:r>
-        <w:r>
-          <w:rPr/>
-          <w:instrText xml:space="preserve">SECTIONPAGES  \* Arabic  \* MERGEFORMAT</w:instrText>
-        </w:r>
-        <w:r>
-          <w:rPr/>
-        </w:r>
-        <w:r>
-          <w:rPr/>
-          <w:fldChar w:fldCharType="separate"/>
-        </w:r>
-        <w:r>
-          <w:rPr/>
-          <w:t>5</w:t>
-        </w:r>
-        <w:r>
-          <w:rPr/>
-        </w:r>
-        <w:r>
-          <w:rPr/>
-          <w:fldChar w:fldCharType="end"/>
-        </w:r>
-        <w:r>
-          <w:rPr/>
-          <w:t>)</w:t>
-        </w:r>
-      </w:p>
-    </w:sdtContent>
-  </w:sdt>
   <w:p>
     <w:pPr>
       <w:pStyle w:val="Header"/>
@@ -4975,118 +4790,9 @@
 </w:hdr>
 </file>
 
-<file path=word/header9.xml><?xml version="1.0" encoding="utf-8"?>
+<file path=word/header5.xml><?xml version="1.0" encoding="utf-8"?>
 <w:hdr xmlns:o="urn:schemas-microsoft-com:office:office" xmlns:r="http://schemas.openxmlformats.org/officeDocument/2006/relationships" xmlns:v="urn:schemas-microsoft-com:vml" xmlns:w="http://schemas.openxmlformats.org/wordprocessingml/2006/main" xmlns:w10="urn:schemas-microsoft-com:office:word" xmlns:wp="http://schemas.openxmlformats.org/drawingml/2006/wordprocessingDrawing" xmlns:pic="http://schemas.openxmlformats.org/drawingml/2006/picture" xmlns:wps="http://schemas.microsoft.com/office/word/2010/wordprocessingShape" xmlns:wpg="http://schemas.microsoft.com/office/word/2010/wordprocessingGroup" xmlns:mc="http://schemas.openxmlformats.org/markup-compatibility/2006" xmlns:wp14="http://schemas.microsoft.com/office/word/2010/wordprocessingDrawing" xmlns:w14="http://schemas.microsoft.com/office/word/2010/wordml" xmlns:w15="http://schemas.microsoft.com/office/word/2012/wordml" mc:Ignorable="w14 wp14 w15">
-  <w:sdt>
-    <w:sdtPr>
-      <w:id w:val="1712685909"/>
-      <w:docPartObj>
-        <w:docPartGallery w:val="Page Numbers (Top of Page)"/>
-        <w:docPartUnique w:val="true"/>
-      </w:docPartObj>
-    </w:sdtPr>
-    <w:sdtContent>
-      <w:p>
-        <w:pPr>
-          <w:pStyle w:val="Header"/>
-          <w:jc w:val="end"/>
-          <w:rPr/>
-        </w:pPr>
-        <w:r>
-          <w:rPr/>
-        </w:r>
-      </w:p>
-      <w:p>
-        <w:pPr>
-          <w:pStyle w:val="Header"/>
-          <w:tabs>
-            <w:tab w:val="left" w:pos="7797" w:leader="none"/>
-            <w:tab w:val="right" w:pos="8505" w:leader="none"/>
-          </w:tabs>
-          <w:jc w:val="center"/>
-          <w:rPr/>
-        </w:pPr>
-        <w:r>
-          <w:rPr/>
-          <w:tab/>
-          <w:tab/>
-        </w:r>
-        <w:r>
-          <w:rPr/>
-          <w:fldChar w:fldCharType="begin"/>
-        </w:r>
-        <w:r>
-          <w:rPr/>
-          <w:instrText xml:space="preserve"> PAGE </w:instrText>
-        </w:r>
-        <w:r>
-          <w:rPr/>
-          <w:fldChar w:fldCharType="separate"/>
-        </w:r>
-        <w:r>
-          <w:rPr/>
-          <w:t>6</w:t>
-        </w:r>
-        <w:r>
-          <w:rPr/>
-          <w:fldChar w:fldCharType="end"/>
-        </w:r>
-        <w:r>
-          <w:rPr/>
-          <w:t xml:space="preserve"> (</w:t>
-        </w:r>
-        <w:r>
-          <w:fldChar w:fldCharType="begin"/>
-        </w:r>
-        <w:r>
-          <w:rPr/>
-          <w:instrText xml:space="preserve">SECTIONPAGES  \* Arabic  \* MERGEFORMAT</w:instrText>
-        </w:r>
-        <w:r>
-          <w:rPr/>
-        </w:r>
-        <w:r>
-          <w:rPr/>
-          <w:fldChar w:fldCharType="separate"/>
-        </w:r>
-        <w:r>
-          <w:rPr/>
-          <w:t>5</w:t>
-        </w:r>
-        <w:r>
-          <w:rPr/>
-        </w:r>
-        <w:r>
-          <w:rPr/>
-          <w:fldChar w:fldCharType="end"/>
-        </w:r>
-        <w:r>
-          <w:rPr/>
-          <w:t>)</w:t>
-        </w:r>
-      </w:p>
-    </w:sdtContent>
-  </w:sdt>
-  <w:p>
-    <w:pPr>
-      <w:pStyle w:val="Header"/>
-      <w:tabs>
-        <w:tab w:val="clear" w:pos="4819"/>
-        <w:tab w:val="clear" w:pos="9638"/>
-        <w:tab w:val="left" w:pos="5216" w:leader="none"/>
-      </w:tabs>
-      <w:rPr>
-        <w:rFonts w:cs="Tahoma"/>
-        <w:szCs w:val="22"/>
-      </w:rPr>
-    </w:pPr>
-    <w:r>
-      <w:rPr>
-        <w:rFonts w:cs="Tahoma"/>
-        <w:szCs w:val="22"/>
-      </w:rPr>
-    </w:r>
-  </w:p>
+  <w:p/>
 </w:hdr>
 </file>
 
@@ -5612,382 +5318,15 @@
       </w:pPr>
     </w:pPrDefault>
   </w:docDefaults>
-  <w:latentStyles w:defLockedState="0" w:defUIPriority="0" w:defSemiHidden="0" w:defUnhideWhenUsed="0" w:defQFormat="0" w:count="376">
-    <w:lsdException w:name="Normal" w:qFormat="1"/>
-    <w:lsdException w:name="heading 1" w:uiPriority="9" w:qFormat="1"/>
-    <w:lsdException w:name="heading 2" w:uiPriority="9" w:semiHidden="1" w:unhideWhenUsed="1" w:qFormat="1"/>
-    <w:lsdException w:name="heading 3" w:uiPriority="9" w:semiHidden="1" w:unhideWhenUsed="1" w:qFormat="1"/>
-    <w:lsdException w:name="heading 4" w:uiPriority="9" w:semiHidden="1" w:unhideWhenUsed="1" w:qFormat="1"/>
-    <w:lsdException w:name="heading 5" w:uiPriority="9" w:semiHidden="1" w:unhideWhenUsed="1" w:qFormat="1"/>
-    <w:lsdException w:name="heading 6" w:uiPriority="9" w:semiHidden="1" w:unhideWhenUsed="1" w:qFormat="1"/>
-    <w:lsdException w:name="heading 7" w:uiPriority="9" w:semiHidden="1" w:unhideWhenUsed="1" w:qFormat="1"/>
-    <w:lsdException w:name="heading 8" w:uiPriority="9" w:semiHidden="1" w:unhideWhenUsed="1" w:qFormat="1"/>
-    <w:lsdException w:name="heading 9" w:uiPriority="9" w:semiHidden="1" w:unhideWhenUsed="1" w:qFormat="1"/>
-    <w:lsdException w:name="index 1" w:semiHidden="1" w:unhideWhenUsed="1"/>
-    <w:lsdException w:name="index 2" w:semiHidden="1" w:unhideWhenUsed="1"/>
-    <w:lsdException w:name="index 3" w:semiHidden="1" w:unhideWhenUsed="1"/>
-    <w:lsdException w:name="index 4" w:semiHidden="1" w:unhideWhenUsed="1"/>
-    <w:lsdException w:name="index 5" w:semiHidden="1" w:unhideWhenUsed="1"/>
-    <w:lsdException w:name="index 6" w:semiHidden="1" w:unhideWhenUsed="1"/>
-    <w:lsdException w:name="index 7" w:semiHidden="1" w:unhideWhenUsed="1"/>
-    <w:lsdException w:name="index 8" w:semiHidden="1" w:unhideWhenUsed="1"/>
-    <w:lsdException w:name="index 9" w:semiHidden="1" w:unhideWhenUsed="1"/>
-    <w:lsdException w:name="toc 1" w:uiPriority="39" w:semiHidden="1" w:unhideWhenUsed="1"/>
-    <w:lsdException w:name="toc 2" w:uiPriority="39" w:semiHidden="1" w:unhideWhenUsed="1"/>
-    <w:lsdException w:name="toc 3" w:uiPriority="39" w:semiHidden="1" w:unhideWhenUsed="1"/>
-    <w:lsdException w:name="toc 4" w:semiHidden="1" w:unhideWhenUsed="1"/>
-    <w:lsdException w:name="toc 5" w:semiHidden="1" w:unhideWhenUsed="1"/>
-    <w:lsdException w:name="toc 6" w:semiHidden="1" w:unhideWhenUsed="1"/>
-    <w:lsdException w:name="toc 7" w:semiHidden="1" w:unhideWhenUsed="1"/>
-    <w:lsdException w:name="toc 8" w:semiHidden="1" w:unhideWhenUsed="1"/>
-    <w:lsdException w:name="toc 9" w:semiHidden="1" w:unhideWhenUsed="1"/>
-    <w:lsdException w:name="Normal Indent" w:semiHidden="1" w:unhideWhenUsed="1"/>
-    <w:lsdException w:name="footnote text" w:semiHidden="1" w:unhideWhenUsed="1"/>
-    <w:lsdException w:name="annotation text" w:semiHidden="1" w:unhideWhenUsed="1"/>
-    <w:lsdException w:name="header" w:uiPriority="99" w:semiHidden="1" w:unhideWhenUsed="1"/>
-    <w:lsdException w:name="footer" w:uiPriority="99" w:semiHidden="1" w:unhideWhenUsed="1"/>
-    <w:lsdException w:name="index heading" w:semiHidden="1" w:unhideWhenUsed="1"/>
-    <w:lsdException w:name="caption" w:semiHidden="1" w:unhideWhenUsed="1" w:qFormat="1"/>
-    <w:lsdException w:name="table of figures" w:semiHidden="1" w:unhideWhenUsed="1"/>
-    <w:lsdException w:name="envelope address" w:semiHidden="1" w:unhideWhenUsed="1"/>
-    <w:lsdException w:name="envelope return" w:semiHidden="1" w:unhideWhenUsed="1"/>
-    <w:lsdException w:name="footnote reference" w:semiHidden="1" w:unhideWhenUsed="1"/>
-    <w:lsdException w:name="annotation reference" w:semiHidden="1" w:unhideWhenUsed="1"/>
-    <w:lsdException w:name="line number" w:semiHidden="1" w:unhideWhenUsed="1"/>
-    <w:lsdException w:name="page number" w:semiHidden="1" w:unhideWhenUsed="1"/>
-    <w:lsdException w:name="endnote reference" w:semiHidden="1" w:unhideWhenUsed="1"/>
-    <w:lsdException w:name="endnote text" w:semiHidden="1" w:unhideWhenUsed="1"/>
-    <w:lsdException w:name="table of authorities" w:semiHidden="1" w:unhideWhenUsed="1"/>
-    <w:lsdException w:name="macro" w:semiHidden="1" w:unhideWhenUsed="1"/>
-    <w:lsdException w:name="toa heading" w:semiHidden="1" w:unhideWhenUsed="1"/>
-    <w:lsdException w:name="List" w:semiHidden="1" w:unhideWhenUsed="1"/>
-    <w:lsdException w:name="List Bullet" w:semiHidden="1" w:unhideWhenUsed="1"/>
-    <w:lsdException w:name="List 2" w:semiHidden="1" w:unhideWhenUsed="1"/>
-    <w:lsdException w:name="List 3" w:semiHidden="1" w:unhideWhenUsed="1"/>
-    <w:lsdException w:name="List Bullet 2" w:semiHidden="1" w:unhideWhenUsed="1"/>
-    <w:lsdException w:name="List Bullet 3" w:semiHidden="1" w:unhideWhenUsed="1"/>
-    <w:lsdException w:name="List Bullet 4" w:semiHidden="1" w:unhideWhenUsed="1"/>
-    <w:lsdException w:name="List Bullet 5" w:semiHidden="1" w:unhideWhenUsed="1"/>
-    <w:lsdException w:name="List Number 2" w:semiHidden="1" w:unhideWhenUsed="1"/>
-    <w:lsdException w:name="List Number 3" w:semiHidden="1" w:unhideWhenUsed="1"/>
-    <w:lsdException w:name="List Number 4" w:semiHidden="1" w:unhideWhenUsed="1"/>
-    <w:lsdException w:name="List Number 5" w:semiHidden="1" w:unhideWhenUsed="1"/>
-    <w:lsdException w:name="Title" w:qFormat="1"/>
-    <w:lsdException w:name="Closing" w:semiHidden="1" w:unhideWhenUsed="1"/>
-    <w:lsdException w:name="Signature" w:semiHidden="1" w:unhideWhenUsed="1"/>
-    <w:lsdException w:name="Default Paragraph Font" w:semiHidden="1" w:unhideWhenUsed="1"/>
-    <w:lsdException w:name="Body Text" w:semiHidden="1" w:unhideWhenUsed="1"/>
-    <w:lsdException w:name="Body Text Indent" w:semiHidden="1" w:unhideWhenUsed="1"/>
-    <w:lsdException w:name="List Continue" w:semiHidden="1" w:unhideWhenUsed="1"/>
-    <w:lsdException w:name="List Continue 2" w:semiHidden="1" w:unhideWhenUsed="1"/>
-    <w:lsdException w:name="List Continue 3" w:semiHidden="1" w:unhideWhenUsed="1"/>
-    <w:lsdException w:name="List Continue 4" w:semiHidden="1" w:unhideWhenUsed="1"/>
-    <w:lsdException w:name="List Continue 5" w:semiHidden="1" w:unhideWhenUsed="1"/>
-    <w:lsdException w:name="Message Header" w:semiHidden="1" w:unhideWhenUsed="1"/>
-    <w:lsdException w:name="Body Text First Indent 2" w:semiHidden="1" w:unhideWhenUsed="1"/>
-    <w:lsdException w:name="Note Heading" w:semiHidden="1" w:unhideWhenUsed="1"/>
-    <w:lsdException w:name="Body Text 2" w:semiHidden="1" w:unhideWhenUsed="1"/>
-    <w:lsdException w:name="Body Text 3" w:semiHidden="1" w:unhideWhenUsed="1"/>
-    <w:lsdException w:name="Body Text Indent 2" w:semiHidden="1" w:unhideWhenUsed="1"/>
-    <w:lsdException w:name="Body Text Indent 3" w:semiHidden="1" w:unhideWhenUsed="1"/>
-    <w:lsdException w:name="Block Text" w:semiHidden="1" w:unhideWhenUsed="1"/>
-    <w:lsdException w:name="Hyperlink" w:uiPriority="99" w:semiHidden="1" w:unhideWhenUsed="1"/>
-    <w:lsdException w:name="FollowedHyperlink" w:semiHidden="1" w:unhideWhenUsed="1"/>
-    <w:lsdException w:name="Strong" w:qFormat="1"/>
-    <w:lsdException w:name="Document Map" w:semiHidden="1" w:unhideWhenUsed="1"/>
-    <w:lsdException w:name="Plain Text" w:semiHidden="1" w:unhideWhenUsed="1"/>
-    <w:lsdException w:name="E-mail Signature" w:semiHidden="1" w:unhideWhenUsed="1"/>
-    <w:lsdException w:name="HTML Top of Form" w:semiHidden="1" w:unhideWhenUsed="1"/>
-    <w:lsdException w:name="HTML Bottom of Form" w:semiHidden="1" w:unhideWhenUsed="1"/>
-    <w:lsdException w:name="Normal (Web)" w:semiHidden="1" w:unhideWhenUsed="1"/>
-    <w:lsdException w:name="HTML Acronym" w:semiHidden="1" w:unhideWhenUsed="1"/>
-    <w:lsdException w:name="HTML Address" w:semiHidden="1" w:unhideWhenUsed="1"/>
-    <w:lsdException w:name="HTML Cite" w:semiHidden="1" w:unhideWhenUsed="1"/>
-    <w:lsdException w:name="HTML Code" w:semiHidden="1" w:unhideWhenUsed="1"/>
-    <w:lsdException w:name="HTML Definition" w:semiHidden="1" w:unhideWhenUsed="1"/>
-    <w:lsdException w:name="HTML Keyboard" w:semiHidden="1" w:unhideWhenUsed="1"/>
-    <w:lsdException w:name="HTML Preformatted" w:semiHidden="1" w:unhideWhenUsed="1"/>
-    <w:lsdException w:name="HTML Sample" w:semiHidden="1" w:unhideWhenUsed="1"/>
-    <w:lsdException w:name="HTML Typewriter" w:semiHidden="1" w:unhideWhenUsed="1"/>
-    <w:lsdException w:name="HTML Variable" w:semiHidden="1" w:unhideWhenUsed="1"/>
-    <w:lsdException w:name="Normal Table" w:semiHidden="1" w:unhideWhenUsed="1"/>
-    <w:lsdException w:name="annotation subject" w:semiHidden="1" w:unhideWhenUsed="1"/>
-    <w:lsdException w:name="No List" w:semiHidden="1" w:unhideWhenUsed="1"/>
-    <w:lsdException w:name="Outline List 1" w:semiHidden="1" w:unhideWhenUsed="1"/>
-    <w:lsdException w:name="Outline List 2" w:semiHidden="1" w:unhideWhenUsed="1"/>
-    <w:lsdException w:name="Outline List 3" w:semiHidden="1" w:unhideWhenUsed="1"/>
-    <w:lsdException w:name="Table Simple 1" w:semiHidden="1" w:unhideWhenUsed="1"/>
-    <w:lsdException w:name="Table Simple 2" w:semiHidden="1" w:unhideWhenUsed="1"/>
-    <w:lsdException w:name="Table Simple 3" w:semiHidden="1" w:unhideWhenUsed="1"/>
-    <w:lsdException w:name="Table Classic 1" w:semiHidden="1" w:unhideWhenUsed="1"/>
-    <w:lsdException w:name="Table Classic 2" w:semiHidden="1" w:unhideWhenUsed="1"/>
-    <w:lsdException w:name="Table Classic 3" w:semiHidden="1" w:unhideWhenUsed="1"/>
-    <w:lsdException w:name="Table Classic 4" w:semiHidden="1" w:unhideWhenUsed="1"/>
-    <w:lsdException w:name="Table Colorful 1" w:semiHidden="1" w:unhideWhenUsed="1"/>
-    <w:lsdException w:name="Table Colorful 2" w:semiHidden="1" w:unhideWhenUsed="1"/>
-    <w:lsdException w:name="Table Colorful 3" w:semiHidden="1" w:unhideWhenUsed="1"/>
-    <w:lsdException w:name="Table Columns 1" w:semiHidden="1" w:unhideWhenUsed="1"/>
-    <w:lsdException w:name="Table Columns 2" w:semiHidden="1" w:unhideWhenUsed="1"/>
-    <w:lsdException w:name="Table Columns 3" w:semiHidden="1" w:unhideWhenUsed="1"/>
-    <w:lsdException w:name="Table Columns 4" w:semiHidden="1" w:unhideWhenUsed="1"/>
-    <w:lsdException w:name="Table Columns 5" w:semiHidden="1" w:unhideWhenUsed="1"/>
-    <w:lsdException w:name="Table Grid 1" w:semiHidden="1" w:unhideWhenUsed="1"/>
-    <w:lsdException w:name="Table Grid 2" w:semiHidden="1" w:unhideWhenUsed="1"/>
-    <w:lsdException w:name="Table Grid 3" w:semiHidden="1" w:unhideWhenUsed="1"/>
-    <w:lsdException w:name="Table Grid 4" w:semiHidden="1" w:unhideWhenUsed="1"/>
-    <w:lsdException w:name="Table Grid 5" w:semiHidden="1" w:unhideWhenUsed="1"/>
-    <w:lsdException w:name="Table Grid 6" w:semiHidden="1" w:unhideWhenUsed="1"/>
-    <w:lsdException w:name="Table Grid 7" w:semiHidden="1" w:unhideWhenUsed="1"/>
-    <w:lsdException w:name="Table Grid 8" w:semiHidden="1" w:unhideWhenUsed="1"/>
-    <w:lsdException w:name="Table List 1" w:semiHidden="1" w:unhideWhenUsed="1"/>
-    <w:lsdException w:name="Table List 2" w:semiHidden="1" w:unhideWhenUsed="1"/>
-    <w:lsdException w:name="Table List 3" w:semiHidden="1" w:unhideWhenUsed="1"/>
-    <w:lsdException w:name="Table List 4" w:semiHidden="1" w:unhideWhenUsed="1"/>
-    <w:lsdException w:name="Table List 5" w:semiHidden="1" w:unhideWhenUsed="1"/>
-    <w:lsdException w:name="Table List 6" w:semiHidden="1" w:unhideWhenUsed="1"/>
-    <w:lsdException w:name="Table List 7" w:semiHidden="1" w:unhideWhenUsed="1"/>
-    <w:lsdException w:name="Table List 8" w:semiHidden="1" w:unhideWhenUsed="1"/>
-    <w:lsdException w:name="Table 3D effects 1" w:semiHidden="1" w:unhideWhenUsed="1"/>
-    <w:lsdException w:name="Table 3D effects 2" w:semiHidden="1" w:unhideWhenUsed="1"/>
-    <w:lsdException w:name="Table 3D effects 3" w:semiHidden="1" w:unhideWhenUsed="1"/>
-    <w:lsdException w:name="Table Contemporary" w:semiHidden="1" w:unhideWhenUsed="1"/>
-    <w:lsdException w:name="Table Elegant" w:semiHidden="1" w:unhideWhenUsed="1"/>
-    <w:lsdException w:name="Table Professional" w:semiHidden="1" w:unhideWhenUsed="1"/>
-    <w:lsdException w:name="Table Subtle 1" w:semiHidden="1" w:unhideWhenUsed="1"/>
-    <w:lsdException w:name="Table Subtle 2" w:semiHidden="1" w:unhideWhenUsed="1"/>
-    <w:lsdException w:name="Table Web 1" w:semiHidden="1" w:unhideWhenUsed="1"/>
-    <w:lsdException w:name="Table Web 2" w:semiHidden="1" w:unhideWhenUsed="1"/>
-    <w:lsdException w:name="Table Web 3" w:semiHidden="1" w:unhideWhenUsed="1"/>
-    <w:lsdException w:name="Balloon Text" w:semiHidden="1" w:unhideWhenUsed="1"/>
-    <w:lsdException w:name="Table Theme" w:semiHidden="1" w:unhideWhenUsed="1"/>
-    <w:lsdException w:name="Placeholder Text" w:uiPriority="99" w:semiHidden="1"/>
-    <w:lsdException w:name="No Spacing" w:uiPriority="1"/>
-    <w:lsdException w:name="Light Shading" w:uiPriority="60"/>
-    <w:lsdException w:name="Light List" w:uiPriority="61"/>
-    <w:lsdException w:name="Light Grid" w:uiPriority="62"/>
-    <w:lsdException w:name="Medium Shading 1" w:uiPriority="63"/>
-    <w:lsdException w:name="Medium Shading 2" w:uiPriority="64"/>
-    <w:lsdException w:name="Medium List 1" w:uiPriority="65"/>
-    <w:lsdException w:name="Medium List 2" w:uiPriority="66"/>
-    <w:lsdException w:name="Medium Grid 1" w:uiPriority="67"/>
-    <w:lsdException w:name="Medium Grid 2" w:uiPriority="68"/>
-    <w:lsdException w:name="Medium Grid 3" w:uiPriority="69"/>
-    <w:lsdException w:name="Dark List" w:uiPriority="70"/>
-    <w:lsdException w:name="Colorful Shading" w:uiPriority="71"/>
-    <w:lsdException w:name="Colorful List" w:uiPriority="72"/>
-    <w:lsdException w:name="Colorful Grid" w:uiPriority="73"/>
-    <w:lsdException w:name="Light Shading Accent 1" w:uiPriority="60"/>
-    <w:lsdException w:name="Light List Accent 1" w:uiPriority="61"/>
-    <w:lsdException w:name="Light Grid Accent 1" w:uiPriority="62"/>
-    <w:lsdException w:name="Medium Shading 1 Accent 1" w:uiPriority="63"/>
-    <w:lsdException w:name="Medium Shading 2 Accent 1" w:uiPriority="64"/>
-    <w:lsdException w:name="Medium List 1 Accent 1" w:uiPriority="65"/>
-    <w:lsdException w:name="Revision" w:uiPriority="99" w:semiHidden="1"/>
-    <w:lsdException w:name="List Paragraph" w:uiPriority="34"/>
-    <w:lsdException w:name="Quote" w:uiPriority="29" w:qFormat="1"/>
-    <w:lsdException w:name="Intense Quote" w:uiPriority="30"/>
-    <w:lsdException w:name="Medium List 2 Accent 1" w:uiPriority="66"/>
-    <w:lsdException w:name="Medium Grid 1 Accent 1" w:uiPriority="67"/>
-    <w:lsdException w:name="Medium Grid 2 Accent 1" w:uiPriority="68"/>
-    <w:lsdException w:name="Medium Grid 3 Accent 1" w:uiPriority="69"/>
-    <w:lsdException w:name="Dark List Accent 1" w:uiPriority="70"/>
-    <w:lsdException w:name="Colorful Shading Accent 1" w:uiPriority="71"/>
-    <w:lsdException w:name="Colorful List Accent 1" w:uiPriority="72"/>
-    <w:lsdException w:name="Colorful Grid Accent 1" w:uiPriority="73"/>
-    <w:lsdException w:name="Light Shading Accent 2" w:uiPriority="60"/>
-    <w:lsdException w:name="Light List Accent 2" w:uiPriority="61"/>
-    <w:lsdException w:name="Light Grid Accent 2" w:uiPriority="62"/>
-    <w:lsdException w:name="Medium Shading 1 Accent 2" w:uiPriority="63"/>
-    <w:lsdException w:name="Medium Shading 2 Accent 2" w:uiPriority="64"/>
-    <w:lsdException w:name="Medium List 1 Accent 2" w:uiPriority="65"/>
-    <w:lsdException w:name="Medium List 2 Accent 2" w:uiPriority="66"/>
-    <w:lsdException w:name="Medium Grid 1 Accent 2" w:uiPriority="67"/>
-    <w:lsdException w:name="Medium Grid 2 Accent 2" w:uiPriority="68"/>
-    <w:lsdException w:name="Medium Grid 3 Accent 2" w:uiPriority="69"/>
-    <w:lsdException w:name="Dark List Accent 2" w:uiPriority="70"/>
-    <w:lsdException w:name="Colorful Shading Accent 2" w:uiPriority="71"/>
-    <w:lsdException w:name="Colorful List Accent 2" w:uiPriority="72"/>
-    <w:lsdException w:name="Colorful Grid Accent 2" w:uiPriority="73"/>
-    <w:lsdException w:name="Light Shading Accent 3" w:uiPriority="60"/>
-    <w:lsdException w:name="Light List Accent 3" w:uiPriority="61"/>
-    <w:lsdException w:name="Light Grid Accent 3" w:uiPriority="62"/>
-    <w:lsdException w:name="Medium Shading 1 Accent 3" w:uiPriority="63"/>
-    <w:lsdException w:name="Medium Shading 2 Accent 3" w:uiPriority="64"/>
-    <w:lsdException w:name="Medium List 1 Accent 3" w:uiPriority="65"/>
-    <w:lsdException w:name="Medium List 2 Accent 3" w:uiPriority="66"/>
-    <w:lsdException w:name="Medium Grid 1 Accent 3" w:uiPriority="67"/>
-    <w:lsdException w:name="Medium Grid 2 Accent 3" w:uiPriority="68"/>
-    <w:lsdException w:name="Medium Grid 3 Accent 3" w:uiPriority="69"/>
-    <w:lsdException w:name="Dark List Accent 3" w:uiPriority="70"/>
-    <w:lsdException w:name="Colorful Shading Accent 3" w:uiPriority="71"/>
-    <w:lsdException w:name="Colorful List Accent 3" w:uiPriority="72"/>
-    <w:lsdException w:name="Colorful Grid Accent 3" w:uiPriority="73"/>
-    <w:lsdException w:name="Light Shading Accent 4" w:uiPriority="60"/>
-    <w:lsdException w:name="Light List Accent 4" w:uiPriority="61"/>
-    <w:lsdException w:name="Light Grid Accent 4" w:uiPriority="62"/>
-    <w:lsdException w:name="Medium Shading 1 Accent 4" w:uiPriority="63"/>
-    <w:lsdException w:name="Medium Shading 2 Accent 4" w:uiPriority="64"/>
-    <w:lsdException w:name="Medium List 1 Accent 4" w:uiPriority="65"/>
-    <w:lsdException w:name="Medium List 2 Accent 4" w:uiPriority="66"/>
-    <w:lsdException w:name="Medium Grid 1 Accent 4" w:uiPriority="67"/>
-    <w:lsdException w:name="Medium Grid 2 Accent 4" w:uiPriority="68"/>
-    <w:lsdException w:name="Medium Grid 3 Accent 4" w:uiPriority="69"/>
-    <w:lsdException w:name="Dark List Accent 4" w:uiPriority="70"/>
-    <w:lsdException w:name="Colorful Shading Accent 4" w:uiPriority="71"/>
-    <w:lsdException w:name="Colorful List Accent 4" w:uiPriority="72"/>
-    <w:lsdException w:name="Colorful Grid Accent 4" w:uiPriority="73"/>
-    <w:lsdException w:name="Light Shading Accent 5" w:uiPriority="60"/>
-    <w:lsdException w:name="Light List Accent 5" w:uiPriority="61"/>
-    <w:lsdException w:name="Light Grid Accent 5" w:uiPriority="62"/>
-    <w:lsdException w:name="Medium Shading 1 Accent 5" w:uiPriority="63"/>
-    <w:lsdException w:name="Medium Shading 2 Accent 5" w:uiPriority="64"/>
-    <w:lsdException w:name="Medium List 1 Accent 5" w:uiPriority="65"/>
-    <w:lsdException w:name="Medium List 2 Accent 5" w:uiPriority="66"/>
-    <w:lsdException w:name="Medium Grid 1 Accent 5" w:uiPriority="67"/>
-    <w:lsdException w:name="Medium Grid 2 Accent 5" w:uiPriority="68"/>
-    <w:lsdException w:name="Medium Grid 3 Accent 5" w:uiPriority="69"/>
-    <w:lsdException w:name="Dark List Accent 5" w:uiPriority="70"/>
-    <w:lsdException w:name="Colorful Shading Accent 5" w:uiPriority="71"/>
-    <w:lsdException w:name="Colorful List Accent 5" w:uiPriority="72"/>
-    <w:lsdException w:name="Colorful Grid Accent 5" w:uiPriority="73"/>
-    <w:lsdException w:name="Light Shading Accent 6" w:uiPriority="60"/>
-    <w:lsdException w:name="Light List Accent 6" w:uiPriority="61"/>
-    <w:lsdException w:name="Light Grid Accent 6" w:uiPriority="62"/>
-    <w:lsdException w:name="Medium Shading 1 Accent 6" w:uiPriority="63"/>
-    <w:lsdException w:name="Medium Shading 2 Accent 6" w:uiPriority="64"/>
-    <w:lsdException w:name="Medium List 1 Accent 6" w:uiPriority="65"/>
-    <w:lsdException w:name="Medium List 2 Accent 6" w:uiPriority="66"/>
-    <w:lsdException w:name="Medium Grid 1 Accent 6" w:uiPriority="67"/>
-    <w:lsdException w:name="Medium Grid 2 Accent 6" w:uiPriority="68"/>
-    <w:lsdException w:name="Medium Grid 3 Accent 6" w:uiPriority="69"/>
-    <w:lsdException w:name="Dark List Accent 6" w:uiPriority="70"/>
-    <w:lsdException w:name="Colorful Shading Accent 6" w:uiPriority="71"/>
-    <w:lsdException w:name="Colorful List Accent 6" w:uiPriority="72"/>
-    <w:lsdException w:name="Colorful Grid Accent 6" w:uiPriority="73"/>
-    <w:lsdException w:name="Subtle Emphasis" w:uiPriority="19"/>
-    <w:lsdException w:name="Intense Emphasis" w:uiPriority="21"/>
-    <w:lsdException w:name="Subtle Reference" w:uiPriority="31"/>
-    <w:lsdException w:name="Intense Reference" w:uiPriority="32"/>
-    <w:lsdException w:name="Book Title" w:uiPriority="33"/>
-    <w:lsdException w:name="Bibliography" w:uiPriority="37" w:semiHidden="1" w:unhideWhenUsed="1"/>
-    <w:lsdException w:name="TOC Heading" w:uiPriority="39" w:semiHidden="1" w:unhideWhenUsed="1" w:qFormat="1"/>
-    <w:lsdException w:name="Plain Table 1" w:uiPriority="41"/>
-    <w:lsdException w:name="Plain Table 2" w:uiPriority="42"/>
-    <w:lsdException w:name="Plain Table 3" w:uiPriority="43"/>
-    <w:lsdException w:name="Plain Table 4" w:uiPriority="44"/>
-    <w:lsdException w:name="Plain Table 5" w:uiPriority="45"/>
-    <w:lsdException w:name="Grid Table Light" w:uiPriority="40"/>
-    <w:lsdException w:name="Grid Table 1 Light" w:uiPriority="46"/>
-    <w:lsdException w:name="Grid Table 2" w:uiPriority="47"/>
-    <w:lsdException w:name="Grid Table 3" w:uiPriority="48"/>
-    <w:lsdException w:name="Grid Table 4" w:uiPriority="49"/>
-    <w:lsdException w:name="Grid Table 5 Dark" w:uiPriority="50"/>
-    <w:lsdException w:name="Grid Table 6 Colorful" w:uiPriority="51"/>
-    <w:lsdException w:name="Grid Table 7 Colorful" w:uiPriority="52"/>
-    <w:lsdException w:name="Grid Table 1 Light Accent 1" w:uiPriority="46"/>
-    <w:lsdException w:name="Grid Table 2 Accent 1" w:uiPriority="47"/>
-    <w:lsdException w:name="Grid Table 3 Accent 1" w:uiPriority="48"/>
-    <w:lsdException w:name="Grid Table 4 Accent 1" w:uiPriority="49"/>
-    <w:lsdException w:name="Grid Table 5 Dark Accent 1" w:uiPriority="50"/>
-    <w:lsdException w:name="Grid Table 6 Colorful Accent 1" w:uiPriority="51"/>
-    <w:lsdException w:name="Grid Table 7 Colorful Accent 1" w:uiPriority="52"/>
-    <w:lsdException w:name="Grid Table 1 Light Accent 2" w:uiPriority="46"/>
-    <w:lsdException w:name="Grid Table 2 Accent 2" w:uiPriority="47"/>
-    <w:lsdException w:name="Grid Table 3 Accent 2" w:uiPriority="48"/>
-    <w:lsdException w:name="Grid Table 4 Accent 2" w:uiPriority="49"/>
-    <w:lsdException w:name="Grid Table 5 Dark Accent 2" w:uiPriority="50"/>
-    <w:lsdException w:name="Grid Table 6 Colorful Accent 2" w:uiPriority="51"/>
-    <w:lsdException w:name="Grid Table 7 Colorful Accent 2" w:uiPriority="52"/>
-    <w:lsdException w:name="Grid Table 1 Light Accent 3" w:uiPriority="46"/>
-    <w:lsdException w:name="Grid Table 2 Accent 3" w:uiPriority="47"/>
-    <w:lsdException w:name="Grid Table 3 Accent 3" w:uiPriority="48"/>
-    <w:lsdException w:name="Grid Table 4 Accent 3" w:uiPriority="49"/>
-    <w:lsdException w:name="Grid Table 5 Dark Accent 3" w:uiPriority="50"/>
-    <w:lsdException w:name="Grid Table 6 Colorful Accent 3" w:uiPriority="51"/>
-    <w:lsdException w:name="Grid Table 7 Colorful Accent 3" w:uiPriority="52"/>
-    <w:lsdException w:name="Grid Table 1 Light Accent 4" w:uiPriority="46"/>
-    <w:lsdException w:name="Grid Table 2 Accent 4" w:uiPriority="47"/>
-    <w:lsdException w:name="Grid Table 3 Accent 4" w:uiPriority="48"/>
-    <w:lsdException w:name="Grid Table 4 Accent 4" w:uiPriority="49"/>
-    <w:lsdException w:name="Grid Table 5 Dark Accent 4" w:uiPriority="50"/>
-    <w:lsdException w:name="Grid Table 6 Colorful Accent 4" w:uiPriority="51"/>
-    <w:lsdException w:name="Grid Table 7 Colorful Accent 4" w:uiPriority="52"/>
-    <w:lsdException w:name="Grid Table 1 Light Accent 5" w:uiPriority="46"/>
-    <w:lsdException w:name="Grid Table 2 Accent 5" w:uiPriority="47"/>
-    <w:lsdException w:name="Grid Table 3 Accent 5" w:uiPriority="48"/>
-    <w:lsdException w:name="Grid Table 4 Accent 5" w:uiPriority="49"/>
-    <w:lsdException w:name="Grid Table 5 Dark Accent 5" w:uiPriority="50"/>
-    <w:lsdException w:name="Grid Table 6 Colorful Accent 5" w:uiPriority="51"/>
-    <w:lsdException w:name="Grid Table 7 Colorful Accent 5" w:uiPriority="52"/>
-    <w:lsdException w:name="Grid Table 1 Light Accent 6" w:uiPriority="46"/>
-    <w:lsdException w:name="Grid Table 2 Accent 6" w:uiPriority="47"/>
-    <w:lsdException w:name="Grid Table 3 Accent 6" w:uiPriority="48"/>
-    <w:lsdException w:name="Grid Table 4 Accent 6" w:uiPriority="49"/>
-    <w:lsdException w:name="Grid Table 5 Dark Accent 6" w:uiPriority="50"/>
-    <w:lsdException w:name="Grid Table 6 Colorful Accent 6" w:uiPriority="51"/>
-    <w:lsdException w:name="Grid Table 7 Colorful Accent 6" w:uiPriority="52"/>
-    <w:lsdException w:name="List Table 1 Light" w:uiPriority="46"/>
-    <w:lsdException w:name="List Table 2" w:uiPriority="47"/>
-    <w:lsdException w:name="List Table 3" w:uiPriority="48"/>
-    <w:lsdException w:name="List Table 4" w:uiPriority="49"/>
-    <w:lsdException w:name="List Table 5 Dark" w:uiPriority="50"/>
-    <w:lsdException w:name="List Table 6 Colorful" w:uiPriority="51"/>
-    <w:lsdException w:name="List Table 7 Colorful" w:uiPriority="52"/>
-    <w:lsdException w:name="List Table 1 Light Accent 1" w:uiPriority="46"/>
-    <w:lsdException w:name="List Table 2 Accent 1" w:uiPriority="47"/>
-    <w:lsdException w:name="List Table 3 Accent 1" w:uiPriority="48"/>
-    <w:lsdException w:name="List Table 4 Accent 1" w:uiPriority="49"/>
-    <w:lsdException w:name="List Table 5 Dark Accent 1" w:uiPriority="50"/>
-    <w:lsdException w:name="List Table 6 Colorful Accent 1" w:uiPriority="51"/>
-    <w:lsdException w:name="List Table 7 Colorful Accent 1" w:uiPriority="52"/>
-    <w:lsdException w:name="List Table 1 Light Accent 2" w:uiPriority="46"/>
-    <w:lsdException w:name="List Table 2 Accent 2" w:uiPriority="47"/>
-    <w:lsdException w:name="List Table 3 Accent 2" w:uiPriority="48"/>
-    <w:lsdException w:name="List Table 4 Accent 2" w:uiPriority="49"/>
-    <w:lsdException w:name="List Table 5 Dark Accent 2" w:uiPriority="50"/>
-    <w:lsdException w:name="List Table 6 Colorful Accent 2" w:uiPriority="51"/>
-    <w:lsdException w:name="List Table 7 Colorful Accent 2" w:uiPriority="52"/>
-    <w:lsdException w:name="List Table 1 Light Accent 3" w:uiPriority="46"/>
-    <w:lsdException w:name="List Table 2 Accent 3" w:uiPriority="47"/>
-    <w:lsdException w:name="List Table 3 Accent 3" w:uiPriority="48"/>
-    <w:lsdException w:name="List Table 4 Accent 3" w:uiPriority="49"/>
-    <w:lsdException w:name="List Table 5 Dark Accent 3" w:uiPriority="50"/>
-    <w:lsdException w:name="List Table 6 Colorful Accent 3" w:uiPriority="51"/>
-    <w:lsdException w:name="List Table 7 Colorful Accent 3" w:uiPriority="52"/>
-    <w:lsdException w:name="List Table 1 Light Accent 4" w:uiPriority="46"/>
-    <w:lsdException w:name="List Table 2 Accent 4" w:uiPriority="47"/>
-    <w:lsdException w:name="List Table 3 Accent 4" w:uiPriority="48"/>
-    <w:lsdException w:name="List Table 4 Accent 4" w:uiPriority="49"/>
-    <w:lsdException w:name="List Table 5 Dark Accent 4" w:uiPriority="50"/>
-    <w:lsdException w:name="List Table 6 Colorful Accent 4" w:uiPriority="51"/>
-    <w:lsdException w:name="List Table 7 Colorful Accent 4" w:uiPriority="52"/>
-    <w:lsdException w:name="List Table 1 Light Accent 5" w:uiPriority="46"/>
-    <w:lsdException w:name="List Table 2 Accent 5" w:uiPriority="47"/>
-    <w:lsdException w:name="List Table 3 Accent 5" w:uiPriority="48"/>
-    <w:lsdException w:name="List Table 4 Accent 5" w:uiPriority="49"/>
-    <w:lsdException w:name="List Table 5 Dark Accent 5" w:uiPriority="50"/>
-    <w:lsdException w:name="List Table 6 Colorful Accent 5" w:uiPriority="51"/>
-    <w:lsdException w:name="List Table 7 Colorful Accent 5" w:uiPriority="52"/>
-    <w:lsdException w:name="List Table 1 Light Accent 6" w:uiPriority="46"/>
-    <w:lsdException w:name="List Table 2 Accent 6" w:uiPriority="47"/>
-    <w:lsdException w:name="List Table 3 Accent 6" w:uiPriority="48"/>
-    <w:lsdException w:name="List Table 4 Accent 6" w:uiPriority="49"/>
-    <w:lsdException w:name="List Table 5 Dark Accent 6" w:uiPriority="50"/>
-    <w:lsdException w:name="List Table 6 Colorful Accent 6" w:uiPriority="51"/>
-    <w:lsdException w:name="List Table 7 Colorful Accent 6" w:uiPriority="52"/>
-    <w:lsdException w:name="Mention" w:uiPriority="99" w:semiHidden="1" w:unhideWhenUsed="1"/>
-    <w:lsdException w:name="Smart Hyperlink" w:uiPriority="99" w:semiHidden="1" w:unhideWhenUsed="1"/>
-    <w:lsdException w:name="Hashtag" w:uiPriority="99" w:semiHidden="1" w:unhideWhenUsed="1"/>
-    <w:lsdException w:name="Unresolved Mention" w:uiPriority="99" w:semiHidden="1" w:unhideWhenUsed="1"/>
-    <w:lsdException w:name="Smart Link" w:uiPriority="99" w:semiHidden="1" w:unhideWhenUsed="1"/>
-  </w:latentStyles>
-  <w:style w:type="paragraph" w:styleId="Normal" w:default="1">
+  <w:style w:type="paragraph" w:styleId="Normal">
     <w:name w:val="Normal"/>
     <w:qFormat/>
-    <w:rsid w:val="009f0164"/>
     <w:pPr>
       <w:widowControl/>
       <w:suppressAutoHyphens w:val="false"/>
+      <w:kinsoku w:val="true"/>
+      <w:overflowPunct w:val="true"/>
+      <w:autoSpaceDE w:val="true"/>
       <w:bidi w:val="0"/>
       <w:spacing w:lineRule="auto" w:line="360" w:before="0" w:after="0"/>
       <w:jc w:val="both"/>
@@ -6006,9 +5345,7 @@
     <w:basedOn w:val="leipteksti"/>
     <w:next w:val="leipteksti"/>
     <w:link w:val="Heading1Char"/>
-    <w:uiPriority w:val="9"/>
     <w:qFormat/>
-    <w:rsid w:val="00bb3d39"/>
     <w:pPr>
       <w:keepNext w:val="true"/>
       <w:keepLines/>
@@ -6021,7 +5358,7 @@
       <w:outlineLvl w:val="0"/>
     </w:pPr>
     <w:rPr>
-      <w:rFonts w:eastAsia="" w:cs="" w:cstheme="majorBidi" w:eastAsiaTheme="majorEastAsia"/>
+      <w:rFonts w:eastAsia="Times New Roman" w:cs="Times New Roman"/>
       <w:b/>
       <w:bCs/>
       <w:sz w:val="24"/>
@@ -6033,10 +5370,7 @@
     <w:basedOn w:val="leipteksti"/>
     <w:next w:val="leipteksti"/>
     <w:link w:val="Heading2Char"/>
-    <w:uiPriority w:val="9"/>
-    <w:unhideWhenUsed/>
     <w:qFormat/>
-    <w:rsid w:val="00600602"/>
     <w:pPr>
       <w:keepNext w:val="true"/>
       <w:keepLines/>
@@ -6048,7 +5382,7 @@
       <w:outlineLvl w:val="1"/>
     </w:pPr>
     <w:rPr>
-      <w:rFonts w:eastAsia="" w:cs="" w:cstheme="majorBidi" w:eastAsiaTheme="majorEastAsia"/>
+      <w:rFonts w:eastAsia="Times New Roman" w:cs="Times New Roman"/>
       <w:bCs/>
       <w:szCs w:val="26"/>
     </w:rPr>
@@ -6058,10 +5392,7 @@
     <w:basedOn w:val="leipteksti"/>
     <w:next w:val="leipteksti"/>
     <w:link w:val="Heading3Char"/>
-    <w:uiPriority w:val="9"/>
-    <w:unhideWhenUsed/>
     <w:qFormat/>
-    <w:rsid w:val="00600602"/>
     <w:pPr>
       <w:keepNext w:val="true"/>
       <w:keepLines/>
@@ -6073,7 +5404,7 @@
       <w:outlineLvl w:val="2"/>
     </w:pPr>
     <w:rPr>
-      <w:rFonts w:eastAsia="" w:cs="" w:cstheme="majorBidi" w:eastAsiaTheme="majorEastAsia"/>
+      <w:rFonts w:eastAsia="Times New Roman" w:cs="Times New Roman"/>
       <w:bCs/>
     </w:rPr>
   </w:style>
@@ -6082,11 +5413,7 @@
     <w:basedOn w:val="Normal"/>
     <w:next w:val="Normal"/>
     <w:link w:val="Heading4Char"/>
-    <w:uiPriority w:val="9"/>
-    <w:semiHidden/>
-    <w:unhideWhenUsed/>
     <w:qFormat/>
-    <w:rsid w:val="00600602"/>
     <w:pPr>
       <w:keepNext w:val="true"/>
       <w:keepLines/>
@@ -6098,7 +5425,7 @@
       <w:outlineLvl w:val="3"/>
     </w:pPr>
     <w:rPr>
-      <w:rFonts w:ascii="Cambria" w:hAnsi="Cambria" w:eastAsia="" w:cs="" w:asciiTheme="majorHAnsi" w:cstheme="majorBidi" w:eastAsiaTheme="majorEastAsia" w:hAnsiTheme="majorHAnsi"/>
+      <w:rFonts w:ascii="Cambria" w:hAnsi="Cambria" w:eastAsia="Times New Roman" w:cs="Times New Roman"/>
       <w:b/>
       <w:bCs/>
       <w:i/>
@@ -6113,11 +5440,7 @@
     <w:basedOn w:val="Normal"/>
     <w:next w:val="Normal"/>
     <w:link w:val="Heading5Char"/>
-    <w:uiPriority w:val="9"/>
-    <w:semiHidden/>
-    <w:unhideWhenUsed/>
     <w:qFormat/>
-    <w:rsid w:val="00600602"/>
     <w:pPr>
       <w:keepNext w:val="true"/>
       <w:keepLines/>
@@ -6129,7 +5452,7 @@
       <w:outlineLvl w:val="4"/>
     </w:pPr>
     <w:rPr>
-      <w:rFonts w:ascii="Cambria" w:hAnsi="Cambria" w:eastAsia="" w:cs="" w:asciiTheme="majorHAnsi" w:cstheme="majorBidi" w:eastAsiaTheme="majorEastAsia" w:hAnsiTheme="majorHAnsi"/>
+      <w:rFonts w:ascii="Cambria" w:hAnsi="Cambria" w:eastAsia="Times New Roman" w:cs="Times New Roman"/>
       <w:color w:themeColor="accent1" w:themeShade="7f" w:val="243F60"/>
       <w:szCs w:val="22"/>
       <w:lang w:eastAsia="en-US"/>
@@ -6140,11 +5463,7 @@
     <w:basedOn w:val="Normal"/>
     <w:next w:val="Normal"/>
     <w:link w:val="Heading6Char"/>
-    <w:uiPriority w:val="9"/>
-    <w:semiHidden/>
-    <w:unhideWhenUsed/>
     <w:qFormat/>
-    <w:rsid w:val="00600602"/>
     <w:pPr>
       <w:keepNext w:val="true"/>
       <w:keepLines/>
@@ -6156,7 +5475,7 @@
       <w:outlineLvl w:val="5"/>
     </w:pPr>
     <w:rPr>
-      <w:rFonts w:ascii="Cambria" w:hAnsi="Cambria" w:eastAsia="" w:cs="" w:asciiTheme="majorHAnsi" w:cstheme="majorBidi" w:eastAsiaTheme="majorEastAsia" w:hAnsiTheme="majorHAnsi"/>
+      <w:rFonts w:ascii="Cambria" w:hAnsi="Cambria" w:eastAsia="Times New Roman" w:cs="Times New Roman"/>
       <w:i/>
       <w:iCs/>
       <w:color w:themeColor="accent1" w:themeShade="7f" w:val="243F60"/>
@@ -6169,11 +5488,7 @@
     <w:basedOn w:val="Normal"/>
     <w:next w:val="Normal"/>
     <w:link w:val="Heading7Char"/>
-    <w:uiPriority w:val="9"/>
-    <w:semiHidden/>
-    <w:unhideWhenUsed/>
     <w:qFormat/>
-    <w:rsid w:val="00600602"/>
     <w:pPr>
       <w:keepNext w:val="true"/>
       <w:keepLines/>
@@ -6185,10 +5500,10 @@
       <w:outlineLvl w:val="6"/>
     </w:pPr>
     <w:rPr>
-      <w:rFonts w:ascii="Cambria" w:hAnsi="Cambria" w:eastAsia="" w:cs="" w:asciiTheme="majorHAnsi" w:cstheme="majorBidi" w:eastAsiaTheme="majorEastAsia" w:hAnsiTheme="majorHAnsi"/>
+      <w:rFonts w:ascii="Cambria" w:hAnsi="Cambria" w:eastAsia="Times New Roman" w:cs="Times New Roman"/>
       <w:i/>
       <w:iCs/>
-      <w:color w:themeColor="text1" w:themeTint="bf" w:val="404040"/>
+      <w:color w:themeColor="dark1" w:themeTint="bf" w:val="404040"/>
       <w:szCs w:val="22"/>
       <w:lang w:eastAsia="en-US"/>
     </w:rPr>
@@ -6198,11 +5513,7 @@
     <w:basedOn w:val="Normal"/>
     <w:next w:val="Normal"/>
     <w:link w:val="Heading8Char"/>
-    <w:uiPriority w:val="9"/>
-    <w:semiHidden/>
-    <w:unhideWhenUsed/>
     <w:qFormat/>
-    <w:rsid w:val="00600602"/>
     <w:pPr>
       <w:keepNext w:val="true"/>
       <w:keepLines/>
@@ -6214,8 +5525,8 @@
       <w:outlineLvl w:val="7"/>
     </w:pPr>
     <w:rPr>
-      <w:rFonts w:ascii="Cambria" w:hAnsi="Cambria" w:eastAsia="" w:cs="" w:asciiTheme="majorHAnsi" w:cstheme="majorBidi" w:eastAsiaTheme="majorEastAsia" w:hAnsiTheme="majorHAnsi"/>
-      <w:color w:themeColor="text1" w:themeTint="bf" w:val="404040"/>
+      <w:rFonts w:ascii="Cambria" w:hAnsi="Cambria" w:eastAsia="Times New Roman" w:cs="Times New Roman"/>
+      <w:color w:themeColor="dark1" w:themeTint="bf" w:val="404040"/>
       <w:szCs w:val="20"/>
       <w:lang w:eastAsia="en-US"/>
     </w:rPr>
@@ -6225,11 +5536,7 @@
     <w:basedOn w:val="Normal"/>
     <w:next w:val="Normal"/>
     <w:link w:val="Heading9Char"/>
-    <w:uiPriority w:val="9"/>
-    <w:semiHidden/>
-    <w:unhideWhenUsed/>
     <w:qFormat/>
-    <w:rsid w:val="00600602"/>
     <w:pPr>
       <w:keepNext w:val="true"/>
       <w:keepLines/>
@@ -6241,55 +5548,46 @@
       <w:outlineLvl w:val="8"/>
     </w:pPr>
     <w:rPr>
-      <w:rFonts w:ascii="Cambria" w:hAnsi="Cambria" w:eastAsia="" w:cs="" w:asciiTheme="majorHAnsi" w:cstheme="majorBidi" w:eastAsiaTheme="majorEastAsia" w:hAnsiTheme="majorHAnsi"/>
+      <w:rFonts w:ascii="Cambria" w:hAnsi="Cambria" w:eastAsia="Times New Roman" w:cs="Times New Roman"/>
       <w:i/>
       <w:iCs/>
-      <w:color w:themeColor="text1" w:themeTint="bf" w:val="404040"/>
+      <w:color w:themeColor="dark1" w:themeTint="bf" w:val="404040"/>
       <w:szCs w:val="20"/>
       <w:lang w:eastAsia="en-US"/>
     </w:rPr>
   </w:style>
-  <w:style w:type="character" w:styleId="DefaultParagraphFont" w:default="1">
+  <w:style w:type="character" w:styleId="DefaultParagraphFont">
     <w:name w:val="Default Paragraph Font"/>
-    <w:uiPriority w:val="1"/>
-    <w:semiHidden/>
-    <w:unhideWhenUsed/>
     <w:qFormat/>
     <w:rPr/>
   </w:style>
-  <w:style w:type="character" w:styleId="HeaderChar" w:customStyle="1">
+  <w:style w:type="character" w:styleId="HeaderChar">
     <w:name w:val="Header Char"/>
     <w:basedOn w:val="DefaultParagraphFont"/>
     <w:link w:val="Header"/>
-    <w:uiPriority w:val="99"/>
     <w:qFormat/>
-    <w:rsid w:val="00da42b6"/>
     <w:rPr>
       <w:sz w:val="24"/>
       <w:szCs w:val="24"/>
     </w:rPr>
   </w:style>
-  <w:style w:type="character" w:styleId="FooterChar" w:customStyle="1">
+  <w:style w:type="character" w:styleId="FooterChar">
     <w:name w:val="Footer Char"/>
     <w:basedOn w:val="DefaultParagraphFont"/>
     <w:link w:val="Footer"/>
-    <w:uiPriority w:val="99"/>
     <w:qFormat/>
-    <w:rsid w:val="00da42b6"/>
     <w:rPr>
       <w:sz w:val="24"/>
       <w:szCs w:val="24"/>
     </w:rPr>
   </w:style>
-  <w:style w:type="character" w:styleId="Heading1Char" w:customStyle="1">
+  <w:style w:type="character" w:styleId="Heading1Char">
     <w:name w:val="Heading 1 Char"/>
     <w:basedOn w:val="DefaultParagraphFont"/>
     <w:link w:val="Heading1"/>
-    <w:uiPriority w:val="9"/>
     <w:qFormat/>
-    <w:rsid w:val="00bb3d39"/>
     <w:rPr>
-      <w:rFonts w:ascii="Tahoma" w:hAnsi="Tahoma" w:eastAsia="" w:cs="" w:cstheme="majorBidi" w:eastAsiaTheme="majorEastAsia"/>
+      <w:rFonts w:ascii="Tahoma" w:hAnsi="Tahoma" w:eastAsia="Times New Roman" w:cs="Times New Roman"/>
       <w:b/>
       <w:bCs/>
       <w:sz w:val="24"/>
@@ -6297,46 +5595,39 @@
       <w:lang w:eastAsia="en-US"/>
     </w:rPr>
   </w:style>
-  <w:style w:type="character" w:styleId="Heading2Char" w:customStyle="1">
+  <w:style w:type="character" w:styleId="Heading2Char">
     <w:name w:val="Heading 2 Char"/>
     <w:basedOn w:val="DefaultParagraphFont"/>
     <w:link w:val="Heading2"/>
-    <w:uiPriority w:val="9"/>
     <w:qFormat/>
-    <w:rsid w:val="00600602"/>
     <w:rPr>
-      <w:rFonts w:ascii="Tahoma" w:hAnsi="Tahoma" w:eastAsia="" w:cs="" w:cstheme="majorBidi" w:eastAsiaTheme="majorEastAsia"/>
+      <w:rFonts w:ascii="Tahoma" w:hAnsi="Tahoma" w:eastAsia="Times New Roman" w:cs="Times New Roman"/>
       <w:bCs/>
       <w:sz w:val="22"/>
       <w:szCs w:val="26"/>
       <w:lang w:eastAsia="en-US"/>
     </w:rPr>
   </w:style>
-  <w:style w:type="character" w:styleId="Heading3Char" w:customStyle="1">
+  <w:style w:type="character" w:styleId="Heading3Char">
     <w:name w:val="Heading 3 Char"/>
     <w:basedOn w:val="DefaultParagraphFont"/>
     <w:link w:val="Heading3"/>
-    <w:uiPriority w:val="9"/>
     <w:qFormat/>
-    <w:rsid w:val="00600602"/>
     <w:rPr>
-      <w:rFonts w:ascii="Tahoma" w:hAnsi="Tahoma" w:eastAsia="" w:cs="" w:cstheme="majorBidi" w:eastAsiaTheme="majorEastAsia"/>
+      <w:rFonts w:ascii="Tahoma" w:hAnsi="Tahoma" w:eastAsia="Times New Roman" w:cs="Times New Roman"/>
       <w:bCs/>
       <w:sz w:val="22"/>
       <w:szCs w:val="22"/>
       <w:lang w:eastAsia="en-US"/>
     </w:rPr>
   </w:style>
-  <w:style w:type="character" w:styleId="Heading4Char" w:customStyle="1">
+  <w:style w:type="character" w:styleId="Heading4Char">
     <w:name w:val="Heading 4 Char"/>
     <w:basedOn w:val="DefaultParagraphFont"/>
     <w:link w:val="Heading4"/>
-    <w:uiPriority w:val="9"/>
-    <w:semiHidden/>
     <w:qFormat/>
-    <w:rsid w:val="00600602"/>
     <w:rPr>
-      <w:rFonts w:ascii="Cambria" w:hAnsi="Cambria" w:eastAsia="" w:cs="" w:asciiTheme="majorHAnsi" w:cstheme="majorBidi" w:eastAsiaTheme="majorEastAsia" w:hAnsiTheme="majorHAnsi"/>
+      <w:rFonts w:ascii="Cambria" w:hAnsi="Cambria" w:eastAsia="Times New Roman" w:cs="Times New Roman"/>
       <w:b/>
       <w:bCs/>
       <w:i/>
@@ -6347,32 +5638,26 @@
       <w:lang w:eastAsia="en-US"/>
     </w:rPr>
   </w:style>
-  <w:style w:type="character" w:styleId="Heading5Char" w:customStyle="1">
+  <w:style w:type="character" w:styleId="Heading5Char">
     <w:name w:val="Heading 5 Char"/>
     <w:basedOn w:val="DefaultParagraphFont"/>
     <w:link w:val="Heading5"/>
-    <w:uiPriority w:val="9"/>
-    <w:semiHidden/>
     <w:qFormat/>
-    <w:rsid w:val="00600602"/>
     <w:rPr>
-      <w:rFonts w:ascii="Cambria" w:hAnsi="Cambria" w:eastAsia="" w:cs="" w:asciiTheme="majorHAnsi" w:cstheme="majorBidi" w:eastAsiaTheme="majorEastAsia" w:hAnsiTheme="majorHAnsi"/>
+      <w:rFonts w:ascii="Cambria" w:hAnsi="Cambria" w:eastAsia="Times New Roman" w:cs="Times New Roman"/>
       <w:color w:themeColor="accent1" w:themeShade="7f" w:val="243F60"/>
       <w:sz w:val="22"/>
       <w:szCs w:val="22"/>
       <w:lang w:eastAsia="en-US"/>
     </w:rPr>
   </w:style>
-  <w:style w:type="character" w:styleId="Heading6Char" w:customStyle="1">
+  <w:style w:type="character" w:styleId="Heading6Char">
     <w:name w:val="Heading 6 Char"/>
     <w:basedOn w:val="DefaultParagraphFont"/>
     <w:link w:val="Heading6"/>
-    <w:uiPriority w:val="9"/>
-    <w:semiHidden/>
     <w:qFormat/>
-    <w:rsid w:val="00600602"/>
     <w:rPr>
-      <w:rFonts w:ascii="Cambria" w:hAnsi="Cambria" w:eastAsia="" w:cs="" w:asciiTheme="majorHAnsi" w:cstheme="majorBidi" w:eastAsiaTheme="majorEastAsia" w:hAnsiTheme="majorHAnsi"/>
+      <w:rFonts w:ascii="Cambria" w:hAnsi="Cambria" w:eastAsia="Times New Roman" w:cs="Times New Roman"/>
       <w:i/>
       <w:iCs/>
       <w:color w:themeColor="accent1" w:themeShade="7f" w:val="243F60"/>
@@ -6381,52 +5666,43 @@
       <w:lang w:eastAsia="en-US"/>
     </w:rPr>
   </w:style>
-  <w:style w:type="character" w:styleId="Heading7Char" w:customStyle="1">
+  <w:style w:type="character" w:styleId="Heading7Char">
     <w:name w:val="Heading 7 Char"/>
     <w:basedOn w:val="DefaultParagraphFont"/>
     <w:link w:val="Heading7"/>
-    <w:uiPriority w:val="9"/>
-    <w:semiHidden/>
     <w:qFormat/>
-    <w:rsid w:val="00600602"/>
     <w:rPr>
-      <w:rFonts w:ascii="Cambria" w:hAnsi="Cambria" w:eastAsia="" w:cs="" w:asciiTheme="majorHAnsi" w:cstheme="majorBidi" w:eastAsiaTheme="majorEastAsia" w:hAnsiTheme="majorHAnsi"/>
+      <w:rFonts w:ascii="Cambria" w:hAnsi="Cambria" w:eastAsia="Times New Roman" w:cs="Times New Roman"/>
       <w:i/>
       <w:iCs/>
-      <w:color w:themeColor="text1" w:themeTint="bf" w:val="404040"/>
+      <w:color w:themeColor="dark1" w:themeTint="bf" w:val="404040"/>
       <w:sz w:val="22"/>
       <w:szCs w:val="22"/>
       <w:lang w:eastAsia="en-US"/>
     </w:rPr>
   </w:style>
-  <w:style w:type="character" w:styleId="Heading8Char" w:customStyle="1">
+  <w:style w:type="character" w:styleId="Heading8Char">
     <w:name w:val="Heading 8 Char"/>
     <w:basedOn w:val="DefaultParagraphFont"/>
     <w:link w:val="Heading8"/>
-    <w:uiPriority w:val="9"/>
-    <w:semiHidden/>
     <w:qFormat/>
-    <w:rsid w:val="00600602"/>
     <w:rPr>
-      <w:rFonts w:ascii="Cambria" w:hAnsi="Cambria" w:eastAsia="" w:cs="" w:asciiTheme="majorHAnsi" w:cstheme="majorBidi" w:eastAsiaTheme="majorEastAsia" w:hAnsiTheme="majorHAnsi"/>
-      <w:color w:themeColor="text1" w:themeTint="bf" w:val="404040"/>
+      <w:rFonts w:ascii="Cambria" w:hAnsi="Cambria" w:eastAsia="Times New Roman" w:cs="Times New Roman"/>
+      <w:color w:themeColor="dark1" w:themeTint="bf" w:val="404040"/>
       <w:sz w:val="22"/>
       <w:lang w:eastAsia="en-US"/>
     </w:rPr>
   </w:style>
-  <w:style w:type="character" w:styleId="Heading9Char" w:customStyle="1">
+  <w:style w:type="character" w:styleId="Heading9Char">
     <w:name w:val="Heading 9 Char"/>
     <w:basedOn w:val="DefaultParagraphFont"/>
     <w:link w:val="Heading9"/>
-    <w:uiPriority w:val="9"/>
-    <w:semiHidden/>
     <w:qFormat/>
-    <w:rsid w:val="00600602"/>
     <w:rPr>
-      <w:rFonts w:ascii="Cambria" w:hAnsi="Cambria" w:eastAsia="" w:cs="" w:asciiTheme="majorHAnsi" w:cstheme="majorBidi" w:eastAsiaTheme="majorEastAsia" w:hAnsiTheme="majorHAnsi"/>
+      <w:rFonts w:ascii="Cambria" w:hAnsi="Cambria" w:eastAsia="Times New Roman" w:cs="Times New Roman"/>
       <w:i/>
       <w:iCs/>
-      <w:color w:themeColor="text1" w:themeTint="bf" w:val="404040"/>
+      <w:color w:themeColor="dark1" w:themeTint="bf" w:val="404040"/>
       <w:sz w:val="22"/>
       <w:lang w:eastAsia="en-US"/>
     </w:rPr>
@@ -6434,35 +5710,29 @@
   <w:style w:type="character" w:styleId="Hyperlink">
     <w:name w:val="Hyperlink"/>
     <w:basedOn w:val="DefaultParagraphFont"/>
-    <w:uiPriority w:val="99"/>
-    <w:unhideWhenUsed/>
-    <w:rsid w:val="00600602"/>
     <w:rPr>
       <w:color w:themeColor="hyperlink" w:val="0000FF"/>
       <w:u w:val="single"/>
     </w:rPr>
   </w:style>
-  <w:style w:type="character" w:styleId="QuoteChar" w:customStyle="1">
+  <w:style w:type="character" w:styleId="QuoteChar">
     <w:name w:val="Quote Char"/>
     <w:basedOn w:val="DefaultParagraphFont"/>
     <w:link w:val="Quote"/>
-    <w:uiPriority w:val="29"/>
     <w:qFormat/>
-    <w:rsid w:val="00600602"/>
     <w:rPr>
-      <w:rFonts w:ascii="Tahoma" w:hAnsi="Tahoma" w:eastAsia="Calibri" w:cs="Calibri" w:cstheme="minorHAnsi" w:eastAsiaTheme="minorHAnsi"/>
+      <w:rFonts w:ascii="Tahoma" w:hAnsi="Tahoma" w:eastAsia="Calibri" w:cs="Calibri"/>
       <w:iCs/>
-      <w:color w:themeColor="text1" w:val="000000"/>
+      <w:color w:themeColor="dark1" w:val="000000"/>
       <w:szCs w:val="22"/>
       <w:lang w:eastAsia="en-US"/>
     </w:rPr>
   </w:style>
-  <w:style w:type="character" w:styleId="BalloonTextChar" w:customStyle="1">
+  <w:style w:type="character" w:styleId="BalloonTextChar">
     <w:name w:val="Balloon Text Char"/>
     <w:basedOn w:val="DefaultParagraphFont"/>
     <w:link w:val="BalloonText"/>
     <w:qFormat/>
-    <w:rsid w:val="00600602"/>
     <w:rPr>
       <w:rFonts w:ascii="Tahoma" w:hAnsi="Tahoma" w:cs="Tahoma"/>
       <w:sz w:val="16"/>
@@ -6532,11 +5802,10 @@
       <w:rFonts w:cs="FreeSans"/>
     </w:rPr>
   </w:style>
-  <w:style w:type="paragraph" w:styleId="Metropolialeipteksti" w:customStyle="1">
+  <w:style w:type="paragraph" w:styleId="Metropolialeipteksti">
     <w:name w:val="* Metropolia leipäteksti"/>
     <w:basedOn w:val="Normal"/>
     <w:qFormat/>
-    <w:rsid w:val="00763e2a"/>
     <w:pPr/>
     <w:rPr>
       <w:rFonts w:ascii="Arial" w:hAnsi="Arial" w:eastAsia="Times"/>
@@ -6556,8 +5825,6 @@
     <w:name w:val="header"/>
     <w:basedOn w:val="Normal"/>
     <w:link w:val="HeaderChar"/>
-    <w:uiPriority w:val="99"/>
-    <w:rsid w:val="00da42b6"/>
     <w:pPr>
       <w:tabs>
         <w:tab w:val="clear" w:pos="1304"/>
@@ -6571,8 +5838,6 @@
     <w:name w:val="footer"/>
     <w:basedOn w:val="Normal"/>
     <w:link w:val="FooterChar"/>
-    <w:uiPriority w:val="99"/>
-    <w:rsid w:val="00da42b6"/>
     <w:pPr>
       <w:tabs>
         <w:tab w:val="clear" w:pos="1304"/>
@@ -6586,9 +5851,6 @@
     <w:name w:val="toc 1"/>
     <w:basedOn w:val="leipteksti"/>
     <w:next w:val="leipteksti"/>
-    <w:uiPriority w:val="39"/>
-    <w:unhideWhenUsed/>
-    <w:rsid w:val="009b61fd"/>
     <w:pPr>
       <w:tabs>
         <w:tab w:val="clear" w:pos="1304"/>
@@ -6598,12 +5860,11 @@
     </w:pPr>
     <w:rPr/>
   </w:style>
-  <w:style w:type="paragraph" w:styleId="Kuvio" w:customStyle="1">
+  <w:style w:type="paragraph" w:styleId="Kuvio">
     <w:name w:val="Kuvio"/>
     <w:basedOn w:val="leipteksti"/>
     <w:next w:val="leipteksti"/>
     <w:qFormat/>
-    <w:rsid w:val="00600602"/>
     <w:pPr>
       <w:numPr>
         <w:ilvl w:val="0"/>
@@ -6620,12 +5881,11 @@
       <w:sz w:val="20"/>
     </w:rPr>
   </w:style>
-  <w:style w:type="paragraph" w:styleId="Taulukonselite" w:customStyle="1">
+  <w:style w:type="paragraph" w:styleId="Taulukonselite">
     <w:name w:val="Taulukon selite"/>
     <w:basedOn w:val="leipteksti"/>
     <w:next w:val="leipteksti"/>
     <w:qFormat/>
-    <w:rsid w:val="00600602"/>
     <w:pPr>
       <w:numPr>
         <w:ilvl w:val="0"/>
@@ -6641,9 +5901,6 @@
     <w:name w:val="toc 2"/>
     <w:basedOn w:val="leipteksti"/>
     <w:next w:val="leipteksti"/>
-    <w:uiPriority w:val="39"/>
-    <w:unhideWhenUsed/>
-    <w:rsid w:val="005e14bb"/>
     <w:pPr>
       <w:tabs>
         <w:tab w:val="clear" w:pos="1304"/>
@@ -6655,12 +5912,11 @@
     </w:pPr>
     <w:rPr/>
   </w:style>
-  <w:style w:type="paragraph" w:styleId="Lhde" w:customStyle="1">
+  <w:style w:type="paragraph" w:styleId="Lhde">
     <w:name w:val="Lähde"/>
     <w:basedOn w:val="leipteksti"/>
     <w:next w:val="leipteksti"/>
     <w:qFormat/>
-    <w:rsid w:val="00600602"/>
     <w:pPr>
       <w:spacing w:lineRule="auto" w:line="240"/>
       <w:jc w:val="start"/>
@@ -6671,9 +5927,6 @@
     <w:name w:val="toc 3"/>
     <w:basedOn w:val="Normal"/>
     <w:next w:val="Normal"/>
-    <w:uiPriority w:val="39"/>
-    <w:unhideWhenUsed/>
-    <w:rsid w:val="005e14bb"/>
     <w:pPr>
       <w:tabs>
         <w:tab w:val="clear" w:pos="1304"/>
@@ -6684,17 +5937,16 @@
       <w:ind w:start="964"/>
     </w:pPr>
     <w:rPr>
-      <w:rFonts w:eastAsia="Calibri" w:cs="Calibri" w:cstheme="minorHAnsi" w:eastAsiaTheme="minorHAnsi"/>
+      <w:rFonts w:eastAsia="Calibri" w:cs="Calibri"/>
       <w:szCs w:val="22"/>
       <w:lang w:eastAsia="en-US"/>
     </w:rPr>
   </w:style>
-  <w:style w:type="paragraph" w:styleId="Talukkoteksti" w:customStyle="1">
+  <w:style w:type="paragraph" w:styleId="Talukkoteksti">
     <w:name w:val="Talukkoteksti"/>
     <w:basedOn w:val="leipteksti"/>
     <w:next w:val="leipteksti"/>
     <w:qFormat/>
-    <w:rsid w:val="00600602"/>
     <w:pPr>
       <w:spacing w:lineRule="auto" w:line="240"/>
     </w:pPr>
@@ -6702,16 +5954,15 @@
       <w:sz w:val="20"/>
     </w:rPr>
   </w:style>
-  <w:style w:type="paragraph" w:styleId="leipteksti" w:customStyle="1">
+  <w:style w:type="paragraph" w:styleId="leipteksti">
     <w:name w:val="leipäteksti"/>
     <w:basedOn w:val="Normal"/>
     <w:qFormat/>
-    <w:rsid w:val="00bb3d39"/>
     <w:pPr>
       <w:spacing w:before="0" w:after="240"/>
     </w:pPr>
     <w:rPr>
-      <w:rFonts w:eastAsia="Calibri" w:cs="Calibri" w:cstheme="minorHAnsi" w:eastAsiaTheme="minorHAnsi"/>
+      <w:rFonts w:eastAsia="Calibri" w:cs="Calibri"/>
       <w:szCs w:val="22"/>
       <w:lang w:eastAsia="en-US"/>
     </w:rPr>
@@ -6721,25 +5972,22 @@
     <w:basedOn w:val="leipteksti"/>
     <w:next w:val="leipteksti"/>
     <w:link w:val="QuoteChar"/>
-    <w:uiPriority w:val="29"/>
     <w:qFormat/>
-    <w:rsid w:val="00600602"/>
     <w:pPr>
       <w:spacing w:lineRule="auto" w:line="240"/>
       <w:ind w:start="1304"/>
     </w:pPr>
     <w:rPr>
       <w:iCs/>
-      <w:color w:themeColor="text1" w:val="000000"/>
+      <w:color w:themeColor="dark1" w:val="000000"/>
       <w:sz w:val="20"/>
     </w:rPr>
   </w:style>
-  <w:style w:type="paragraph" w:styleId="Numeroidutlhteet" w:customStyle="1">
+  <w:style w:type="paragraph" w:styleId="Numeroidutlhteet">
     <w:name w:val="Numeroidut lähteet"/>
     <w:basedOn w:val="Lhde"/>
     <w:next w:val="leipteksti"/>
     <w:qFormat/>
-    <w:rsid w:val="00600602"/>
     <w:pPr>
       <w:numPr>
         <w:ilvl w:val="0"/>
@@ -6754,7 +6002,6 @@
     <w:basedOn w:val="Normal"/>
     <w:link w:val="BalloonTextChar"/>
     <w:qFormat/>
-    <w:rsid w:val="00600602"/>
     <w:pPr/>
     <w:rPr>
       <w:rFonts w:cs="Tahoma"/>
@@ -6762,21 +6009,19 @@
       <w:szCs w:val="16"/>
     </w:rPr>
   </w:style>
-  <w:style w:type="paragraph" w:styleId="nimi" w:customStyle="1">
+  <w:style w:type="paragraph" w:styleId="nimi">
     <w:name w:val="nimiö"/>
     <w:basedOn w:val="Normal"/>
     <w:qFormat/>
-    <w:rsid w:val="002c2e64"/>
     <w:pPr>
       <w:spacing w:lineRule="auto" w:line="240"/>
     </w:pPr>
     <w:rPr/>
   </w:style>
-  <w:style w:type="paragraph" w:styleId="tiivistelm" w:customStyle="1">
+  <w:style w:type="paragraph" w:styleId="tiivistelm">
     <w:name w:val="tiivistelmä"/>
     <w:basedOn w:val="Normal"/>
     <w:qFormat/>
-    <w:rsid w:val="002c2e64"/>
     <w:pPr>
       <w:spacing w:lineRule="auto" w:line="240"/>
     </w:pPr>
@@ -6784,19 +6029,18 @@
       <w:lang w:eastAsia="en-US"/>
     </w:rPr>
   </w:style>
-  <w:style w:type="paragraph" w:styleId="Esimerkki" w:customStyle="1">
+  <w:style w:type="paragraph" w:styleId="Esimerkki">
     <w:name w:val="Esimerkki"/>
     <w:basedOn w:val="leipteksti"/>
     <w:qFormat/>
-    <w:rsid w:val="008d13a3"/>
     <w:pPr>
       <w:spacing w:lineRule="auto" w:line="240"/>
       <w:ind w:start="1304"/>
     </w:pPr>
     <w:rPr/>
   </w:style>
-  <w:style w:type="paragraph" w:styleId="FrameContentsuser">
-    <w:name w:val="Frame Contents (user)"/>
+  <w:style w:type="paragraph" w:styleId="FrameContents">
+    <w:name w:val="Frame Contents"/>
     <w:basedOn w:val="Normal"/>
     <w:qFormat/>
     <w:pPr/>
@@ -6838,70 +6082,26 @@
     <w:pPr/>
     <w:rPr/>
   </w:style>
-  <w:style w:type="paragraph" w:styleId="FrameContents">
-    <w:name w:val="Frame Contents"/>
+  <w:style w:type="paragraph" w:styleId="FrameContentsuser">
+    <w:name w:val="Frame Contents (user)"/>
     <w:basedOn w:val="Normal"/>
     <w:qFormat/>
     <w:pPr/>
     <w:rPr/>
   </w:style>
-  <w:style w:type="numbering" w:styleId="NoList" w:default="1">
+  <w:style w:type="paragraph" w:styleId="TableContents">
+    <w:name w:val="Table Contents"/>
+    <w:basedOn w:val="Normal"/>
+    <w:qFormat/>
+    <w:pPr>
+      <w:widowControl w:val="false"/>
+      <w:suppressLineNumbers/>
+    </w:pPr>
+    <w:rPr/>
+  </w:style>
+  <w:style w:type="numbering" w:styleId="NoList">
     <w:name w:val="No List"/>
-    <w:uiPriority w:val="99"/>
-    <w:semiHidden/>
-    <w:unhideWhenUsed/>
     <w:qFormat/>
-  </w:style>
-  <w:style w:type="table" w:default="1" w:styleId="TableNormal">
-    <w:name w:val="Normal Table"/>
-    <w:uiPriority w:val="99"/>
-    <w:semiHidden/>
-    <w:unhideWhenUsed/>
-    <w:tblPr>
-      <w:tblCellMar>
-        <w:top w:w="0" w:type="dxa"/>
-        <w:left w:w="108" w:type="dxa"/>
-        <w:bottom w:w="0" w:type="dxa"/>
-        <w:right w:w="108" w:type="dxa"/>
-      </w:tblCellMar>
-    </w:tblPr>
-  </w:style>
-  <w:style w:type="table" w:customStyle="1" w:styleId="TableGrid1">
-    <w:name w:val="Table Grid1"/>
-    <w:basedOn w:val="TableNormal"/>
-    <w:uiPriority w:val="59"/>
-    <w:rsid w:val="00600602"/>
-    <w:rPr>
-      <w:rFonts w:eastAsiaTheme="minorHAnsi" w:cstheme="minorHAnsi"/>
-      <w:sz w:val="24"/>
-      <w:szCs w:val="22"/>
-      <w:lang w:eastAsia="en-US"/>
-    </w:rPr>
-    <w:tblPr>
-      <w:tblBorders>
-        <w:top w:val="single" w:color="auto" w:sz="4" w:space="0"/>
-        <w:left w:val="single" w:color="auto" w:sz="4" w:space="0"/>
-        <w:bottom w:val="single" w:color="auto" w:sz="4" w:space="0"/>
-        <w:right w:val="single" w:color="auto" w:sz="4" w:space="0"/>
-        <w:insideH w:val="single" w:color="auto" w:sz="4" w:space="0"/>
-        <w:insideV w:val="single" w:color="auto" w:sz="4" w:space="0"/>
-      </w:tblBorders>
-    </w:tblPr>
-  </w:style>
-  <w:style w:type="table" w:styleId="TableGrid">
-    <w:name w:val="Table Grid"/>
-    <w:basedOn w:val="TableNormal"/>
-    <w:rsid w:val="00600602"/>
-    <w:tblPr>
-      <w:tblBorders>
-        <w:top w:val="single" w:color="auto" w:sz="4" w:space="0"/>
-        <w:left w:val="single" w:color="auto" w:sz="4" w:space="0"/>
-        <w:bottom w:val="single" w:color="auto" w:sz="4" w:space="0"/>
-        <w:right w:val="single" w:color="auto" w:sz="4" w:space="0"/>
-        <w:insideH w:val="single" w:color="auto" w:sz="4" w:space="0"/>
-        <w:insideV w:val="single" w:color="auto" w:sz="4" w:space="0"/>
-      </w:tblBorders>
-    </w:tblPr>
   </w:style>
 </w:styles>
 </file>
@@ -6949,14 +6149,14 @@
     </a:clrScheme>
     <a:fontScheme name="Office">
       <a:majorFont>
-        <a:latin typeface="Cambria" pitchFamily="0" charset="1"/>
-        <a:ea typeface=""/>
-        <a:cs typeface=""/>
+        <a:latin typeface="Arial" pitchFamily="0" charset="1"/>
+        <a:ea typeface="DejaVu Sans" pitchFamily="0" charset="1"/>
+        <a:cs typeface="DejaVu Sans" pitchFamily="0" charset="1"/>
       </a:majorFont>
       <a:minorFont>
-        <a:latin typeface="Calibri" pitchFamily="0" charset="1"/>
-        <a:ea typeface=""/>
-        <a:cs typeface=""/>
+        <a:latin typeface="Arial" pitchFamily="0" charset="1"/>
+        <a:ea typeface="DejaVu Sans" pitchFamily="0" charset="1"/>
+        <a:cs typeface="DejaVu Sans" pitchFamily="0" charset="1"/>
       </a:minorFont>
     </a:fontScheme>
     <a:fmtScheme>
@@ -6964,58 +6164,25 @@
         <a:solidFill>
           <a:schemeClr val="phClr"/>
         </a:solidFill>
-        <a:gradFill>
-          <a:gsLst>
-            <a:gs pos="0">
-              <a:schemeClr val="phClr">
-                <a:tint val="50000"/>
-              </a:schemeClr>
-            </a:gs>
-            <a:gs pos="35000">
-              <a:schemeClr val="phClr">
-                <a:tint val="37000"/>
-              </a:schemeClr>
-            </a:gs>
-            <a:gs pos="100000">
-              <a:schemeClr val="phClr">
-                <a:tint val="15000"/>
-              </a:schemeClr>
-            </a:gs>
-          </a:gsLst>
-          <a:lin ang="16200000" scaled="1"/>
-          <a:tileRect l="0" t="0" r="0" b="0"/>
-        </a:gradFill>
-        <a:gradFill>
-          <a:gsLst>
-            <a:gs pos="0">
-              <a:schemeClr val="phClr">
-                <a:shade val="51000"/>
-              </a:schemeClr>
-            </a:gs>
-            <a:gs pos="80000">
-              <a:schemeClr val="phClr">
-                <a:shade val="93000"/>
-              </a:schemeClr>
-            </a:gs>
-            <a:gs pos="100000">
-              <a:schemeClr val="phClr">
-                <a:shade val="94000"/>
-              </a:schemeClr>
-            </a:gs>
-          </a:gsLst>
-          <a:lin ang="16200000" scaled="0"/>
-          <a:tileRect l="0" t="0" r="0" b="0"/>
-        </a:gradFill>
+        <a:solidFill>
+          <a:schemeClr val="phClr"/>
+        </a:solidFill>
+        <a:solidFill>
+          <a:schemeClr val="phClr"/>
+        </a:solidFill>
       </a:fillStyleLst>
       <a:lnStyleLst>
-        <a:ln w="9525" cap="flat" cmpd="sng" algn="ctr">
+        <a:ln w="6350" cap="flat" cmpd="sng" algn="ctr">
           <a:prstDash val="solid"/>
+          <a:miter/>
         </a:ln>
-        <a:ln w="25400" cap="flat" cmpd="sng" algn="ctr">
+        <a:ln w="6350" cap="flat" cmpd="sng" algn="ctr">
           <a:prstDash val="solid"/>
+          <a:miter/>
         </a:ln>
-        <a:ln w="38100" cap="flat" cmpd="sng" algn="ctr">
+        <a:ln w="6350" cap="flat" cmpd="sng" algn="ctr">
           <a:prstDash val="solid"/>
+          <a:miter/>
         </a:ln>
       </a:lnStyleLst>
       <a:effectStyleLst>
@@ -7033,330 +6200,14 @@
         <a:solidFill>
           <a:schemeClr val="phClr"/>
         </a:solidFill>
-        <a:gradFill>
-          <a:gsLst>
-            <a:gs pos="0">
-              <a:schemeClr val="phClr">
-                <a:tint val="40000"/>
-              </a:schemeClr>
-            </a:gs>
-            <a:gs pos="40000">
-              <a:schemeClr val="phClr">
-                <a:tint val="45000"/>
-                <a:shade val="99000"/>
-              </a:schemeClr>
-            </a:gs>
-            <a:gs pos="100000">
-              <a:schemeClr val="phClr">
-                <a:shade val="20000"/>
-              </a:schemeClr>
-            </a:gs>
-          </a:gsLst>
-          <a:path path="circle">
-            <a:fillToRect l="50000" t="-80000" r="50000" b="180000"/>
-          </a:path>
-          <a:tileRect l="0" t="0" r="0" b="0"/>
-        </a:gradFill>
-        <a:gradFill>
-          <a:gsLst>
-            <a:gs pos="0">
-              <a:schemeClr val="phClr">
-                <a:tint val="80000"/>
-              </a:schemeClr>
-            </a:gs>
-            <a:gs pos="100000">
-              <a:schemeClr val="phClr">
-                <a:shade val="30000"/>
-              </a:schemeClr>
-            </a:gs>
-          </a:gsLst>
-          <a:path path="circle">
-            <a:fillToRect l="50000" t="50000" r="50000" b="50000"/>
-          </a:path>
-          <a:tileRect l="0" t="0" r="0" b="0"/>
-        </a:gradFill>
+        <a:solidFill>
+          <a:schemeClr val="phClr"/>
+        </a:solidFill>
+        <a:solidFill>
+          <a:schemeClr val="phClr"/>
+        </a:solidFill>
       </a:bgFillStyleLst>
     </a:fmtScheme>
   </a:themeElements>
 </a:theme>
-</file>
-
-<file path=customXml/item1.xml><?xml version="1.0" encoding="utf-8"?>
-<b:Sources xmlns:b="http://schemas.openxmlformats.org/officeDocument/2006/bibliography" xmlns="http://schemas.openxmlformats.org/officeDocument/2006/bibliography" SelectedStyle="\APA.XSL" StyleName="APA"/>
-</file>
-
-<file path=customXml/item2.xml><?xml version="1.0" encoding="utf-8"?>
-<ct:contentTypeSchema xmlns:ct="http://schemas.microsoft.com/office/2006/metadata/contentType" xmlns:ma="http://schemas.microsoft.com/office/2006/metadata/properties/metaAttributes" ct:_="" ma:_="" ma:contentTypeName="Document" ma:contentTypeID="0x010100A80894A88A878F4981939C07FFE45295" ma:contentTypeVersion="12" ma:contentTypeDescription="Create a new document." ma:contentTypeScope="" ma:versionID="48c532917b92c18088482c531d3007d5">
-  <xsd:schema xmlns:xsd="http://www.w3.org/2001/XMLSchema" xmlns:xs="http://www.w3.org/2001/XMLSchema" xmlns:p="http://schemas.microsoft.com/office/2006/metadata/properties" xmlns:ns3="fa1bec00-f89d-4504-bceb-2f42f114a5f7" xmlns:ns4="74eec4c8-d0f8-40b1-98c1-f5d0a3e9a93e" targetNamespace="http://schemas.microsoft.com/office/2006/metadata/properties" ma:root="true" ma:fieldsID="0d9527ad5d06bd4e3388d122f3bf0f36" ns3:_="" ns4:_="">
-    <xsd:import namespace="fa1bec00-f89d-4504-bceb-2f42f114a5f7"/>
-    <xsd:import namespace="74eec4c8-d0f8-40b1-98c1-f5d0a3e9a93e"/>
-    <xsd:element name="properties">
-      <xsd:complexType>
-        <xsd:sequence>
-          <xsd:element name="documentManagement">
-            <xsd:complexType>
-              <xsd:all>
-                <xsd:element ref="ns3:SharedWithUsers" minOccurs="0"/>
-                <xsd:element ref="ns3:SharedWithDetails" minOccurs="0"/>
-                <xsd:element ref="ns3:SharingHintHash" minOccurs="0"/>
-                <xsd:element ref="ns4:MediaServiceMetadata" minOccurs="0"/>
-                <xsd:element ref="ns4:MediaServiceFastMetadata" minOccurs="0"/>
-                <xsd:element ref="ns4:MediaServiceDateTaken" minOccurs="0"/>
-                <xsd:element ref="ns4:MediaServiceAutoTags" minOccurs="0"/>
-                <xsd:element ref="ns4:MediaServiceOCR" minOccurs="0"/>
-                <xsd:element ref="ns4:MediaServiceGenerationTime" minOccurs="0"/>
-                <xsd:element ref="ns4:MediaServiceEventHashCode" minOccurs="0"/>
-                <xsd:element ref="ns4:MediaServiceAutoKeyPoints" minOccurs="0"/>
-                <xsd:element ref="ns4:MediaServiceKeyPoints" minOccurs="0"/>
-              </xsd:all>
-            </xsd:complexType>
-          </xsd:element>
-        </xsd:sequence>
-      </xsd:complexType>
-    </xsd:element>
-  </xsd:schema>
-  <xsd:schema xmlns:xsd="http://www.w3.org/2001/XMLSchema" xmlns:xs="http://www.w3.org/2001/XMLSchema" xmlns:dms="http://schemas.microsoft.com/office/2006/documentManagement/types" xmlns:pc="http://schemas.microsoft.com/office/infopath/2007/PartnerControls" targetNamespace="fa1bec00-f89d-4504-bceb-2f42f114a5f7" elementFormDefault="qualified">
-    <xsd:import namespace="http://schemas.microsoft.com/office/2006/documentManagement/types"/>
-    <xsd:import namespace="http://schemas.microsoft.com/office/infopath/2007/PartnerControls"/>
-    <xsd:element name="SharedWithUsers" ma:index="8" nillable="true" ma:displayName="Shared With" ma:description="" ma:internalName="SharedWithUsers" ma:readOnly="true">
-      <xsd:complexType>
-        <xsd:complexContent>
-          <xsd:extension base="dms:UserMulti">
-            <xsd:sequence>
-              <xsd:element name="UserInfo" minOccurs="0" maxOccurs="unbounded">
-                <xsd:complexType>
-                  <xsd:sequence>
-                    <xsd:element name="DisplayName" type="xsd:string" minOccurs="0"/>
-                    <xsd:element name="AccountId" type="dms:UserId" minOccurs="0" nillable="true"/>
-                    <xsd:element name="AccountType" type="xsd:string" minOccurs="0"/>
-                  </xsd:sequence>
-                </xsd:complexType>
-              </xsd:element>
-            </xsd:sequence>
-          </xsd:extension>
-        </xsd:complexContent>
-      </xsd:complexType>
-    </xsd:element>
-    <xsd:element name="SharedWithDetails" ma:index="9" nillable="true" ma:displayName="Shared With Details" ma:description="" ma:internalName="SharedWithDetails" ma:readOnly="true">
-      <xsd:simpleType>
-        <xsd:restriction base="dms:Note">
-          <xsd:maxLength value="255"/>
-        </xsd:restriction>
-      </xsd:simpleType>
-    </xsd:element>
-    <xsd:element name="SharingHintHash" ma:index="10" nillable="true" ma:displayName="Sharing Hint Hash" ma:description="" ma:hidden="true" ma:internalName="SharingHintHash" ma:readOnly="true">
-      <xsd:simpleType>
-        <xsd:restriction base="dms:Text"/>
-      </xsd:simpleType>
-    </xsd:element>
-  </xsd:schema>
-  <xsd:schema xmlns:xsd="http://www.w3.org/2001/XMLSchema" xmlns:xs="http://www.w3.org/2001/XMLSchema" xmlns:dms="http://schemas.microsoft.com/office/2006/documentManagement/types" xmlns:pc="http://schemas.microsoft.com/office/infopath/2007/PartnerControls" targetNamespace="74eec4c8-d0f8-40b1-98c1-f5d0a3e9a93e" elementFormDefault="qualified">
-    <xsd:import namespace="http://schemas.microsoft.com/office/2006/documentManagement/types"/>
-    <xsd:import namespace="http://schemas.microsoft.com/office/infopath/2007/PartnerControls"/>
-    <xsd:element name="MediaServiceMetadata" ma:index="11" nillable="true" ma:displayName="MediaServiceMetadata" ma:description="" ma:hidden="true" ma:internalName="MediaServiceMetadata" ma:readOnly="true">
-      <xsd:simpleType>
-        <xsd:restriction base="dms:Note"/>
-      </xsd:simpleType>
-    </xsd:element>
-    <xsd:element name="MediaServiceFastMetadata" ma:index="12" nillable="true" ma:displayName="MediaServiceFastMetadata" ma:description="" ma:hidden="true" ma:internalName="MediaServiceFastMetadata" ma:readOnly="true">
-      <xsd:simpleType>
-        <xsd:restriction base="dms:Note"/>
-      </xsd:simpleType>
-    </xsd:element>
-    <xsd:element name="MediaServiceDateTaken" ma:index="13" nillable="true" ma:displayName="MediaServiceDateTaken" ma:hidden="true" ma:internalName="MediaServiceDateTaken" ma:readOnly="true">
-      <xsd:simpleType>
-        <xsd:restriction base="dms:Text"/>
-      </xsd:simpleType>
-    </xsd:element>
-    <xsd:element name="MediaServiceAutoTags" ma:index="14" nillable="true" ma:displayName="Tags" ma:internalName="MediaServiceAutoTags" ma:readOnly="true">
-      <xsd:simpleType>
-        <xsd:restriction base="dms:Text"/>
-      </xsd:simpleType>
-    </xsd:element>
-    <xsd:element name="MediaServiceOCR" ma:index="15" nillable="true" ma:displayName="Extracted Text" ma:internalName="MediaServiceOCR" ma:readOnly="true">
-      <xsd:simpleType>
-        <xsd:restriction base="dms:Note">
-          <xsd:maxLength value="255"/>
-        </xsd:restriction>
-      </xsd:simpleType>
-    </xsd:element>
-    <xsd:element name="MediaServiceGenerationTime" ma:index="16" nillable="true" ma:displayName="MediaServiceGenerationTime" ma:hidden="true" ma:internalName="MediaServiceGenerationTime" ma:readOnly="true">
-      <xsd:simpleType>
-        <xsd:restriction base="dms:Text"/>
-      </xsd:simpleType>
-    </xsd:element>
-    <xsd:element name="MediaServiceEventHashCode" ma:index="17" nillable="true" ma:displayName="MediaServiceEventHashCode" ma:hidden="true" ma:internalName="MediaServiceEventHashCode" ma:readOnly="true">
-      <xsd:simpleType>
-        <xsd:restriction base="dms:Text"/>
-      </xsd:simpleType>
-    </xsd:element>
-    <xsd:element name="MediaServiceAutoKeyPoints" ma:index="18" nillable="true" ma:displayName="MediaServiceAutoKeyPoints" ma:hidden="true" ma:internalName="MediaServiceAutoKeyPoints" ma:readOnly="true">
-      <xsd:simpleType>
-        <xsd:restriction base="dms:Note"/>
-      </xsd:simpleType>
-    </xsd:element>
-    <xsd:element name="MediaServiceKeyPoints" ma:index="19" nillable="true" ma:displayName="KeyPoints" ma:internalName="MediaServiceKeyPoints" ma:readOnly="true">
-      <xsd:simpleType>
-        <xsd:restriction base="dms:Note">
-          <xsd:maxLength value="255"/>
-        </xsd:restriction>
-      </xsd:simpleType>
-    </xsd:element>
-  </xsd:schema>
-  <xsd:schema xmlns="http://schemas.openxmlformats.org/package/2006/metadata/core-properties" xmlns:xsd="http://www.w3.org/2001/XMLSchema" xmlns:xsi="http://www.w3.org/2001/XMLSchema-instance" xmlns:dc="http://purl.org/dc/elements/1.1/" xmlns:dcterms="http://purl.org/dc/terms/" xmlns:odoc="http://schemas.microsoft.com/internal/obd" targetNamespace="http://schemas.openxmlformats.org/package/2006/metadata/core-properties" elementFormDefault="qualified" attributeFormDefault="unqualified" blockDefault="#all">
-    <xsd:import namespace="http://purl.org/dc/elements/1.1/" schemaLocation="http://dublincore.org/schemas/xmls/qdc/2003/04/02/dc.xsd"/>
-    <xsd:import namespace="http://purl.org/dc/terms/" schemaLocation="http://dublincore.org/schemas/xmls/qdc/2003/04/02/dcterms.xsd"/>
-    <xsd:element name="coreProperties" type="CT_coreProperties"/>
-    <xsd:complexType name="CT_coreProperties">
-      <xsd:all>
-        <xsd:element ref="dc:creator" minOccurs="0" maxOccurs="1"/>
-        <xsd:element ref="dcterms:created" minOccurs="0" maxOccurs="1"/>
-        <xsd:element ref="dc:identifier" minOccurs="0" maxOccurs="1"/>
-        <xsd:element name="contentType" minOccurs="0" maxOccurs="1" type="xsd:string" ma:index="0" ma:displayName="Content Type"/>
-        <xsd:element ref="dc:title" minOccurs="0" maxOccurs="1" ma:index="4" ma:displayName="Title"/>
-        <xsd:element ref="dc:subject" minOccurs="0" maxOccurs="1"/>
-        <xsd:element ref="dc:description" minOccurs="0" maxOccurs="1"/>
-        <xsd:element name="keywords" minOccurs="0" maxOccurs="1" type="xsd:string"/>
-        <xsd:element ref="dc:language" minOccurs="0" maxOccurs="1"/>
-        <xsd:element name="category" minOccurs="0" maxOccurs="1" type="xsd:string"/>
-        <xsd:element name="version" minOccurs="0" maxOccurs="1" type="xsd:string"/>
-        <xsd:element name="revision" minOccurs="0" maxOccurs="1" type="xsd:string">
-          <xsd:annotation>
-            <xsd:documentation>
-                        This value indicates the number of saves or revisions. The application is responsible for updating this value after each revision.
-                    </xsd:documentation>
-          </xsd:annotation>
-        </xsd:element>
-        <xsd:element name="lastModifiedBy" minOccurs="0" maxOccurs="1" type="xsd:string"/>
-        <xsd:element ref="dcterms:modified" minOccurs="0" maxOccurs="1"/>
-        <xsd:element name="contentStatus" minOccurs="0" maxOccurs="1" type="xsd:string"/>
-      </xsd:all>
-    </xsd:complexType>
-  </xsd:schema>
-  <xs:schema xmlns:pc="http://schemas.microsoft.com/office/infopath/2007/PartnerControls" xmlns:xs="http://www.w3.org/2001/XMLSchema" targetNamespace="http://schemas.microsoft.com/office/infopath/2007/PartnerControls" elementFormDefault="qualified" attributeFormDefault="unqualified">
-    <xs:element name="Person">
-      <xs:complexType>
-        <xs:sequence>
-          <xs:element ref="pc:DisplayName" minOccurs="0"/>
-          <xs:element ref="pc:AccountId" minOccurs="0"/>
-          <xs:element ref="pc:AccountType" minOccurs="0"/>
-        </xs:sequence>
-      </xs:complexType>
-    </xs:element>
-    <xs:element name="DisplayName" type="xs:string"/>
-    <xs:element name="AccountId" type="xs:string"/>
-    <xs:element name="AccountType" type="xs:string"/>
-    <xs:element name="BDCAssociatedEntity">
-      <xs:complexType>
-        <xs:sequence>
-          <xs:element ref="pc:BDCEntity" minOccurs="0" maxOccurs="unbounded"/>
-        </xs:sequence>
-        <xs:attribute ref="pc:EntityNamespace"/>
-        <xs:attribute ref="pc:EntityName"/>
-        <xs:attribute ref="pc:SystemInstanceName"/>
-        <xs:attribute ref="pc:AssociationName"/>
-      </xs:complexType>
-    </xs:element>
-    <xs:attribute name="EntityNamespace" type="xs:string"/>
-    <xs:attribute name="EntityName" type="xs:string"/>
-    <xs:attribute name="SystemInstanceName" type="xs:string"/>
-    <xs:attribute name="AssociationName" type="xs:string"/>
-    <xs:element name="BDCEntity">
-      <xs:complexType>
-        <xs:sequence>
-          <xs:element ref="pc:EntityDisplayName" minOccurs="0"/>
-          <xs:element ref="pc:EntityInstanceReference" minOccurs="0"/>
-          <xs:element ref="pc:EntityId1" minOccurs="0"/>
-          <xs:element ref="pc:EntityId2" minOccurs="0"/>
-          <xs:element ref="pc:EntityId3" minOccurs="0"/>
-          <xs:element ref="pc:EntityId4" minOccurs="0"/>
-          <xs:element ref="pc:EntityId5" minOccurs="0"/>
-        </xs:sequence>
-      </xs:complexType>
-    </xs:element>
-    <xs:element name="EntityDisplayName" type="xs:string"/>
-    <xs:element name="EntityInstanceReference" type="xs:string"/>
-    <xs:element name="EntityId1" type="xs:string"/>
-    <xs:element name="EntityId2" type="xs:string"/>
-    <xs:element name="EntityId3" type="xs:string"/>
-    <xs:element name="EntityId4" type="xs:string"/>
-    <xs:element name="EntityId5" type="xs:string"/>
-    <xs:element name="Terms">
-      <xs:complexType>
-        <xs:sequence>
-          <xs:element ref="pc:TermInfo" minOccurs="0" maxOccurs="unbounded"/>
-        </xs:sequence>
-      </xs:complexType>
-    </xs:element>
-    <xs:element name="TermInfo">
-      <xs:complexType>
-        <xs:sequence>
-          <xs:element ref="pc:TermName" minOccurs="0"/>
-          <xs:element ref="pc:TermId" minOccurs="0"/>
-        </xs:sequence>
-      </xs:complexType>
-    </xs:element>
-    <xs:element name="TermName" type="xs:string"/>
-    <xs:element name="TermId" type="xs:string"/>
-  </xs:schema>
-</ct:contentTypeSchema>
-</file>
-
-<file path=customXml/item3.xml><?xml version="1.0" encoding="utf-8"?>
-<p:properties xmlns:p="http://schemas.microsoft.com/office/2006/metadata/properties" xmlns:xsi="http://www.w3.org/2001/XMLSchema-instance" xmlns:pc="http://schemas.microsoft.com/office/infopath/2007/PartnerControls">
-  <documentManagement/>
-</p:properties>
-</file>
-
-<file path=customXml/item4.xml><?xml version="1.0" encoding="utf-8"?>
-<?mso-contentType ?>
-<FormTemplates xmlns="http://schemas.microsoft.com/sharepoint/v3/contenttype/forms">
-  <Display>DocumentLibraryForm</Display>
-  <Edit>DocumentLibraryForm</Edit>
-  <New>DocumentLibraryForm</New>
-</FormTemplates>
-</file>
-
-<file path=customXml/itemProps1.xml><?xml version="1.0" encoding="utf-8"?>
-<ds:datastoreItem xmlns:ds="http://schemas.openxmlformats.org/officeDocument/2006/customXml" ds:itemID="{EC9BD9B4-7294-413D-9407-45D0B2534144}">
-  <ds:schemaRefs>
-    <ds:schemaRef ds:uri="http://schemas.openxmlformats.org/officeDocument/2006/bibliography"/>
-  </ds:schemaRefs>
-</ds:datastoreItem>
-</file>
-
-<file path=customXml/itemProps2.xml><?xml version="1.0" encoding="utf-8"?>
-<ds:datastoreItem xmlns:ds="http://schemas.openxmlformats.org/officeDocument/2006/customXml" ds:itemID="{242220BA-1E29-4BCD-990B-71B93CE9A40A}">
-  <ds:schemaRefs>
-    <ds:schemaRef ds:uri="http://schemas.microsoft.com/office/2006/metadata/contentType"/>
-    <ds:schemaRef ds:uri="http://schemas.microsoft.com/office/2006/metadata/properties/metaAttributes"/>
-    <ds:schemaRef ds:uri="http://www.w3.org/2001/XMLSchema"/>
-    <ds:schemaRef ds:uri="http://schemas.microsoft.com/office/2006/metadata/properties"/>
-    <ds:schemaRef ds:uri="fa1bec00-f89d-4504-bceb-2f42f114a5f7"/>
-    <ds:schemaRef ds:uri="74eec4c8-d0f8-40b1-98c1-f5d0a3e9a93e"/>
-    <ds:schemaRef ds:uri="http://schemas.microsoft.com/office/2006/documentManagement/types"/>
-    <ds:schemaRef ds:uri="http://schemas.microsoft.com/office/infopath/2007/PartnerControls"/>
-    <ds:schemaRef ds:uri="http://schemas.openxmlformats.org/package/2006/metadata/core-properties"/>
-    <ds:schemaRef ds:uri="http://purl.org/dc/elements/1.1/"/>
-    <ds:schemaRef ds:uri="http://purl.org/dc/terms/"/>
-    <ds:schemaRef ds:uri="http://schemas.microsoft.com/internal/obd"/>
-  </ds:schemaRefs>
-</ds:datastoreItem>
-</file>
-
-<file path=customXml/itemProps3.xml><?xml version="1.0" encoding="utf-8"?>
-<ds:datastoreItem xmlns:ds="http://schemas.openxmlformats.org/officeDocument/2006/customXml" ds:itemID="{3CAB31C5-EF57-4985-AA3F-887C58555143}">
-  <ds:schemaRefs>
-    <ds:schemaRef ds:uri="http://schemas.microsoft.com/office/2006/metadata/properties"/>
-    <ds:schemaRef ds:uri="http://schemas.microsoft.com/office/infopath/2007/PartnerControls"/>
-  </ds:schemaRefs>
-</ds:datastoreItem>
-</file>
-
-<file path=customXml/itemProps4.xml><?xml version="1.0" encoding="utf-8"?>
-<ds:datastoreItem xmlns:ds="http://schemas.openxmlformats.org/officeDocument/2006/customXml" ds:itemID="{0078C75C-BE02-4893-92E2-31794A21A9C9}">
-  <ds:schemaRefs>
-    <ds:schemaRef ds:uri="http://schemas.microsoft.com/sharepoint/v3/contenttype/forms"/>
-  </ds:schemaRefs>
-</ds:datastoreItem>
 </file>
</xml_diff>